<commit_message>
feat(resume): update resume content across multiple languages
- Enhanced the `resume-v4-full-stack.mdx` files in English, Chinese, and Hong Kong versions to improve clarity and detail in descriptions, emphasizing collaboration with stakeholders and technical achievements.
- Updated the structure of the content to reflect recent experiences, including the transition to a headless CMS and the development of typed Node.js APIs.
- Improved formatting and consistency across all language versions to enhance readability and presentation.
</commit_message>
<xml_diff>
--- a/apps/web/src/features/resume/wilsonchow_resume_v4_full-stack.docx
+++ b/apps/web/src/features/resume/wilsonchow_resume_v4_full-stack.docx
@@ -187,7 +187,7 @@
           <w:color w:val="4A4A4A"/>
           <w:sz w:val="20"/>
         </w:rPr>
-        <w:t xml:space="preserve">Primary engineer for concurrent client products — design through cloud deployment.</w:t>
+        <w:t xml:space="preserve">Primary engineer for concurrent client products — scoping UX with technical and non-technical stakeholders, then shipping from design through cloud deployment.</w:t>
       </w:r>
     </w:p>
     <w:p>
@@ -291,7 +291,7 @@
           <w:color w:val="1A1A1A"/>
           <w:sz w:val="21"/>
         </w:rPr>
-        <w:t xml:space="preserve">. Node.js APIs on ECS Fargate; other workloads on Lambda / API Gateway.</w:t>
+        <w:t xml:space="preserve">.</w:t>
       </w:r>
     </w:p>
     <w:p>
@@ -307,7 +307,25 @@
           <w:color w:val="1A1A1A"/>
           <w:sz w:val="21"/>
         </w:rPr>
-        <w:t xml:space="preserve">Shipped production AI agents (workflows, memory, tool calls, observability, evals) with Mastra, Vercel AI SDK, and Langchain.</w:t>
+        <w:t xml:space="preserve">Built typed Node.js APIs on Lambda / API Gateway and </w:t>
+      </w:r>
+      <w:r>
+        <w:rPr>
+          <w:rFonts w:ascii="Calibri" w:hAnsi="Calibri" w:eastAsia="Calibri"/>
+          <w:b/>
+          <w:color w:val="1A1A1A"/>
+          <w:sz w:val="21"/>
+        </w:rPr>
+        <w:t xml:space="preserve">ECS Fargate</w:t>
+      </w:r>
+      <w:r>
+        <w:rPr>
+          <w:rFonts w:ascii="Calibri" w:hAnsi="Calibri" w:eastAsia="Calibri"/>
+          <w:b w:val="0"/>
+          <w:color w:val="1A1A1A"/>
+          <w:sz w:val="21"/>
+        </w:rPr>
+        <w:t xml:space="preserve"> (Hono, OpenAPI, tRPC): org-scoped Postgres with Drizzle / Prisma, Better Auth, OAuth 2.0 / OIDC, and RBAC in the data model.</w:t>
       </w:r>
     </w:p>
     <w:p>
@@ -324,70 +342,6 @@
           <w:sz w:val="21"/>
         </w:rPr>
         <w:t xml:space="preserve">Established shared Radix / Tailwind component and hook libraries with Storybook, Fumadocs, and MDX docs, reused across client apps. Vitest / Cypress on critical flows.</w:t>
-      </w:r>
-    </w:p>
-    <w:p>
-      <w:pPr>
-        <w:pStyle w:val="ListBullet"/>
-        <w:spacing w:after="30" w:before="0"/>
-        <w:ind w:left="288"/>
-      </w:pPr>
-      <w:r>
-        <w:rPr>
-          <w:rFonts w:ascii="Calibri" w:hAnsi="Calibri" w:eastAsia="Calibri"/>
-          <w:b w:val="0"/>
-          <w:color w:val="1A1A1A"/>
-          <w:sz w:val="21"/>
-        </w:rPr>
-        <w:t xml:space="preserve">Built auth on a typed API: Better Auth sessions and org membership, OAuth 2.0 / OIDC, JWT / session lifecycle, and RBAC. Sessions live in HttpOnly / Secure / SameSite cookies, not localStorage tokens.</w:t>
-      </w:r>
-    </w:p>
-    <w:p>
-      <w:pPr>
-        <w:pStyle w:val="ListBullet"/>
-        <w:spacing w:after="30" w:before="0"/>
-        <w:ind w:left="288"/>
-      </w:pPr>
-      <w:r>
-        <w:rPr>
-          <w:rFonts w:ascii="Calibri" w:hAnsi="Calibri" w:eastAsia="Calibri"/>
-          <w:b w:val="0"/>
-          <w:color w:val="1A1A1A"/>
-          <w:sz w:val="21"/>
-        </w:rPr>
-        <w:t xml:space="preserve">Modeled Postgres data with Drizzle / Prisma — SQL schemas, migrations, org-scoped tables, and RBAC — so access is enforced in the data model, not only in route handlers. DynamoDB / S3 where it fit.</w:t>
-      </w:r>
-    </w:p>
-    <w:p>
-      <w:pPr>
-        <w:pStyle w:val="ListBullet"/>
-        <w:spacing w:after="30" w:before="0"/>
-        <w:ind w:left="288"/>
-      </w:pPr>
-      <w:r>
-        <w:rPr>
-          <w:rFonts w:ascii="Calibri" w:hAnsi="Calibri" w:eastAsia="Calibri"/>
-          <w:b w:val="0"/>
-          <w:color w:val="1A1A1A"/>
-          <w:sz w:val="21"/>
-        </w:rPr>
-        <w:t xml:space="preserve">Built typed Node.js APIs with Hono, OpenAPI, and tRPC on AWS Lambda / API Gateway, with Scalar docs.</w:t>
-      </w:r>
-    </w:p>
-    <w:p>
-      <w:pPr>
-        <w:pStyle w:val="ListBullet"/>
-        <w:spacing w:after="30" w:before="0"/>
-        <w:ind w:left="288"/>
-      </w:pPr>
-      <w:r>
-        <w:rPr>
-          <w:rFonts w:ascii="Calibri" w:hAnsi="Calibri" w:eastAsia="Calibri"/>
-          <w:b w:val="0"/>
-          <w:color w:val="1A1A1A"/>
-          <w:sz w:val="21"/>
-        </w:rPr>
-        <w:t xml:space="preserve">Auth at the edge: strict CORS, trusted origins, WAF rate limits on auth routes, identity from the authorizer cookie — never a client-supplied user header. API keys, tokens, and credentials in SST Secret, not .env.</w:t>
       </w:r>
     </w:p>
     <w:p>
@@ -949,7 +903,7 @@
           <w:color w:val="1A1A1A"/>
           <w:sz w:val="21"/>
         </w:rPr>
-        <w:t xml:space="preserve">Hono, Drizzle, Prisma, OpenAPI, tRPC, GraphQL, Postgres, DynamoDB, Better Auth, Multitenancy, durable workflows</w:t>
+        <w:t xml:space="preserve">Hono, Drizzle, Prisma, OpenAPI, tRPC, GraphQL, Postgres, DynamoDB, Better Auth</w:t>
       </w:r>
     </w:p>
     <w:p>

</xml_diff>

<commit_message>
chore(dependencies): update Next.js and related packages to version 16.3.1
- Upgraded Next.js to version 16.3.1 across multiple package files, ensuring compatibility and access to the latest features and improvements.
- Updated dependencies in bun.lock, package.json, and other relevant files to reflect the new version, enhancing overall project stability and performance.
- Adjusted typography styles in the custom components to improve visual consistency and responsiveness.
- Added a new English resume block to enhance content availability for users.
</commit_message>
<xml_diff>
--- a/apps/web/src/features/resume/wilsonchow_resume_v4_full-stack.docx
+++ b/apps/web/src/features/resume/wilsonchow_resume_v4_full-stack.docx
@@ -4,1146 +4,2040 @@
   <w:body>
     <w:p>
       <w:pPr>
+        <w:widowControl/>
         <w:spacing w:after="40"/>
         <w:jc w:val="center"/>
       </w:pPr>
       <w:r>
         <w:rPr>
-          <w:rFonts w:ascii="Calibri" w:hAnsi="Calibri" w:eastAsia="Calibri"/>
+          <w:rFonts w:ascii="Calibri" w:hAnsi="Calibri"/>
           <w:b/>
           <w:color w:val="1A1A1A"/>
           <w:sz w:val="44"/>
         </w:rPr>
-        <w:t xml:space="preserve">Wilson, Chow Sin Long</w:t>
+        <w:t>Wilson, Chow Sin Long</w:t>
       </w:r>
     </w:p>
     <w:p>
       <w:pPr>
+        <w:widowControl/>
         <w:spacing w:after="40"/>
         <w:jc w:val="center"/>
       </w:pPr>
       <w:r>
         <w:rPr>
-          <w:rFonts w:ascii="Calibri" w:hAnsi="Calibri" w:eastAsia="Calibri"/>
+          <w:rFonts w:ascii="Calibri" w:hAnsi="Calibri"/>
           <w:b w:val="0"/>
           <w:color w:val="4A4A4A"/>
-          <w:sz w:val="19"/>
+          <w:sz w:val="18"/>
         </w:rPr>
-        <w:t xml:space="preserve">sinlongchow@gmail.com  ·  slchow.com  ·  linkedin.com/in/wilsonslchow  ·  github.com/ocwilsonchow</w:t>
+        <w:t>sinlongchow@gmail.com  ·  slchow.com  ·  linkedin.com/in/wilsonslchow  ·  github.com/ocwilsonchow</w:t>
       </w:r>
     </w:p>
     <w:p>
       <w:pPr>
+        <w:widowControl/>
         <w:spacing w:after="40"/>
         <w:jc w:val="center"/>
       </w:pPr>
       <w:r>
         <w:rPr>
-          <w:rFonts w:ascii="Calibri" w:hAnsi="Calibri" w:eastAsia="Calibri"/>
+          <w:rFonts w:ascii="Calibri" w:hAnsi="Calibri"/>
           <w:b/>
           <w:color w:val="2C2C2C"/>
-          <w:sz w:val="20"/>
+          <w:sz w:val="19"/>
         </w:rPr>
-        <w:t xml:space="preserve">Full-Stack Software Engineer  ·  AWS Solutions Architect Associate</w:t>
+        <w:t>Full-Stack Software Engineer  ·  AWS Certified Solutions Architect – Associate</w:t>
       </w:r>
     </w:p>
     <w:p>
       <w:pPr>
-        <w:spacing w:before="200" w:after="80"/>
-        <w:pBdr>
-          <w:bottom w:val="single" w:sz="12" w:space="1" w:color="2C2C2C"/>
-        </w:pBdr>
+        <w:keepNext/>
+        <w:widowControl/>
+        <w:spacing w:before="140" w:after="60"/>
       </w:pPr>
       <w:r>
         <w:rPr>
-          <w:rFonts w:ascii="Calibri" w:hAnsi="Calibri" w:eastAsia="Calibri"/>
+          <w:rFonts w:ascii="Calibri" w:hAnsi="Calibri"/>
           <w:b/>
           <w:color w:val="2C2C2C"/>
-          <w:sz w:val="22"/>
+          <w:sz w:val="21"/>
         </w:rPr>
-        <w:t xml:space="preserve">SUMMARY</w:t>
+        <w:t>SUMMARY</w:t>
       </w:r>
     </w:p>
     <w:p>
       <w:pPr>
-        <w:spacing w:after="60" w:before="0"/>
+        <w:widowControl/>
+        <w:spacing w:after="40" w:line="240" w:lineRule="auto"/>
       </w:pPr>
       <w:r>
         <w:rPr>
-          <w:rFonts w:ascii="Calibri" w:hAnsi="Calibri" w:eastAsia="Calibri"/>
+          <w:rFonts w:ascii="Calibri" w:hAnsi="Calibri"/>
           <w:b w:val="0"/>
           <w:color w:val="1A1A1A"/>
-          <w:sz w:val="21"/>
+          <w:sz w:val="19"/>
         </w:rPr>
-        <w:t xml:space="preserve">Full-stack software engineer with 5 years delivering production apps in a multi-client environment — Figma through React / React Native, Node.js, typed APIs, and AWS. Built </w:t>
+        <w:t xml:space="preserve">Full-stack </w:t>
       </w:r>
       <w:r>
         <w:rPr>
-          <w:rFonts w:ascii="Calibri" w:hAnsi="Calibri" w:eastAsia="Calibri"/>
+          <w:rFonts w:ascii="Calibri" w:hAnsi="Calibri"/>
           <w:b/>
           <w:color w:val="1A1A1A"/>
-          <w:sz w:val="21"/>
+          <w:sz w:val="19"/>
         </w:rPr>
-        <w:t xml:space="preserve">15+</w:t>
+        <w:t>software engineer</w:t>
       </w:r>
       <w:r>
         <w:rPr>
-          <w:rFonts w:ascii="Calibri" w:hAnsi="Calibri" w:eastAsia="Calibri"/>
+          <w:rFonts w:ascii="Calibri" w:hAnsi="Calibri"/>
           <w:b w:val="0"/>
           <w:color w:val="1A1A1A"/>
-          <w:sz w:val="21"/>
+          <w:sz w:val="19"/>
         </w:rPr>
-        <w:t xml:space="preserve"> apps from scratch and over multiple years, including App Store / Play Store releases. Cut load times by up to </w:t>
+        <w:t xml:space="preserve"> with </w:t>
       </w:r>
       <w:r>
         <w:rPr>
-          <w:rFonts w:ascii="Calibri" w:hAnsi="Calibri" w:eastAsia="Calibri"/>
+          <w:rFonts w:ascii="Calibri" w:hAnsi="Calibri"/>
           <w:b/>
           <w:color w:val="1A1A1A"/>
-          <w:sz w:val="21"/>
+          <w:sz w:val="19"/>
         </w:rPr>
-        <w:t xml:space="preserve">80%</w:t>
+        <w:t>5 years of experience</w:t>
       </w:r>
       <w:r>
         <w:rPr>
-          <w:rFonts w:ascii="Calibri" w:hAnsi="Calibri" w:eastAsia="Calibri"/>
+          <w:rFonts w:ascii="Calibri" w:hAnsi="Calibri"/>
           <w:b w:val="0"/>
           <w:color w:val="1A1A1A"/>
-          <w:sz w:val="21"/>
+          <w:sz w:val="19"/>
+        </w:rPr>
+        <w:t xml:space="preserve"> delivering </w:t>
+      </w:r>
+      <w:r>
+        <w:rPr>
+          <w:rFonts w:ascii="Calibri" w:hAnsi="Calibri"/>
+          <w:b/>
+          <w:color w:val="1A1A1A"/>
+          <w:sz w:val="19"/>
+        </w:rPr>
+        <w:t>15+</w:t>
+      </w:r>
+      <w:r>
+        <w:rPr>
+          <w:rFonts w:ascii="Calibri" w:hAnsi="Calibri"/>
+          <w:b w:val="0"/>
+          <w:color w:val="1A1A1A"/>
+          <w:sz w:val="19"/>
+        </w:rPr>
+        <w:t xml:space="preserve"> React and React Native products from Figma through Node.js APIs and AWS, including Apple App Store and Google Play releases. Cut load times by </w:t>
+      </w:r>
+      <w:r>
+        <w:rPr>
+          <w:rFonts w:ascii="Calibri" w:hAnsi="Calibri"/>
+          <w:b/>
+          <w:color w:val="1A1A1A"/>
+          <w:sz w:val="19"/>
+        </w:rPr>
+        <w:t>80%</w:t>
+      </w:r>
+      <w:r>
+        <w:rPr>
+          <w:rFonts w:ascii="Calibri" w:hAnsi="Calibri"/>
+          <w:b w:val="0"/>
+          <w:color w:val="1A1A1A"/>
+          <w:sz w:val="19"/>
         </w:rPr>
         <w:t xml:space="preserve"> and search latency by </w:t>
       </w:r>
       <w:r>
         <w:rPr>
-          <w:rFonts w:ascii="Calibri" w:hAnsi="Calibri" w:eastAsia="Calibri"/>
+          <w:rFonts w:ascii="Calibri" w:hAnsi="Calibri"/>
+          <w:b/>
+          <w:color w:val="1A1A1A"/>
+          <w:sz w:val="19"/>
+        </w:rPr>
+        <w:t>90%</w:t>
+      </w:r>
+      <w:r>
+        <w:rPr>
+          <w:rFonts w:ascii="Calibri" w:hAnsi="Calibri"/>
+          <w:b w:val="0"/>
+          <w:color w:val="1A1A1A"/>
+          <w:sz w:val="19"/>
+        </w:rPr>
+        <w:t xml:space="preserve">. Now leading a multi-channel </w:t>
+      </w:r>
+      <w:r>
+        <w:rPr>
+          <w:rFonts w:ascii="Calibri" w:hAnsi="Calibri"/>
+          <w:b/>
+          <w:color w:val="1A1A1A"/>
+          <w:sz w:val="19"/>
+        </w:rPr>
+        <w:t>Generative AI</w:t>
+      </w:r>
+      <w:r>
+        <w:rPr>
+          <w:rFonts w:ascii="Calibri" w:hAnsi="Calibri"/>
+          <w:b w:val="0"/>
+          <w:color w:val="1A1A1A"/>
+          <w:sz w:val="19"/>
+        </w:rPr>
+        <w:t xml:space="preserve"> platform with durable workflows, memory, RAG, and evals. </w:t>
+      </w:r>
+      <w:r>
+        <w:rPr>
+          <w:rFonts w:ascii="Calibri" w:hAnsi="Calibri"/>
+          <w:b/>
+          <w:color w:val="1A1A1A"/>
+          <w:sz w:val="19"/>
+        </w:rPr>
+        <w:t>AWS Certified Solutions Architect – Associate</w:t>
+      </w:r>
+      <w:r>
+        <w:rPr>
+          <w:rFonts w:ascii="Calibri" w:hAnsi="Calibri"/>
+          <w:b w:val="0"/>
+          <w:color w:val="1A1A1A"/>
+          <w:sz w:val="19"/>
+        </w:rPr>
+        <w:t>.</w:t>
+      </w:r>
+    </w:p>
+    <w:p>
+      <w:pPr>
+        <w:keepNext/>
+        <w:widowControl/>
+        <w:spacing w:before="140" w:after="60"/>
+      </w:pPr>
+      <w:r>
+        <w:rPr>
+          <w:rFonts w:ascii="Calibri" w:hAnsi="Calibri"/>
+          <w:b/>
+          <w:color w:val="2C2C2C"/>
+          <w:sz w:val="21"/>
+        </w:rPr>
+        <w:t>EXPERIENCE</w:t>
+      </w:r>
+    </w:p>
+    <w:p>
+      <w:pPr>
+        <w:keepNext/>
+        <w:widowControl/>
+        <w:tabs>
+          <w:tab w:pos="10224" w:val="right"/>
+        </w:tabs>
+        <w:spacing w:before="100" w:after="20"/>
+      </w:pPr>
+      <w:r>
+        <w:rPr>
+          <w:rFonts w:ascii="Calibri" w:hAnsi="Calibri"/>
           <w:b/>
           <w:color w:val="1A1A1A"/>
           <w:sz w:val="21"/>
         </w:rPr>
-        <w:t xml:space="preserve">90%</w:t>
+        <w:t>Software Developer, Vioo Company Limited</w:t>
       </w:r>
       <w:r>
         <w:rPr>
-          <w:rFonts w:ascii="Calibri" w:hAnsi="Calibri" w:eastAsia="Calibri"/>
+          <w:rFonts w:ascii="Calibri" w:hAnsi="Calibri"/>
           <w:b w:val="0"/>
-          <w:color w:val="1A1A1A"/>
-          <w:sz w:val="21"/>
+          <w:color w:val="4A4A4A"/>
+          <w:sz w:val="19"/>
         </w:rPr>
-        <w:t xml:space="preserve">. Currently leading a multi-channel Generative AI agent platform with durable workflows, memory, RAG, and evals. AWS Solutions Architect Associate.</w:t>
+        <w:tab/>
+        <w:t>May 2022 – Present</w:t>
       </w:r>
     </w:p>
     <w:p>
       <w:pPr>
-        <w:spacing w:before="200" w:after="80"/>
-        <w:pBdr>
-          <w:bottom w:val="single" w:sz="12" w:space="1" w:color="2C2C2C"/>
-        </w:pBdr>
+        <w:widowControl/>
+        <w:spacing w:after="40" w:line="240" w:lineRule="auto"/>
       </w:pPr>
       <w:r>
         <w:rPr>
-          <w:rFonts w:ascii="Calibri" w:hAnsi="Calibri" w:eastAsia="Calibri"/>
-          <w:b/>
-          <w:color w:val="2C2C2C"/>
-          <w:sz w:val="22"/>
-        </w:rPr>
-        <w:t xml:space="preserve">EXPERIENCE</w:t>
-      </w:r>
-    </w:p>
-    <w:p>
-      <w:pPr>
-        <w:tabs>
-          <w:tab w:pos="10224" w:val="right"/>
-        </w:tabs>
-        <w:spacing w:before="160" w:after="20"/>
-      </w:pPr>
-      <w:r>
-        <w:rPr>
-          <w:rFonts w:ascii="Calibri" w:hAnsi="Calibri" w:eastAsia="Calibri"/>
-          <w:b/>
-          <w:color w:val="1A1A1A"/>
-          <w:sz w:val="22"/>
-        </w:rPr>
-        <w:t xml:space="preserve">Software Developer, Vioo Company Limited</w:t>
-      </w:r>
-      <w:r>
-        <w:rPr>
-          <w:rFonts w:ascii="Calibri" w:hAnsi="Calibri" w:eastAsia="Calibri"/>
+          <w:rFonts w:ascii="Calibri" w:hAnsi="Calibri"/>
           <w:b w:val="0"/>
           <w:color w:val="4A4A4A"/>
-          <w:sz w:val="20"/>
+          <w:sz w:val="18"/>
         </w:rPr>
-        <w:tab/>
-        <w:t xml:space="preserve">May 2022 – Present</w:t>
-      </w:r>
-    </w:p>
-    <w:p>
-      <w:pPr>
-        <w:spacing w:after="60" w:before="0"/>
-      </w:pPr>
-      <w:r>
-        <w:rPr>
-          <w:rFonts w:ascii="Calibri" w:hAnsi="Calibri" w:eastAsia="Calibri"/>
-          <w:b w:val="0"/>
-          <w:color w:val="4A4A4A"/>
-          <w:sz w:val="20"/>
-        </w:rPr>
-        <w:t xml:space="preserve">Primary engineer for concurrent client products — scoping UX with technical and non-technical stakeholders, then shipping from design through cloud deployment.</w:t>
+        <w:t>Primary engineer for concurrent client products, owning delivery from UX scoping through cloud deployment.</w:t>
       </w:r>
     </w:p>
     <w:p>
       <w:pPr>
         <w:pStyle w:val="ListBullet"/>
-        <w:spacing w:after="30" w:before="0"/>
+        <w:widowControl/>
+        <w:spacing w:before="0" w:after="10" w:line="240" w:lineRule="auto"/>
         <w:ind w:left="288"/>
       </w:pPr>
       <w:r>
         <w:rPr>
-          <w:rFonts w:ascii="Calibri" w:hAnsi="Calibri" w:eastAsia="Calibri"/>
+          <w:rFonts w:ascii="Calibri" w:hAnsi="Calibri"/>
           <w:b w:val="0"/>
           <w:color w:val="1A1A1A"/>
-          <w:sz w:val="21"/>
+          <w:sz w:val="19"/>
         </w:rPr>
         <w:t xml:space="preserve">Shipped and maintained </w:t>
       </w:r>
       <w:r>
         <w:rPr>
-          <w:rFonts w:ascii="Calibri" w:hAnsi="Calibri" w:eastAsia="Calibri"/>
+          <w:rFonts w:ascii="Calibri" w:hAnsi="Calibri"/>
           <w:b/>
           <w:color w:val="1A1A1A"/>
-          <w:sz w:val="21"/>
+          <w:sz w:val="19"/>
         </w:rPr>
-        <w:t xml:space="preserve">15+</w:t>
+        <w:t>15+</w:t>
       </w:r>
       <w:r>
         <w:rPr>
-          <w:rFonts w:ascii="Calibri" w:hAnsi="Calibri" w:eastAsia="Calibri"/>
+          <w:rFonts w:ascii="Calibri" w:hAnsi="Calibri"/>
           <w:b w:val="0"/>
           <w:color w:val="1A1A1A"/>
-          <w:sz w:val="21"/>
+          <w:sz w:val="19"/>
         </w:rPr>
-        <w:t xml:space="preserve"> production React / React Native apps from scratch and over multiple years, including high-fidelity Figma design, shared design systems, and App Store / Play Store releases.</w:t>
+        <w:t xml:space="preserve"> React / React Native apps with high-fidelity Figma design, shared design systems, and Apple App Store / Google Play releases.</w:t>
       </w:r>
     </w:p>
     <w:p>
       <w:pPr>
         <w:pStyle w:val="ListBullet"/>
-        <w:spacing w:after="30" w:before="0"/>
+        <w:widowControl/>
+        <w:spacing w:before="0" w:after="10" w:line="240" w:lineRule="auto"/>
         <w:ind w:left="288"/>
       </w:pPr>
       <w:r>
         <w:rPr>
-          <w:rFonts w:ascii="Calibri" w:hAnsi="Calibri" w:eastAsia="Calibri"/>
+          <w:rFonts w:ascii="Calibri" w:hAnsi="Calibri"/>
           <w:b w:val="0"/>
           <w:color w:val="1A1A1A"/>
-          <w:sz w:val="21"/>
+          <w:sz w:val="19"/>
         </w:rPr>
-        <w:t xml:space="preserve">Replaced a WordPress stack with an in-house headless CMS (Strapi / Sanity) and search (Meilisearch / Algolia) in a Turborepo, deployed with SST, so publishing continued through the transition: cut load time by </w:t>
+        <w:t xml:space="preserve">Migrated WordPress sites to Strapi / Sanity and Meilisearch / Algolia in a </w:t>
       </w:r>
       <w:r>
         <w:rPr>
-          <w:rFonts w:ascii="Calibri" w:hAnsi="Calibri" w:eastAsia="Calibri"/>
+          <w:rFonts w:ascii="Calibri" w:hAnsi="Calibri"/>
           <w:b/>
           <w:color w:val="1A1A1A"/>
-          <w:sz w:val="21"/>
+          <w:sz w:val="19"/>
         </w:rPr>
-        <w:t xml:space="preserve">80%</w:t>
+        <w:t>Turborepo</w:t>
       </w:r>
       <w:r>
         <w:rPr>
-          <w:rFonts w:ascii="Calibri" w:hAnsi="Calibri" w:eastAsia="Calibri"/>
+          <w:rFonts w:ascii="Calibri" w:hAnsi="Calibri"/>
           <w:b w:val="0"/>
           <w:color w:val="1A1A1A"/>
-          <w:sz w:val="21"/>
+          <w:sz w:val="19"/>
+        </w:rPr>
+        <w:t xml:space="preserve"> on </w:t>
+      </w:r>
+      <w:r>
+        <w:rPr>
+          <w:rFonts w:ascii="Calibri" w:hAnsi="Calibri"/>
+          <w:b/>
+          <w:color w:val="1A1A1A"/>
+          <w:sz w:val="19"/>
+        </w:rPr>
+        <w:t>SST</w:t>
+      </w:r>
+      <w:r>
+        <w:rPr>
+          <w:rFonts w:ascii="Calibri" w:hAnsi="Calibri"/>
+          <w:b w:val="0"/>
+          <w:color w:val="1A1A1A"/>
+          <w:sz w:val="19"/>
+        </w:rPr>
+        <w:t xml:space="preserve"> without interrupting publishing; cut load times by </w:t>
+      </w:r>
+      <w:r>
+        <w:rPr>
+          <w:rFonts w:ascii="Calibri" w:hAnsi="Calibri"/>
+          <w:b/>
+          <w:color w:val="1A1A1A"/>
+          <w:sz w:val="19"/>
+        </w:rPr>
+        <w:t>80%</w:t>
+      </w:r>
+      <w:r>
+        <w:rPr>
+          <w:rFonts w:ascii="Calibri" w:hAnsi="Calibri"/>
+          <w:b w:val="0"/>
+          <w:color w:val="1A1A1A"/>
+          <w:sz w:val="19"/>
         </w:rPr>
         <w:t xml:space="preserve">, search latency by </w:t>
       </w:r>
       <w:r>
         <w:rPr>
-          <w:rFonts w:ascii="Calibri" w:hAnsi="Calibri" w:eastAsia="Calibri"/>
+          <w:rFonts w:ascii="Calibri" w:hAnsi="Calibri"/>
           <w:b/>
           <w:color w:val="1A1A1A"/>
-          <w:sz w:val="21"/>
+          <w:sz w:val="19"/>
         </w:rPr>
-        <w:t xml:space="preserve">90%</w:t>
+        <w:t>90%</w:t>
       </w:r>
       <w:r>
         <w:rPr>
-          <w:rFonts w:ascii="Calibri" w:hAnsi="Calibri" w:eastAsia="Calibri"/>
+          <w:rFonts w:ascii="Calibri" w:hAnsi="Calibri"/>
           <w:b w:val="0"/>
           <w:color w:val="1A1A1A"/>
-          <w:sz w:val="21"/>
+          <w:sz w:val="19"/>
         </w:rPr>
-        <w:t xml:space="preserve">, and hit PageSpeed Insights </w:t>
+        <w:t xml:space="preserve">, and achieved PageSpeed scores above </w:t>
       </w:r>
       <w:r>
         <w:rPr>
-          <w:rFonts w:ascii="Calibri" w:hAnsi="Calibri" w:eastAsia="Calibri"/>
+          <w:rFonts w:ascii="Calibri" w:hAnsi="Calibri"/>
           <w:b/>
           <w:color w:val="1A1A1A"/>
-          <w:sz w:val="21"/>
+          <w:sz w:val="19"/>
         </w:rPr>
-        <w:t xml:space="preserve">&gt;90</w:t>
+        <w:t>95</w:t>
       </w:r>
       <w:r>
         <w:rPr>
-          <w:rFonts w:ascii="Calibri" w:hAnsi="Calibri" w:eastAsia="Calibri"/>
+          <w:rFonts w:ascii="Calibri" w:hAnsi="Calibri"/>
           <w:b w:val="0"/>
           <w:color w:val="1A1A1A"/>
-          <w:sz w:val="21"/>
+          <w:sz w:val="19"/>
         </w:rPr>
-        <w:t xml:space="preserve">.</w:t>
+        <w:t>.</w:t>
       </w:r>
     </w:p>
     <w:p>
       <w:pPr>
         <w:pStyle w:val="ListBullet"/>
-        <w:spacing w:after="30" w:before="0"/>
+        <w:widowControl/>
+        <w:spacing w:before="0" w:after="10" w:line="240" w:lineRule="auto"/>
         <w:ind w:left="288"/>
       </w:pPr>
       <w:r>
         <w:rPr>
-          <w:rFonts w:ascii="Calibri" w:hAnsi="Calibri" w:eastAsia="Calibri"/>
+          <w:rFonts w:ascii="Calibri" w:hAnsi="Calibri"/>
           <w:b w:val="0"/>
           <w:color w:val="1A1A1A"/>
-          <w:sz w:val="21"/>
+          <w:sz w:val="19"/>
         </w:rPr>
-        <w:t xml:space="preserve">Built typed Node.js APIs on Lambda / API Gateway and </w:t>
+        <w:t xml:space="preserve">Built typed Node.js APIs with Hono, OpenAPI, and tRPC on Lambda / API Gateway and </w:t>
       </w:r>
       <w:r>
         <w:rPr>
-          <w:rFonts w:ascii="Calibri" w:hAnsi="Calibri" w:eastAsia="Calibri"/>
+          <w:rFonts w:ascii="Calibri" w:hAnsi="Calibri"/>
           <w:b/>
           <w:color w:val="1A1A1A"/>
-          <w:sz w:val="21"/>
+          <w:sz w:val="19"/>
         </w:rPr>
-        <w:t xml:space="preserve">ECS Fargate</w:t>
+        <w:t>ECS Fargate</w:t>
       </w:r>
       <w:r>
         <w:rPr>
-          <w:rFonts w:ascii="Calibri" w:hAnsi="Calibri" w:eastAsia="Calibri"/>
+          <w:rFonts w:ascii="Calibri" w:hAnsi="Calibri"/>
           <w:b w:val="0"/>
           <w:color w:val="1A1A1A"/>
-          <w:sz w:val="21"/>
+          <w:sz w:val="19"/>
         </w:rPr>
-        <w:t xml:space="preserve"> (Hono, OpenAPI, tRPC): org-scoped Postgres with Drizzle / Prisma, Better Auth, OAuth 2.0 / OIDC, and RBAC in the data model.</w:t>
+        <w:t>; modeled org-scoped Postgres with Drizzle / Prisma, Better Auth, OAuth 2.0 / OIDC, and RBAC.</w:t>
       </w:r>
     </w:p>
     <w:p>
       <w:pPr>
         <w:pStyle w:val="ListBullet"/>
-        <w:spacing w:after="30" w:before="0"/>
+        <w:widowControl/>
+        <w:spacing w:before="0" w:after="10" w:line="240" w:lineRule="auto"/>
         <w:ind w:left="288"/>
       </w:pPr>
       <w:r>
         <w:rPr>
-          <w:rFonts w:ascii="Calibri" w:hAnsi="Calibri" w:eastAsia="Calibri"/>
+          <w:rFonts w:ascii="Calibri" w:hAnsi="Calibri"/>
           <w:b w:val="0"/>
           <w:color w:val="1A1A1A"/>
-          <w:sz w:val="21"/>
+          <w:sz w:val="19"/>
         </w:rPr>
-        <w:t xml:space="preserve">Established shared Radix / Tailwind component and hook libraries with Storybook, Fumadocs, and MDX docs, reused across client apps. Vitest / Cypress on critical flows.</w:t>
+        <w:t xml:space="preserve">Owned shared </w:t>
+      </w:r>
+      <w:r>
+        <w:rPr>
+          <w:rFonts w:ascii="Calibri" w:hAnsi="Calibri"/>
+          <w:b/>
+          <w:color w:val="1A1A1A"/>
+          <w:sz w:val="19"/>
+        </w:rPr>
+        <w:t>Radix</w:t>
+      </w:r>
+      <w:r>
+        <w:rPr>
+          <w:rFonts w:ascii="Calibri" w:hAnsi="Calibri"/>
+          <w:b w:val="0"/>
+          <w:color w:val="1A1A1A"/>
+          <w:sz w:val="19"/>
+        </w:rPr>
+        <w:t xml:space="preserve"> / </w:t>
+      </w:r>
+      <w:r>
+        <w:rPr>
+          <w:rFonts w:ascii="Calibri" w:hAnsi="Calibri"/>
+          <w:b/>
+          <w:color w:val="1A1A1A"/>
+          <w:sz w:val="19"/>
+        </w:rPr>
+        <w:t>Tailwind</w:t>
+      </w:r>
+      <w:r>
+        <w:rPr>
+          <w:rFonts w:ascii="Calibri" w:hAnsi="Calibri"/>
+          <w:b w:val="0"/>
+          <w:color w:val="1A1A1A"/>
+          <w:sz w:val="19"/>
+        </w:rPr>
+        <w:t xml:space="preserve"> / </w:t>
+      </w:r>
+      <w:r>
+        <w:rPr>
+          <w:rFonts w:ascii="Calibri" w:hAnsi="Calibri"/>
+          <w:b/>
+          <w:color w:val="1A1A1A"/>
+          <w:sz w:val="19"/>
+        </w:rPr>
+        <w:t>shadcn/ui</w:t>
+      </w:r>
+      <w:r>
+        <w:rPr>
+          <w:rFonts w:ascii="Calibri" w:hAnsi="Calibri"/>
+          <w:b w:val="0"/>
+          <w:color w:val="1A1A1A"/>
+          <w:sz w:val="19"/>
+        </w:rPr>
+        <w:t xml:space="preserve"> component and hook APIs; </w:t>
+      </w:r>
+      <w:r>
+        <w:rPr>
+          <w:rFonts w:ascii="Calibri" w:hAnsi="Calibri"/>
+          <w:b/>
+          <w:color w:val="1A1A1A"/>
+          <w:sz w:val="19"/>
+        </w:rPr>
+        <w:t>Storybook</w:t>
+      </w:r>
+      <w:r>
+        <w:rPr>
+          <w:rFonts w:ascii="Calibri" w:hAnsi="Calibri"/>
+          <w:b w:val="0"/>
+          <w:color w:val="1A1A1A"/>
+          <w:sz w:val="19"/>
+        </w:rPr>
+        <w:t>, Fumadocs, and MDX guidance eliminated duplicate UI across client apps.</w:t>
       </w:r>
     </w:p>
     <w:p>
       <w:pPr>
         <w:pStyle w:val="ListBullet"/>
-        <w:spacing w:after="30" w:before="0"/>
+        <w:widowControl/>
+        <w:spacing w:before="0" w:after="10" w:line="240" w:lineRule="auto"/>
         <w:ind w:left="288"/>
       </w:pPr>
       <w:r>
         <w:rPr>
-          <w:rFonts w:ascii="Calibri" w:hAnsi="Calibri" w:eastAsia="Calibri"/>
+          <w:rFonts w:ascii="Calibri" w:hAnsi="Calibri"/>
           <w:b w:val="0"/>
           <w:color w:val="1A1A1A"/>
-          <w:sz w:val="21"/>
+          <w:sz w:val="19"/>
         </w:rPr>
-        <w:t xml:space="preserve">GitHub Actions + SST for CI/CD — lint, typecheck, tests, and build before deploy — cutting deploy time by </w:t>
+        <w:t xml:space="preserve">Set </w:t>
       </w:r>
       <w:r>
         <w:rPr>
-          <w:rFonts w:ascii="Calibri" w:hAnsi="Calibri" w:eastAsia="Calibri"/>
+          <w:rFonts w:ascii="Calibri" w:hAnsi="Calibri"/>
           <w:b/>
           <w:color w:val="1A1A1A"/>
-          <w:sz w:val="21"/>
+          <w:sz w:val="19"/>
         </w:rPr>
-        <w:t xml:space="preserve">50%+</w:t>
+        <w:t>Vitest</w:t>
       </w:r>
       <w:r>
         <w:rPr>
-          <w:rFonts w:ascii="Calibri" w:hAnsi="Calibri" w:eastAsia="Calibri"/>
+          <w:rFonts w:ascii="Calibri" w:hAnsi="Calibri"/>
           <w:b w:val="0"/>
           <w:color w:val="1A1A1A"/>
-          <w:sz w:val="21"/>
+          <w:sz w:val="19"/>
         </w:rPr>
-        <w:t xml:space="preserve">.</w:t>
+        <w:t xml:space="preserve">, React Testing Library, and </w:t>
+      </w:r>
+      <w:r>
+        <w:rPr>
+          <w:rFonts w:ascii="Calibri" w:hAnsi="Calibri"/>
+          <w:b/>
+          <w:color w:val="1A1A1A"/>
+          <w:sz w:val="19"/>
+        </w:rPr>
+        <w:t>Playwright</w:t>
+      </w:r>
+      <w:r>
+        <w:rPr>
+          <w:rFonts w:ascii="Calibri" w:hAnsi="Calibri"/>
+          <w:b w:val="0"/>
+          <w:color w:val="1A1A1A"/>
+          <w:sz w:val="19"/>
+        </w:rPr>
+        <w:t xml:space="preserve"> / </w:t>
+      </w:r>
+      <w:r>
+        <w:rPr>
+          <w:rFonts w:ascii="Calibri" w:hAnsi="Calibri"/>
+          <w:b/>
+          <w:color w:val="1A1A1A"/>
+          <w:sz w:val="19"/>
+        </w:rPr>
+        <w:t>Cypress</w:t>
+      </w:r>
+      <w:r>
+        <w:rPr>
+          <w:rFonts w:ascii="Calibri" w:hAnsi="Calibri"/>
+          <w:b w:val="0"/>
+          <w:color w:val="1A1A1A"/>
+          <w:sz w:val="19"/>
+        </w:rPr>
+        <w:t xml:space="preserve"> quality gates for shared UI and critical flows.</w:t>
       </w:r>
     </w:p>
     <w:p>
       <w:pPr>
         <w:pStyle w:val="ListBullet"/>
-        <w:spacing w:after="30" w:before="0"/>
+        <w:widowControl/>
+        <w:spacing w:before="0" w:after="10" w:line="240" w:lineRule="auto"/>
         <w:ind w:left="288"/>
       </w:pPr>
       <w:r>
         <w:rPr>
-          <w:rFonts w:ascii="Calibri" w:hAnsi="Calibri" w:eastAsia="Calibri"/>
+          <w:rFonts w:ascii="Calibri" w:hAnsi="Calibri"/>
           <w:b w:val="0"/>
           <w:color w:val="1A1A1A"/>
-          <w:sz w:val="21"/>
+          <w:sz w:val="19"/>
         </w:rPr>
-        <w:t xml:space="preserve">Mentored summer interns and junior developers through pairing, code reviews, and shipping production work.</w:t>
-      </w:r>
-    </w:p>
-    <w:p>
-      <w:pPr>
-        <w:spacing w:before="200" w:after="80"/>
-        <w:pBdr>
-          <w:bottom w:val="single" w:sz="12" w:space="1" w:color="2C2C2C"/>
-        </w:pBdr>
-      </w:pPr>
-      <w:r>
-        <w:rPr>
-          <w:rFonts w:ascii="Calibri" w:hAnsi="Calibri" w:eastAsia="Calibri"/>
-          <w:b/>
-          <w:color w:val="2C2C2C"/>
-          <w:sz w:val="22"/>
-        </w:rPr>
-        <w:t xml:space="preserve">SELECTED PROJECTS</w:t>
-      </w:r>
-    </w:p>
-    <w:p>
-      <w:pPr>
-        <w:tabs>
-          <w:tab w:pos="10224" w:val="right"/>
-        </w:tabs>
-        <w:spacing w:before="160" w:after="20"/>
-      </w:pPr>
-      <w:r>
-        <w:rPr>
-          <w:rFonts w:ascii="Calibri" w:hAnsi="Calibri" w:eastAsia="Calibri"/>
-          <w:b/>
-          <w:color w:val="1A1A1A"/>
-          <w:sz w:val="22"/>
-        </w:rPr>
-        <w:t xml:space="preserve">Multi-Channel Agentic Platform</w:t>
+        <w:t xml:space="preserve">Instrumented web, mobile, and API releases with </w:t>
       </w:r>
       <w:r>
         <w:rPr>
-          <w:rFonts w:ascii="Calibri" w:hAnsi="Calibri" w:eastAsia="Calibri"/>
-          <w:b w:val="0"/>
-          <w:color w:val="4A4A4A"/>
-          <w:sz w:val="20"/>
+          <w:rFonts w:ascii="Calibri" w:hAnsi="Calibri"/>
+          <w:b/>
+          <w:color w:val="1A1A1A"/>
+          <w:sz w:val="19"/>
         </w:rPr>
-        <w:tab/>
-        <w:t xml:space="preserve">Apr 2026 – Present</w:t>
+        <w:t>Sentry</w:t>
       </w:r>
-    </w:p>
-    <w:p>
-      <w:pPr>
-        <w:spacing w:after="60" w:before="0"/>
-      </w:pPr>
       <w:r>
         <w:rPr>
-          <w:rFonts w:ascii="Calibri" w:hAnsi="Calibri" w:eastAsia="Calibri"/>
+          <w:rFonts w:ascii="Calibri" w:hAnsi="Calibri"/>
           <w:b w:val="0"/>
-          <w:color w:val="4A4A4A"/>
-          <w:sz w:val="20"/>
+          <w:color w:val="1A1A1A"/>
+          <w:sz w:val="19"/>
         </w:rPr>
-        <w:t xml:space="preserve">Client-facing agent platform for durable, multi-channel assistants (web + Discord).</w:t>
+        <w:t xml:space="preserve"> for production crashes, device issues, and API errors.</w:t>
       </w:r>
     </w:p>
     <w:p>
       <w:pPr>
         <w:pStyle w:val="ListBullet"/>
-        <w:spacing w:after="30" w:before="0"/>
+        <w:widowControl/>
+        <w:spacing w:before="0" w:after="10" w:line="240" w:lineRule="auto"/>
         <w:ind w:left="288"/>
       </w:pPr>
       <w:r>
         <w:rPr>
-          <w:rFonts w:ascii="Calibri" w:hAnsi="Calibri" w:eastAsia="Calibri"/>
+          <w:rFonts w:ascii="Calibri" w:hAnsi="Calibri"/>
           <w:b w:val="0"/>
           <w:color w:val="1A1A1A"/>
-          <w:sz w:val="21"/>
+          <w:sz w:val="19"/>
         </w:rPr>
-        <w:t xml:space="preserve">Each agent run is a durable stream across web and Discord: clients disconnect, reconnect, and resume mid-run without losing progress.</w:t>
+        <w:t xml:space="preserve">Adopted </w:t>
+      </w:r>
+      <w:r>
+        <w:rPr>
+          <w:rFonts w:ascii="Calibri" w:hAnsi="Calibri"/>
+          <w:b/>
+          <w:color w:val="1A1A1A"/>
+          <w:sz w:val="19"/>
+        </w:rPr>
+        <w:t>tRPC</w:t>
+      </w:r>
+      <w:r>
+        <w:rPr>
+          <w:rFonts w:ascii="Calibri" w:hAnsi="Calibri"/>
+          <w:b w:val="0"/>
+          <w:color w:val="1A1A1A"/>
+          <w:sz w:val="19"/>
+        </w:rPr>
+        <w:t xml:space="preserve"> and Scalar-generated API docs, cutting integration time by </w:t>
+      </w:r>
+      <w:r>
+        <w:rPr>
+          <w:rFonts w:ascii="Calibri" w:hAnsi="Calibri"/>
+          <w:b/>
+          <w:color w:val="1A1A1A"/>
+          <w:sz w:val="19"/>
+        </w:rPr>
+        <w:t>50%</w:t>
+      </w:r>
+      <w:r>
+        <w:rPr>
+          <w:rFonts w:ascii="Calibri" w:hAnsi="Calibri"/>
+          <w:b w:val="0"/>
+          <w:color w:val="1A1A1A"/>
+          <w:sz w:val="19"/>
+        </w:rPr>
+        <w:t xml:space="preserve"> and eliminating schema-mismatch errors.</w:t>
       </w:r>
     </w:p>
     <w:p>
       <w:pPr>
         <w:pStyle w:val="ListBullet"/>
-        <w:spacing w:after="30" w:before="0"/>
+        <w:widowControl/>
+        <w:spacing w:before="0" w:after="10" w:line="240" w:lineRule="auto"/>
         <w:ind w:left="288"/>
       </w:pPr>
       <w:r>
         <w:rPr>
-          <w:rFonts w:ascii="Calibri" w:hAnsi="Calibri" w:eastAsia="Calibri"/>
+          <w:rFonts w:ascii="Calibri" w:hAnsi="Calibri"/>
           <w:b w:val="0"/>
           <w:color w:val="1A1A1A"/>
-          <w:sz w:val="21"/>
+          <w:sz w:val="19"/>
         </w:rPr>
-        <w:t xml:space="preserve">Built workflows, memory, schedules, and tools on Mastra and AI SDK: pause/resume, retries, sandboxed tools, and skills.</w:t>
+        <w:t xml:space="preserve">Built GitHub Actions + </w:t>
+      </w:r>
+      <w:r>
+        <w:rPr>
+          <w:rFonts w:ascii="Calibri" w:hAnsi="Calibri"/>
+          <w:b/>
+          <w:color w:val="1A1A1A"/>
+          <w:sz w:val="19"/>
+        </w:rPr>
+        <w:t>SST</w:t>
+      </w:r>
+      <w:r>
+        <w:rPr>
+          <w:rFonts w:ascii="Calibri" w:hAnsi="Calibri"/>
+          <w:b w:val="0"/>
+          <w:color w:val="1A1A1A"/>
+          <w:sz w:val="19"/>
+        </w:rPr>
+        <w:t xml:space="preserve"> CI/CD with linting, type-checking, tests, and builds; cut deployment time by </w:t>
+      </w:r>
+      <w:r>
+        <w:rPr>
+          <w:rFonts w:ascii="Calibri" w:hAnsi="Calibri"/>
+          <w:b/>
+          <w:color w:val="1A1A1A"/>
+          <w:sz w:val="19"/>
+        </w:rPr>
+        <w:t>50%+</w:t>
+      </w:r>
+      <w:r>
+        <w:rPr>
+          <w:rFonts w:ascii="Calibri" w:hAnsi="Calibri"/>
+          <w:b w:val="0"/>
+          <w:color w:val="1A1A1A"/>
+          <w:sz w:val="19"/>
+        </w:rPr>
+        <w:t>.</w:t>
       </w:r>
     </w:p>
     <w:p>
       <w:pPr>
         <w:pStyle w:val="ListBullet"/>
-        <w:spacing w:after="30" w:before="0"/>
+        <w:widowControl/>
+        <w:spacing w:before="0" w:after="10" w:line="240" w:lineRule="auto"/>
         <w:ind w:left="288"/>
       </w:pPr>
       <w:r>
         <w:rPr>
-          <w:rFonts w:ascii="Calibri" w:hAnsi="Calibri" w:eastAsia="Calibri"/>
+          <w:rFonts w:ascii="Calibri" w:hAnsi="Calibri"/>
           <w:b w:val="0"/>
+          <w:color w:val="1A1A1A"/>
+          <w:sz w:val="19"/>
+        </w:rPr>
+        <w:t>Mentored interns and junior developers through pairing, code reviews, and production delivery.</w:t>
+      </w:r>
+    </w:p>
+    <w:p>
+      <w:pPr>
+        <w:keepNext/>
+        <w:widowControl/>
+        <w:spacing w:before="140" w:after="60"/>
+      </w:pPr>
+      <w:r>
+        <w:rPr>
+          <w:rFonts w:ascii="Calibri" w:hAnsi="Calibri"/>
+          <w:b/>
+          <w:color w:val="2C2C2C"/>
+          <w:sz w:val="21"/>
+        </w:rPr>
+        <w:t>SELECTED PROJECTS</w:t>
+      </w:r>
+    </w:p>
+    <w:p>
+      <w:pPr>
+        <w:keepNext/>
+        <w:widowControl/>
+        <w:tabs>
+          <w:tab w:pos="10224" w:val="right"/>
+        </w:tabs>
+        <w:spacing w:before="100" w:after="20"/>
+      </w:pPr>
+      <w:r>
+        <w:rPr>
+          <w:rFonts w:ascii="Calibri" w:hAnsi="Calibri"/>
+          <w:b/>
           <w:color w:val="1A1A1A"/>
           <w:sz w:val="21"/>
         </w:rPr>
-        <w:t xml:space="preserve">Shipped end-to-end RAG (ingest, chunk, Pinecone query/rerank) and gated releases on evals.</w:t>
+        <w:t>Multi-Channel Agentic Platform</w:t>
+      </w:r>
+      <w:r>
+        <w:rPr>
+          <w:rFonts w:ascii="Calibri" w:hAnsi="Calibri"/>
+          <w:b w:val="0"/>
+          <w:color w:val="4A4A4A"/>
+          <w:sz w:val="19"/>
+        </w:rPr>
+        <w:tab/>
+        <w:t>Apr 2026 – Present</w:t>
+      </w:r>
+    </w:p>
+    <w:p>
+      <w:pPr>
+        <w:widowControl/>
+        <w:spacing w:after="20" w:line="240" w:lineRule="auto"/>
+      </w:pPr>
+      <w:r>
+        <w:rPr>
+          <w:rFonts w:ascii="Calibri" w:hAnsi="Calibri"/>
+          <w:b w:val="0"/>
+          <w:color w:val="4A4A4A"/>
+          <w:sz w:val="18"/>
+        </w:rPr>
+        <w:t>Durable agent platform across web and Discord.</w:t>
       </w:r>
     </w:p>
     <w:p>
       <w:pPr>
         <w:pStyle w:val="ListBullet"/>
-        <w:spacing w:after="30" w:before="0"/>
+        <w:widowControl/>
+        <w:spacing w:before="0" w:after="10" w:line="240" w:lineRule="auto"/>
         <w:ind w:left="288"/>
       </w:pPr>
       <w:r>
         <w:rPr>
-          <w:rFonts w:ascii="Calibri" w:hAnsi="Calibri" w:eastAsia="Calibri"/>
+          <w:rFonts w:ascii="Calibri" w:hAnsi="Calibri"/>
           <w:b w:val="0"/>
           <w:color w:val="1A1A1A"/>
-          <w:sz w:val="21"/>
+          <w:sz w:val="19"/>
         </w:rPr>
-        <w:t xml:space="preserve">Ran Hono + Better Auth on ECS Fargate. Postgres for core data, S3 for files, ClickHouse for run/tool traces and cost/latency — a slow trace write cannot stall an agent run.</w:t>
+        <w:t>Made agent runs durable streams so clients could disconnect, reconnect, and resume without losing progress.</w:t>
       </w:r>
     </w:p>
     <w:p>
       <w:pPr>
         <w:pStyle w:val="ListBullet"/>
-        <w:spacing w:after="30" w:before="0"/>
+        <w:widowControl/>
+        <w:spacing w:before="0" w:after="10" w:line="240" w:lineRule="auto"/>
         <w:ind w:left="288"/>
       </w:pPr>
       <w:r>
         <w:rPr>
-          <w:rFonts w:ascii="Calibri" w:hAnsi="Calibri" w:eastAsia="Calibri"/>
+          <w:rFonts w:ascii="Calibri" w:hAnsi="Calibri"/>
           <w:b w:val="0"/>
           <w:color w:val="1A1A1A"/>
-          <w:sz w:val="21"/>
+          <w:sz w:val="19"/>
         </w:rPr>
-        <w:t xml:space="preserve">Shipped chat, tool-invocation, and multi-step client flows, plus a TipTap @mention file-tagging component for attaching workspace files into prompts.</w:t>
-      </w:r>
-    </w:p>
-    <w:p>
-      <w:pPr>
-        <w:spacing w:before="0" w:after="0"/>
-      </w:pPr>
-    </w:p>
-    <w:p>
-      <w:pPr>
-        <w:tabs>
-          <w:tab w:pos="10224" w:val="right"/>
-        </w:tabs>
-        <w:spacing w:before="160" w:after="20"/>
-      </w:pPr>
-      <w:r>
-        <w:rPr>
-          <w:rFonts w:ascii="Calibri" w:hAnsi="Calibri" w:eastAsia="Calibri"/>
-          <w:b/>
-          <w:color w:val="1A1A1A"/>
-          <w:sz w:val="22"/>
-        </w:rPr>
-        <w:t xml:space="preserve">High-Performance Marketing Site</w:t>
-      </w:r>
-      <w:r>
-        <w:rPr>
-          <w:rFonts w:ascii="Calibri" w:hAnsi="Calibri" w:eastAsia="Calibri"/>
-          <w:b w:val="0"/>
-          <w:color w:val="4A4A4A"/>
-          <w:sz w:val="20"/>
-        </w:rPr>
-        <w:tab/>
-        <w:t xml:space="preserve">Nov 2025</w:t>
-      </w:r>
-    </w:p>
-    <w:p>
-      <w:pPr>
-        <w:spacing w:after="60" w:before="0"/>
-      </w:pPr>
-      <w:r>
-        <w:rPr>
-          <w:rFonts w:ascii="Calibri" w:hAnsi="Calibri" w:eastAsia="Calibri"/>
-          <w:b w:val="0"/>
-          <w:color w:val="4A4A4A"/>
-          <w:sz w:val="20"/>
-        </w:rPr>
-        <w:t xml:space="preserve">Lead engineer for a content + search marketing site — performance, CMS, and publish workflow.</w:t>
+        <w:t>Built Mastra / AI SDK workflows, memory, schedules, tools, pause/resume, retries, sandboxing, and skills.</w:t>
       </w:r>
     </w:p>
     <w:p>
       <w:pPr>
         <w:pStyle w:val="ListBullet"/>
-        <w:spacing w:after="30" w:before="0"/>
+        <w:widowControl/>
+        <w:spacing w:before="0" w:after="10" w:line="240" w:lineRule="auto"/>
         <w:ind w:left="288"/>
       </w:pPr>
       <w:r>
         <w:rPr>
-          <w:rFonts w:ascii="Calibri" w:hAnsi="Calibri" w:eastAsia="Calibri"/>
+          <w:rFonts w:ascii="Calibri" w:hAnsi="Calibri"/>
           <w:b w:val="0"/>
           <w:color w:val="1A1A1A"/>
-          <w:sz w:val="21"/>
+          <w:sz w:val="19"/>
         </w:rPr>
-        <w:t xml:space="preserve">Next.js + Strapi + Meilisearch with </w:t>
+        <w:t>Shipped org-scoped RAG (ingestion, chunking, Pinecone query/reranking) and eval-gated releases.</w:t>
+      </w:r>
+    </w:p>
+    <w:p>
+      <w:pPr>
+        <w:pStyle w:val="ListBullet"/>
+        <w:widowControl/>
+        <w:spacing w:before="0" w:after="10" w:line="240" w:lineRule="auto"/>
+        <w:ind w:left="288"/>
+      </w:pPr>
+      <w:r>
+        <w:rPr>
+          <w:rFonts w:ascii="Calibri" w:hAnsi="Calibri"/>
+          <w:b w:val="0"/>
+          <w:color w:val="1A1A1A"/>
+          <w:sz w:val="19"/>
+        </w:rPr>
+        <w:t xml:space="preserve">Ran Hono + Better Auth on </w:t>
       </w:r>
       <w:r>
         <w:rPr>
-          <w:rFonts w:ascii="Calibri" w:hAnsi="Calibri" w:eastAsia="Calibri"/>
+          <w:rFonts w:ascii="Calibri" w:hAnsi="Calibri"/>
+          <w:b/>
+          <w:color w:val="1A1A1A"/>
+          <w:sz w:val="19"/>
+        </w:rPr>
+        <w:t>ECS Fargate</w:t>
+      </w:r>
+      <w:r>
+        <w:rPr>
+          <w:rFonts w:ascii="Calibri" w:hAnsi="Calibri"/>
+          <w:b w:val="0"/>
+          <w:color w:val="1A1A1A"/>
+          <w:sz w:val="19"/>
+        </w:rPr>
+        <w:t>, with Postgres, S3, and non-blocking ClickHouse traces for cost/latency.</w:t>
+      </w:r>
+    </w:p>
+    <w:p>
+      <w:pPr>
+        <w:pStyle w:val="ListBullet"/>
+        <w:widowControl/>
+        <w:spacing w:before="0" w:after="10" w:line="240" w:lineRule="auto"/>
+        <w:ind w:left="288"/>
+      </w:pPr>
+      <w:r>
+        <w:rPr>
+          <w:rFonts w:ascii="Calibri" w:hAnsi="Calibri"/>
+          <w:b w:val="0"/>
+          <w:color w:val="1A1A1A"/>
+          <w:sz w:val="19"/>
+        </w:rPr>
+        <w:t>Shipped chat, tool-invocation, multi-step flows, and TipTap @mentions for attaching workspace files.</w:t>
+      </w:r>
+    </w:p>
+    <w:p>
+      <w:pPr>
+        <w:keepNext/>
+        <w:widowControl/>
+        <w:tabs>
+          <w:tab w:pos="10224" w:val="right"/>
+        </w:tabs>
+        <w:spacing w:before="100" w:after="20"/>
+      </w:pPr>
+      <w:r>
+        <w:rPr>
+          <w:rFonts w:ascii="Calibri" w:hAnsi="Calibri"/>
           <w:b/>
           <w:color w:val="1A1A1A"/>
           <w:sz w:val="21"/>
         </w:rPr>
-        <w:t xml:space="preserve">LCP &lt; 0.5s</w:t>
+        <w:t>Healthcare AI Agent</w:t>
       </w:r>
       <w:r>
         <w:rPr>
-          <w:rFonts w:ascii="Calibri" w:hAnsi="Calibri" w:eastAsia="Calibri"/>
+          <w:rFonts w:ascii="Calibri" w:hAnsi="Calibri"/>
+          <w:b w:val="0"/>
+          <w:color w:val="4A4A4A"/>
+          <w:sz w:val="19"/>
+        </w:rPr>
+        <w:tab/>
+        <w:t>July 2025 – Apr 2026</w:t>
+      </w:r>
+    </w:p>
+    <w:p>
+      <w:pPr>
+        <w:widowControl/>
+        <w:spacing w:after="20" w:line="240" w:lineRule="auto"/>
+      </w:pPr>
+      <w:r>
+        <w:rPr>
+          <w:rFonts w:ascii="Calibri" w:hAnsi="Calibri"/>
+          <w:b w:val="0"/>
+          <w:color w:val="4A4A4A"/>
+          <w:sz w:val="18"/>
+        </w:rPr>
+        <w:t>Healthcare and shopping assistant grounded in uploaded documents and product data.</w:t>
+      </w:r>
+    </w:p>
+    <w:p>
+      <w:pPr>
+        <w:pStyle w:val="ListBullet"/>
+        <w:widowControl/>
+        <w:spacing w:before="0" w:after="10" w:line="240" w:lineRule="auto"/>
+        <w:ind w:left="288"/>
+      </w:pPr>
+      <w:r>
+        <w:rPr>
+          <w:rFonts w:ascii="Calibri" w:hAnsi="Calibri"/>
           <w:b w:val="0"/>
           <w:color w:val="1A1A1A"/>
+          <w:sz w:val="19"/>
+        </w:rPr>
+        <w:t>Owned document upload, questionnaires, product/cart actions, and admin flows; Better Auth, HttpOnly cookies, and RBAC separated client/admin roles.</w:t>
+      </w:r>
+    </w:p>
+    <w:p>
+      <w:pPr>
+        <w:pStyle w:val="ListBullet"/>
+        <w:widowControl/>
+        <w:spacing w:before="0" w:after="10" w:line="240" w:lineRule="auto"/>
+        <w:ind w:left="288"/>
+      </w:pPr>
+      <w:r>
+        <w:rPr>
+          <w:rFonts w:ascii="Calibri" w:hAnsi="Calibri"/>
+          <w:b w:val="0"/>
+          <w:color w:val="1A1A1A"/>
+          <w:sz w:val="19"/>
+        </w:rPr>
+        <w:t xml:space="preserve">Split admin list state: URL-owned filters/pagination, </w:t>
+      </w:r>
+      <w:r>
+        <w:rPr>
+          <w:rFonts w:ascii="Calibri" w:hAnsi="Calibri"/>
+          <w:b/>
+          <w:color w:val="1A1A1A"/>
+          <w:sz w:val="19"/>
+        </w:rPr>
+        <w:t>TanStack Query</w:t>
+      </w:r>
+      <w:r>
+        <w:rPr>
+          <w:rFonts w:ascii="Calibri" w:hAnsi="Calibri"/>
+          <w:b w:val="0"/>
+          <w:color w:val="1A1A1A"/>
+          <w:sz w:val="19"/>
+        </w:rPr>
+        <w:t xml:space="preserve"> server cache, and </w:t>
+      </w:r>
+      <w:r>
+        <w:rPr>
+          <w:rFonts w:ascii="Calibri" w:hAnsi="Calibri"/>
+          <w:b/>
+          <w:color w:val="1A1A1A"/>
+          <w:sz w:val="19"/>
+        </w:rPr>
+        <w:t>TanStack Table</w:t>
+      </w:r>
+      <w:r>
+        <w:rPr>
+          <w:rFonts w:ascii="Calibri" w:hAnsi="Calibri"/>
+          <w:b w:val="0"/>
+          <w:color w:val="1A1A1A"/>
+          <w:sz w:val="19"/>
+        </w:rPr>
+        <w:t xml:space="preserve"> presentation.</w:t>
+      </w:r>
+    </w:p>
+    <w:p>
+      <w:pPr>
+        <w:pStyle w:val="ListBullet"/>
+        <w:widowControl/>
+        <w:spacing w:before="0" w:after="10" w:line="240" w:lineRule="auto"/>
+        <w:ind w:left="288"/>
+      </w:pPr>
+      <w:r>
+        <w:rPr>
+          <w:rFonts w:ascii="Calibri" w:hAnsi="Calibri"/>
+          <w:b w:val="0"/>
+          <w:color w:val="1A1A1A"/>
+          <w:sz w:val="19"/>
+        </w:rPr>
+        <w:t>Built document ingestion and scoped RAG so recommendations stayed grounded in the uploaded report.</w:t>
+      </w:r>
+    </w:p>
+    <w:p>
+      <w:pPr>
+        <w:keepNext/>
+        <w:widowControl/>
+        <w:tabs>
+          <w:tab w:pos="10224" w:val="right"/>
+        </w:tabs>
+        <w:spacing w:before="100" w:after="20"/>
+      </w:pPr>
+      <w:r>
+        <w:rPr>
+          <w:rFonts w:ascii="Calibri" w:hAnsi="Calibri"/>
+          <w:b/>
+          <w:color w:val="1A1A1A"/>
           <w:sz w:val="21"/>
+        </w:rPr>
+        <w:t>High-Performance Editorial Platform</w:t>
+      </w:r>
+      <w:r>
+        <w:rPr>
+          <w:rFonts w:ascii="Calibri" w:hAnsi="Calibri"/>
+          <w:b w:val="0"/>
+          <w:color w:val="4A4A4A"/>
+          <w:sz w:val="19"/>
+        </w:rPr>
+        <w:tab/>
+        <w:t>Nov 2025</w:t>
+      </w:r>
+    </w:p>
+    <w:p>
+      <w:pPr>
+        <w:widowControl/>
+        <w:spacing w:after="20" w:line="240" w:lineRule="auto"/>
+      </w:pPr>
+      <w:r>
+        <w:rPr>
+          <w:rFonts w:ascii="Calibri" w:hAnsi="Calibri"/>
+          <w:b w:val="0"/>
+          <w:color w:val="4A4A4A"/>
+          <w:sz w:val="18"/>
+        </w:rPr>
+        <w:t xml:space="preserve">Strapi, Meilisearch, and </w:t>
+      </w:r>
+      <w:r>
+        <w:rPr>
+          <w:rFonts w:ascii="Calibri" w:hAnsi="Calibri"/>
+          <w:b/>
+          <w:color w:val="4A4A4A"/>
+          <w:sz w:val="18"/>
+        </w:rPr>
+        <w:t>Next.js</w:t>
+      </w:r>
+      <w:r>
+        <w:rPr>
+          <w:rFonts w:ascii="Calibri" w:hAnsi="Calibri"/>
+          <w:b w:val="0"/>
+          <w:color w:val="4A4A4A"/>
+          <w:sz w:val="18"/>
+        </w:rPr>
+        <w:t xml:space="preserve"> editorial platform in the WordPress-to-headless migration.</w:t>
+      </w:r>
+    </w:p>
+    <w:p>
+      <w:pPr>
+        <w:pStyle w:val="ListBullet"/>
+        <w:widowControl/>
+        <w:spacing w:before="0" w:after="10" w:line="240" w:lineRule="auto"/>
+        <w:ind w:left="288"/>
+      </w:pPr>
+      <w:r>
+        <w:rPr>
+          <w:rFonts w:ascii="Calibri" w:hAnsi="Calibri"/>
+          <w:b w:val="0"/>
+          <w:color w:val="1A1A1A"/>
+          <w:sz w:val="19"/>
+        </w:rPr>
+        <w:t xml:space="preserve">Reserved image space and optimized caching/images: </w:t>
+      </w:r>
+      <w:r>
+        <w:rPr>
+          <w:rFonts w:ascii="Calibri" w:hAnsi="Calibri"/>
+          <w:b/>
+          <w:color w:val="1A1A1A"/>
+          <w:sz w:val="19"/>
+        </w:rPr>
+        <w:t>LCP &amp;lt; 0.5s</w:t>
+      </w:r>
+      <w:r>
+        <w:rPr>
+          <w:rFonts w:ascii="Calibri" w:hAnsi="Calibri"/>
+          <w:b w:val="0"/>
+          <w:color w:val="1A1A1A"/>
+          <w:sz w:val="19"/>
         </w:rPr>
         <w:t xml:space="preserve">, </w:t>
       </w:r>
       <w:r>
         <w:rPr>
-          <w:rFonts w:ascii="Calibri" w:hAnsi="Calibri" w:eastAsia="Calibri"/>
+          <w:rFonts w:ascii="Calibri" w:hAnsi="Calibri"/>
           <w:b/>
           <w:color w:val="1A1A1A"/>
-          <w:sz w:val="21"/>
+          <w:sz w:val="19"/>
         </w:rPr>
-        <w:t xml:space="preserve">CLS &lt; 0.1</w:t>
+        <w:t>CLS &amp;lt; 0.1</w:t>
       </w:r>
       <w:r>
         <w:rPr>
-          <w:rFonts w:ascii="Calibri" w:hAnsi="Calibri" w:eastAsia="Calibri"/>
+          <w:rFonts w:ascii="Calibri" w:hAnsi="Calibri"/>
           <w:b w:val="0"/>
           <w:color w:val="1A1A1A"/>
-          <w:sz w:val="21"/>
+          <w:sz w:val="19"/>
         </w:rPr>
-        <w:t xml:space="preserve">, and PageSpeed Insights </w:t>
+        <w:t xml:space="preserve">, PageSpeed </w:t>
       </w:r>
       <w:r>
         <w:rPr>
-          <w:rFonts w:ascii="Calibri" w:hAnsi="Calibri" w:eastAsia="Calibri"/>
+          <w:rFonts w:ascii="Calibri" w:hAnsi="Calibri"/>
           <w:b/>
           <w:color w:val="1A1A1A"/>
-          <w:sz w:val="21"/>
+          <w:sz w:val="19"/>
         </w:rPr>
-        <w:t xml:space="preserve">&gt;90</w:t>
+        <w:t>&gt;90</w:t>
       </w:r>
       <w:r>
         <w:rPr>
-          <w:rFonts w:ascii="Calibri" w:hAnsi="Calibri" w:eastAsia="Calibri"/>
+          <w:rFonts w:ascii="Calibri" w:hAnsi="Calibri"/>
           <w:b w:val="0"/>
           <w:color w:val="1A1A1A"/>
-          <w:sz w:val="21"/>
+          <w:sz w:val="19"/>
         </w:rPr>
-        <w:t xml:space="preserve">.</w:t>
+        <w:t xml:space="preserve"> (lab).</w:t>
       </w:r>
     </w:p>
     <w:p>
       <w:pPr>
         <w:pStyle w:val="ListBullet"/>
-        <w:spacing w:after="30" w:before="0"/>
+        <w:widowControl/>
+        <w:spacing w:before="0" w:after="10" w:line="240" w:lineRule="auto"/>
         <w:ind w:left="288"/>
       </w:pPr>
       <w:r>
         <w:rPr>
-          <w:rFonts w:ascii="Calibri" w:hAnsi="Calibri" w:eastAsia="Calibri"/>
+          <w:rFonts w:ascii="Calibri" w:hAnsi="Calibri"/>
           <w:b w:val="0"/>
           <w:color w:val="1A1A1A"/>
-          <w:sz w:val="21"/>
+          <w:sz w:val="19"/>
         </w:rPr>
-        <w:t xml:space="preserve">Chose hybrid ISR (build the main pages and latest 100 articles; rest on demand) plus Strapi webhook revalidation so publishes skip a full rebuild.</w:t>
+        <w:t xml:space="preserve">Used hybrid ISR: main pages/latest 100 articles at build, rest on demand; Strapi </w:t>
+      </w:r>
+      <w:r>
+        <w:rPr>
+          <w:rFonts w:ascii="Calibri" w:hAnsi="Calibri"/>
+          <w:b/>
+          <w:color w:val="1A1A1A"/>
+          <w:sz w:val="19"/>
+        </w:rPr>
+        <w:t>GraphQL</w:t>
+      </w:r>
+      <w:r>
+        <w:rPr>
+          <w:rFonts w:ascii="Calibri" w:hAnsi="Calibri"/>
+          <w:b w:val="0"/>
+          <w:color w:val="1A1A1A"/>
+          <w:sz w:val="19"/>
+        </w:rPr>
+        <w:t xml:space="preserve">, </w:t>
+      </w:r>
+      <w:r>
+        <w:rPr>
+          <w:rFonts w:ascii="Calibri" w:hAnsi="Calibri"/>
+          <w:b/>
+          <w:color w:val="1A1A1A"/>
+          <w:sz w:val="19"/>
+        </w:rPr>
+        <w:t>Next.js</w:t>
+      </w:r>
+      <w:r>
+        <w:rPr>
+          <w:rFonts w:ascii="Calibri" w:hAnsi="Calibri"/>
+          <w:b w:val="0"/>
+          <w:color w:val="1A1A1A"/>
+          <w:sz w:val="19"/>
+        </w:rPr>
+        <w:t xml:space="preserve"> cache tags, and webhooks revalidated publishes without full rebuilds.</w:t>
       </w:r>
     </w:p>
     <w:p>
       <w:pPr>
         <w:pStyle w:val="ListBullet"/>
-        <w:spacing w:after="30" w:before="0"/>
+        <w:widowControl/>
+        <w:spacing w:before="0" w:after="10" w:line="240" w:lineRule="auto"/>
         <w:ind w:left="288"/>
       </w:pPr>
       <w:r>
         <w:rPr>
-          <w:rFonts w:ascii="Calibri" w:hAnsi="Calibri" w:eastAsia="Calibri"/>
+          <w:rFonts w:ascii="Calibri" w:hAnsi="Calibri"/>
           <w:b w:val="0"/>
           <w:color w:val="1A1A1A"/>
-          <w:sz w:val="21"/>
+          <w:sz w:val="19"/>
         </w:rPr>
-        <w:t xml:space="preserve">Accessibility and SEO as ship criteria; custom Strapi plugin for generative AI content via AI SDK.</w:t>
+        <w:t>Made keyboard navigation, accessible form errors, semantics, and Lighthouse/axe checks release requirements.</w:t>
       </w:r>
     </w:p>
     <w:p>
       <w:pPr>
         <w:pStyle w:val="ListBullet"/>
-        <w:spacing w:after="30" w:before="0"/>
+        <w:widowControl/>
+        <w:spacing w:before="0" w:after="10" w:line="240" w:lineRule="auto"/>
         <w:ind w:left="288"/>
       </w:pPr>
       <w:r>
         <w:rPr>
-          <w:rFonts w:ascii="Calibri" w:hAnsi="Calibri" w:eastAsia="Calibri"/>
+          <w:rFonts w:ascii="Calibri" w:hAnsi="Calibri"/>
           <w:b w:val="0"/>
           <w:color w:val="1A1A1A"/>
-          <w:sz w:val="21"/>
+          <w:sz w:val="19"/>
         </w:rPr>
-        <w:t xml:space="preserve">Built interactive and multi-step flows with TanStack Query prefetch/hydration, TanStack Form + Zod, and XState; locale-aware routing, copy, and date/number formatting on client content sites.</w:t>
-      </w:r>
-    </w:p>
-    <w:p>
-      <w:pPr>
-        <w:tabs>
-          <w:tab w:pos="10224" w:val="right"/>
-        </w:tabs>
-        <w:spacing w:before="160" w:after="20"/>
-      </w:pPr>
-      <w:r>
-        <w:rPr>
-          <w:rFonts w:ascii="Calibri" w:hAnsi="Calibri" w:eastAsia="Calibri"/>
-          <w:b/>
-          <w:color w:val="1A1A1A"/>
-          <w:sz w:val="22"/>
-        </w:rPr>
-        <w:t xml:space="preserve">React Native Membership Platform</w:t>
+        <w:t xml:space="preserve">Split interactive state from page data: </w:t>
       </w:r>
       <w:r>
         <w:rPr>
-          <w:rFonts w:ascii="Calibri" w:hAnsi="Calibri" w:eastAsia="Calibri"/>
+          <w:rFonts w:ascii="Calibri" w:hAnsi="Calibri"/>
+          <w:b/>
+          <w:color w:val="1A1A1A"/>
+          <w:sz w:val="19"/>
+        </w:rPr>
+        <w:t>XState</w:t>
+      </w:r>
+      <w:r>
+        <w:rPr>
+          <w:rFonts w:ascii="Calibri" w:hAnsi="Calibri"/>
           <w:b w:val="0"/>
-          <w:color w:val="4A4A4A"/>
-          <w:sz w:val="20"/>
+          <w:color w:val="1A1A1A"/>
+          <w:sz w:val="19"/>
         </w:rPr>
-        <w:tab/>
-        <w:t xml:space="preserve">Shipped Apr 2024</w:t>
+        <w:t xml:space="preserve"> + </w:t>
+      </w:r>
+      <w:r>
+        <w:rPr>
+          <w:rFonts w:ascii="Calibri" w:hAnsi="Calibri"/>
+          <w:b/>
+          <w:color w:val="1A1A1A"/>
+          <w:sz w:val="19"/>
+        </w:rPr>
+        <w:t>TanStack Form</w:t>
+      </w:r>
+      <w:r>
+        <w:rPr>
+          <w:rFonts w:ascii="Calibri" w:hAnsi="Calibri"/>
+          <w:b w:val="0"/>
+          <w:color w:val="1A1A1A"/>
+          <w:sz w:val="19"/>
+        </w:rPr>
+        <w:t xml:space="preserve"> / </w:t>
+      </w:r>
+      <w:r>
+        <w:rPr>
+          <w:rFonts w:ascii="Calibri" w:hAnsi="Calibri"/>
+          <w:b/>
+          <w:color w:val="1A1A1A"/>
+          <w:sz w:val="19"/>
+        </w:rPr>
+        <w:t>Zod</w:t>
+      </w:r>
+      <w:r>
+        <w:rPr>
+          <w:rFonts w:ascii="Calibri" w:hAnsi="Calibri"/>
+          <w:b w:val="0"/>
+          <w:color w:val="1A1A1A"/>
+          <w:sz w:val="19"/>
+        </w:rPr>
+        <w:t>, route-owned locale, and hybrid-ISR content.</w:t>
       </w:r>
     </w:p>
     <w:p>
       <w:pPr>
         <w:pStyle w:val="ListBullet"/>
-        <w:spacing w:after="30" w:before="0"/>
+        <w:widowControl/>
+        <w:spacing w:before="0" w:after="10" w:line="240" w:lineRule="auto"/>
         <w:ind w:left="288"/>
       </w:pPr>
       <w:r>
         <w:rPr>
-          <w:rFonts w:ascii="Calibri" w:hAnsi="Calibri" w:eastAsia="Calibri"/>
+          <w:rFonts w:ascii="Calibri" w:hAnsi="Calibri"/>
           <w:b w:val="0"/>
+          <w:color w:val="1A1A1A"/>
+          <w:sz w:val="19"/>
+        </w:rPr>
+        <w:t>Built a Strapi plugin for AI-assisted content generation with AI SDK.</w:t>
+      </w:r>
+    </w:p>
+    <w:p>
+      <w:pPr>
+        <w:keepNext/>
+        <w:pageBreakBefore/>
+        <w:widowControl/>
+        <w:tabs>
+          <w:tab w:pos="10224" w:val="right"/>
+        </w:tabs>
+        <w:spacing w:before="100" w:after="20"/>
+      </w:pPr>
+      <w:r>
+        <w:rPr>
+          <w:rFonts w:ascii="Calibri" w:hAnsi="Calibri"/>
+          <w:b/>
           <w:color w:val="1A1A1A"/>
           <w:sz w:val="21"/>
         </w:rPr>
-        <w:t xml:space="preserve">Led Figma design and the membership app; shipped iOS and Android to the App Store and Play Store. Also maintained the Express API and Next.js admin.</w:t>
+        <w:t>React Native Membership Platform</w:t>
+      </w:r>
+      <w:r>
+        <w:rPr>
+          <w:rFonts w:ascii="Calibri" w:hAnsi="Calibri"/>
+          <w:b w:val="0"/>
+          <w:color w:val="4A4A4A"/>
+          <w:sz w:val="19"/>
+        </w:rPr>
+        <w:tab/>
+        <w:t>shipped Apr 2024</w:t>
       </w:r>
     </w:p>
     <w:p>
       <w:pPr>
         <w:pStyle w:val="ListBullet"/>
-        <w:spacing w:after="30" w:before="0"/>
+        <w:widowControl/>
+        <w:spacing w:before="0" w:after="10" w:line="240" w:lineRule="auto"/>
         <w:ind w:left="288"/>
       </w:pPr>
       <w:r>
         <w:rPr>
-          <w:rFonts w:ascii="Calibri" w:hAnsi="Calibri" w:eastAsia="Calibri"/>
+          <w:rFonts w:ascii="Calibri" w:hAnsi="Calibri"/>
           <w:b w:val="0"/>
           <w:color w:val="1A1A1A"/>
-          <w:sz w:val="21"/>
+          <w:sz w:val="19"/>
         </w:rPr>
-        <w:t xml:space="preserve">Diagnosed production crashes, device compatibility, and performance bottlenecks independently via Sentry across app and API; maintained </w:t>
+        <w:t xml:space="preserve">Owned digital card, points, and offers from Figma through Apple App Store / Google Play release; maintained the Express API and </w:t>
       </w:r>
       <w:r>
         <w:rPr>
-          <w:rFonts w:ascii="Calibri" w:hAnsi="Calibri" w:eastAsia="Calibri"/>
+          <w:rFonts w:ascii="Calibri" w:hAnsi="Calibri"/>
           <w:b/>
           <w:color w:val="1A1A1A"/>
-          <w:sz w:val="21"/>
+          <w:sz w:val="19"/>
         </w:rPr>
-        <w:t xml:space="preserve">99%</w:t>
+        <w:t>Next.js</w:t>
       </w:r>
       <w:r>
         <w:rPr>
-          <w:rFonts w:ascii="Calibri" w:hAnsi="Calibri" w:eastAsia="Calibri"/>
+          <w:rFonts w:ascii="Calibri" w:hAnsi="Calibri"/>
           <w:b w:val="0"/>
           <w:color w:val="1A1A1A"/>
-          <w:sz w:val="21"/>
+          <w:sz w:val="19"/>
         </w:rPr>
-        <w:t xml:space="preserve"> crash-free sessions post-launch.</w:t>
+        <w:t xml:space="preserve"> admin.</w:t>
       </w:r>
     </w:p>
     <w:p>
       <w:pPr>
         <w:pStyle w:val="ListBullet"/>
-        <w:spacing w:after="30" w:before="0"/>
+        <w:widowControl/>
+        <w:spacing w:before="0" w:after="10" w:line="240" w:lineRule="auto"/>
         <w:ind w:left="288"/>
       </w:pPr>
       <w:r>
         <w:rPr>
-          <w:rFonts w:ascii="Calibri" w:hAnsi="Calibri" w:eastAsia="Calibri"/>
+          <w:rFonts w:ascii="Calibri" w:hAnsi="Calibri"/>
           <w:b w:val="0"/>
           <w:color w:val="1A1A1A"/>
-          <w:sz w:val="21"/>
+          <w:sz w:val="19"/>
         </w:rPr>
-        <w:t xml:space="preserve">Cut list jank with FlashList, tab freeze, and cached feed images. Push + deep links via Firebase Cloud Messaging for promos and milestones.</w:t>
+        <w:t xml:space="preserve">Stored refresh tokens in </w:t>
+      </w:r>
+      <w:r>
+        <w:rPr>
+          <w:rFonts w:ascii="Calibri" w:hAnsi="Calibri"/>
+          <w:b/>
+          <w:color w:val="1A1A1A"/>
+          <w:sz w:val="19"/>
+        </w:rPr>
+        <w:t>SecureStore</w:t>
+      </w:r>
+      <w:r>
+        <w:rPr>
+          <w:rFonts w:ascii="Calibri" w:hAnsi="Calibri"/>
+          <w:b w:val="0"/>
+          <w:color w:val="1A1A1A"/>
+          <w:sz w:val="19"/>
+        </w:rPr>
+        <w:t xml:space="preserve"> / Keychain, gated sessions with biometrics, and generated typed </w:t>
+      </w:r>
+      <w:r>
+        <w:rPr>
+          <w:rFonts w:ascii="Calibri" w:hAnsi="Calibri"/>
+          <w:b/>
+          <w:color w:val="1A1A1A"/>
+          <w:sz w:val="19"/>
+        </w:rPr>
+        <w:t>OpenAPI</w:t>
+      </w:r>
+      <w:r>
+        <w:rPr>
+          <w:rFonts w:ascii="Calibri" w:hAnsi="Calibri"/>
+          <w:b w:val="0"/>
+          <w:color w:val="1A1A1A"/>
+          <w:sz w:val="19"/>
+        </w:rPr>
+        <w:t xml:space="preserve"> REST clients.</w:t>
       </w:r>
     </w:p>
     <w:p>
       <w:pPr>
-        <w:spacing w:before="200" w:after="80"/>
-        <w:pBdr>
-          <w:bottom w:val="single" w:sz="12" w:space="1" w:color="2C2C2C"/>
-        </w:pBdr>
+        <w:pStyle w:val="ListBullet"/>
+        <w:widowControl/>
+        <w:spacing w:before="0" w:after="10" w:line="240" w:lineRule="auto"/>
+        <w:ind w:left="288"/>
       </w:pPr>
       <w:r>
         <w:rPr>
-          <w:rFonts w:ascii="Calibri" w:hAnsi="Calibri" w:eastAsia="Calibri"/>
+          <w:rFonts w:ascii="Calibri" w:hAnsi="Calibri"/>
+          <w:b w:val="0"/>
+          <w:color w:val="1A1A1A"/>
+          <w:sz w:val="19"/>
+        </w:rPr>
+        <w:t xml:space="preserve">Maintained </w:t>
+      </w:r>
+      <w:r>
+        <w:rPr>
+          <w:rFonts w:ascii="Calibri" w:hAnsi="Calibri"/>
           <w:b/>
-          <w:color w:val="2C2C2C"/>
-          <w:sz w:val="22"/>
+          <w:color w:val="1A1A1A"/>
+          <w:sz w:val="19"/>
         </w:rPr>
-        <w:t xml:space="preserve">OTHER WORK</w:t>
+        <w:t>99%</w:t>
+      </w:r>
+      <w:r>
+        <w:rPr>
+          <w:rFonts w:ascii="Calibri" w:hAnsi="Calibri"/>
+          <w:b w:val="0"/>
+          <w:color w:val="1A1A1A"/>
+          <w:sz w:val="19"/>
+        </w:rPr>
+        <w:t xml:space="preserve"> crash-free sessions by diagnosing crashes, device issues, and API bottlenecks with </w:t>
+      </w:r>
+      <w:r>
+        <w:rPr>
+          <w:rFonts w:ascii="Calibri" w:hAnsi="Calibri"/>
+          <w:b/>
+          <w:color w:val="1A1A1A"/>
+          <w:sz w:val="19"/>
+        </w:rPr>
+        <w:t>Sentry</w:t>
+      </w:r>
+      <w:r>
+        <w:rPr>
+          <w:rFonts w:ascii="Calibri" w:hAnsi="Calibri"/>
+          <w:b w:val="0"/>
+          <w:color w:val="1A1A1A"/>
+          <w:sz w:val="19"/>
+        </w:rPr>
+        <w:t>.</w:t>
       </w:r>
     </w:p>
     <w:p>
       <w:pPr>
-        <w:spacing w:after="60" w:before="0"/>
+        <w:pStyle w:val="ListBullet"/>
+        <w:widowControl/>
+        <w:spacing w:before="0" w:after="10" w:line="240" w:lineRule="auto"/>
+        <w:ind w:left="288"/>
       </w:pPr>
       <w:r>
         <w:rPr>
-          <w:rFonts w:ascii="Calibri" w:hAnsi="Calibri" w:eastAsia="Calibri"/>
+          <w:rFonts w:ascii="Calibri" w:hAnsi="Calibri"/>
           <w:b w:val="0"/>
           <w:color w:val="1A1A1A"/>
-          <w:sz w:val="21"/>
+          <w:sz w:val="19"/>
         </w:rPr>
-        <w:t xml:space="preserve">Loyalty and membership apps, CMS content sites, Shopify storefronts, a health/wellness RAG agent, and an RBAC resource system — mostly Next.js / React Native.</w:t>
+        <w:t xml:space="preserve">Fixed JS-thread feed stalls with </w:t>
+      </w:r>
+      <w:r>
+        <w:rPr>
+          <w:rFonts w:ascii="Calibri" w:hAnsi="Calibri"/>
+          <w:b/>
+          <w:color w:val="1A1A1A"/>
+          <w:sz w:val="19"/>
+        </w:rPr>
+        <w:t>FlashList</w:t>
+      </w:r>
+      <w:r>
+        <w:rPr>
+          <w:rFonts w:ascii="Calibri" w:hAnsi="Calibri"/>
+          <w:b w:val="0"/>
+          <w:color w:val="1A1A1A"/>
+          <w:sz w:val="19"/>
+        </w:rPr>
+        <w:t xml:space="preserve">, memoized rows, smaller cached images, and native-thread </w:t>
+      </w:r>
+      <w:r>
+        <w:rPr>
+          <w:rFonts w:ascii="Calibri" w:hAnsi="Calibri"/>
+          <w:b/>
+          <w:color w:val="1A1A1A"/>
+          <w:sz w:val="19"/>
+        </w:rPr>
+        <w:t>Reanimated</w:t>
+      </w:r>
+      <w:r>
+        <w:rPr>
+          <w:rFonts w:ascii="Calibri" w:hAnsi="Calibri"/>
+          <w:b w:val="0"/>
+          <w:color w:val="1A1A1A"/>
+          <w:sz w:val="19"/>
+        </w:rPr>
+        <w:t xml:space="preserve"> / </w:t>
+      </w:r>
+      <w:r>
+        <w:rPr>
+          <w:rFonts w:ascii="Calibri" w:hAnsi="Calibri"/>
+          <w:b/>
+          <w:color w:val="1A1A1A"/>
+          <w:sz w:val="19"/>
+        </w:rPr>
+        <w:t>Moti</w:t>
+      </w:r>
+      <w:r>
+        <w:rPr>
+          <w:rFonts w:ascii="Calibri" w:hAnsi="Calibri"/>
+          <w:b w:val="0"/>
+          <w:color w:val="1A1A1A"/>
+          <w:sz w:val="19"/>
+        </w:rPr>
+        <w:t xml:space="preserve">; froze/deferred inactive tabs, trading later first paint for </w:t>
+      </w:r>
+      <w:r>
+        <w:rPr>
+          <w:rFonts w:ascii="Calibri" w:hAnsi="Calibri"/>
+          <w:b/>
+          <w:color w:val="1A1A1A"/>
+          <w:sz w:val="19"/>
+        </w:rPr>
+        <w:t>60 FPS</w:t>
+      </w:r>
+      <w:r>
+        <w:rPr>
+          <w:rFonts w:ascii="Calibri" w:hAnsi="Calibri"/>
+          <w:b w:val="0"/>
+          <w:color w:val="1A1A1A"/>
+          <w:sz w:val="19"/>
+        </w:rPr>
+        <w:t xml:space="preserve"> (RN Perf Monitor, lab).</w:t>
       </w:r>
     </w:p>
     <w:p>
       <w:pPr>
-        <w:spacing w:before="200" w:after="80"/>
-        <w:pBdr>
-          <w:bottom w:val="single" w:sz="12" w:space="1" w:color="2C2C2C"/>
-        </w:pBdr>
+        <w:pStyle w:val="ListBullet"/>
+        <w:widowControl/>
+        <w:spacing w:before="0" w:after="10" w:line="240" w:lineRule="auto"/>
+        <w:ind w:left="288"/>
       </w:pPr>
       <w:r>
         <w:rPr>
-          <w:rFonts w:ascii="Calibri" w:hAnsi="Calibri" w:eastAsia="Calibri"/>
-          <w:b/>
-          <w:color w:val="2C2C2C"/>
-          <w:sz w:val="22"/>
+          <w:rFonts w:ascii="Calibri" w:hAnsi="Calibri"/>
+          <w:b w:val="0"/>
+          <w:color w:val="1A1A1A"/>
+          <w:sz w:val="19"/>
         </w:rPr>
-        <w:t xml:space="preserve">SKILLS</w:t>
+        <w:t>Routed FCM promo/milestone deep links to the matching screen.</w:t>
       </w:r>
     </w:p>
     <w:p>
       <w:pPr>
-        <w:spacing w:after="20" w:before="0"/>
+        <w:keepNext/>
+        <w:widowControl/>
+        <w:spacing w:before="140" w:after="60"/>
       </w:pPr>
       <w:r>
         <w:rPr>
-          <w:rFonts w:ascii="Calibri" w:hAnsi="Calibri" w:eastAsia="Calibri"/>
+          <w:rFonts w:ascii="Calibri" w:hAnsi="Calibri"/>
+          <w:b/>
+          <w:color w:val="2C2C2C"/>
+          <w:sz w:val="21"/>
+        </w:rPr>
+        <w:t>OTHER WORK</w:t>
+      </w:r>
+    </w:p>
+    <w:p>
+      <w:pPr>
+        <w:widowControl/>
+        <w:spacing w:after="40" w:line="240" w:lineRule="auto"/>
+      </w:pPr>
+      <w:r>
+        <w:rPr>
+          <w:rFonts w:ascii="Calibri" w:hAnsi="Calibri"/>
+          <w:b w:val="0"/>
+          <w:color w:val="1A1A1A"/>
+          <w:sz w:val="19"/>
+        </w:rPr>
+        <w:t>Also shipped React Native student and restaurant loyalty apps, a Flutter elderly-care app, Shopify storefronts, CMS sites, a Skia photobooth, and multiple RBAC admin systems.</w:t>
+      </w:r>
+    </w:p>
+    <w:p>
+      <w:pPr>
+        <w:keepNext/>
+        <w:widowControl/>
+        <w:spacing w:before="140" w:after="60"/>
+      </w:pPr>
+      <w:r>
+        <w:rPr>
+          <w:rFonts w:ascii="Calibri" w:hAnsi="Calibri"/>
+          <w:b/>
+          <w:color w:val="2C2C2C"/>
+          <w:sz w:val="21"/>
+        </w:rPr>
+        <w:t>SKILLS</w:t>
+      </w:r>
+    </w:p>
+    <w:p>
+      <w:pPr>
+        <w:widowControl/>
+        <w:spacing w:after="10" w:line="240" w:lineRule="auto"/>
+      </w:pPr>
+      <w:r>
+        <w:rPr>
+          <w:rFonts w:ascii="Calibri" w:hAnsi="Calibri"/>
           <w:b/>
           <w:color w:val="1A1A1A"/>
-          <w:sz w:val="21"/>
+          <w:sz w:val="19"/>
         </w:rPr>
         <w:t xml:space="preserve">Languages: </w:t>
       </w:r>
       <w:r>
         <w:rPr>
-          <w:rFonts w:ascii="Calibri" w:hAnsi="Calibri" w:eastAsia="Calibri"/>
+          <w:rFonts w:ascii="Calibri" w:hAnsi="Calibri"/>
           <w:b w:val="0"/>
           <w:color w:val="1A1A1A"/>
-          <w:sz w:val="21"/>
+          <w:sz w:val="19"/>
         </w:rPr>
-        <w:t xml:space="preserve">TypeScript, Node.js, SQL</w:t>
+        <w:t>TypeScript, Node.js, SQL</w:t>
       </w:r>
     </w:p>
     <w:p>
       <w:pPr>
-        <w:spacing w:after="20" w:before="0"/>
+        <w:widowControl/>
+        <w:spacing w:after="10" w:line="240" w:lineRule="auto"/>
       </w:pPr>
       <w:r>
         <w:rPr>
-          <w:rFonts w:ascii="Calibri" w:hAnsi="Calibri" w:eastAsia="Calibri"/>
+          <w:rFonts w:ascii="Calibri" w:hAnsi="Calibri"/>
           <w:b/>
           <w:color w:val="1A1A1A"/>
-          <w:sz w:val="21"/>
+          <w:sz w:val="19"/>
         </w:rPr>
         <w:t xml:space="preserve">Frontend: </w:t>
       </w:r>
       <w:r>
         <w:rPr>
-          <w:rFonts w:ascii="Calibri" w:hAnsi="Calibri" w:eastAsia="Calibri"/>
+          <w:rFonts w:ascii="Calibri" w:hAnsi="Calibri"/>
           <w:b w:val="0"/>
           <w:color w:val="1A1A1A"/>
-          <w:sz w:val="21"/>
+          <w:sz w:val="19"/>
         </w:rPr>
-        <w:t xml:space="preserve">React, Next.js, React Native, Expo, TanStack Query, TanStack Form, XState, TanStack Table, Tailwind CSS, shadcn/ui, Chakra UI, Framer Motion, Storybook, Figma, TipTap, D3</w:t>
+        <w:t>React, Next.js, React Native, Expo, HTML/CSS, Tailwind CSS, shadcn/ui, Figma, TipTap</w:t>
       </w:r>
     </w:p>
     <w:p>
       <w:pPr>
-        <w:spacing w:after="20" w:before="0"/>
+        <w:widowControl/>
+        <w:spacing w:after="10" w:line="240" w:lineRule="auto"/>
       </w:pPr>
       <w:r>
         <w:rPr>
-          <w:rFonts w:ascii="Calibri" w:hAnsi="Calibri" w:eastAsia="Calibri"/>
+          <w:rFonts w:ascii="Calibri" w:hAnsi="Calibri"/>
           <w:b/>
           <w:color w:val="1A1A1A"/>
-          <w:sz w:val="21"/>
+          <w:sz w:val="19"/>
+        </w:rPr>
+        <w:t xml:space="preserve">UI behavior: </w:t>
+      </w:r>
+      <w:r>
+        <w:rPr>
+          <w:rFonts w:ascii="Calibri" w:hAnsi="Calibri"/>
+          <w:b w:val="0"/>
+          <w:color w:val="1A1A1A"/>
+          <w:sz w:val="19"/>
+        </w:rPr>
+        <w:t>TanStack Query, TanStack Form, React Hook Form, XState, TanStack Table, next-intl</w:t>
+      </w:r>
+    </w:p>
+    <w:p>
+      <w:pPr>
+        <w:widowControl/>
+        <w:spacing w:after="10" w:line="240" w:lineRule="auto"/>
+      </w:pPr>
+      <w:r>
+        <w:rPr>
+          <w:rFonts w:ascii="Calibri" w:hAnsi="Calibri"/>
+          <w:b/>
+          <w:color w:val="1A1A1A"/>
+          <w:sz w:val="19"/>
+        </w:rPr>
+        <w:t xml:space="preserve">Architecture: </w:t>
+      </w:r>
+      <w:r>
+        <w:rPr>
+          <w:rFonts w:ascii="Calibri" w:hAnsi="Calibri"/>
+          <w:b w:val="0"/>
+          <w:color w:val="1A1A1A"/>
+          <w:sz w:val="19"/>
+        </w:rPr>
+        <w:t>state modeling (URL/server/local), component APIs, routing, SSR/ISR, GraphQL, tRPC, OpenAPI clients, Storybook, Fumadocs</w:t>
+      </w:r>
+    </w:p>
+    <w:p>
+      <w:pPr>
+        <w:widowControl/>
+        <w:spacing w:after="10" w:line="240" w:lineRule="auto"/>
+      </w:pPr>
+      <w:r>
+        <w:rPr>
+          <w:rFonts w:ascii="Calibri" w:hAnsi="Calibri"/>
+          <w:b/>
+          <w:color w:val="1A1A1A"/>
+          <w:sz w:val="19"/>
         </w:rPr>
         <w:t xml:space="preserve">Backend: </w:t>
       </w:r>
       <w:r>
         <w:rPr>
-          <w:rFonts w:ascii="Calibri" w:hAnsi="Calibri" w:eastAsia="Calibri"/>
+          <w:rFonts w:ascii="Calibri" w:hAnsi="Calibri"/>
           <w:b w:val="0"/>
           <w:color w:val="1A1A1A"/>
-          <w:sz w:val="21"/>
+          <w:sz w:val="19"/>
         </w:rPr>
-        <w:t xml:space="preserve">Hono, Drizzle, Prisma, OpenAPI, tRPC, GraphQL, Postgres, DynamoDB, Better Auth</w:t>
+        <w:t>Hono, Drizzle, Prisma, Postgres, DynamoDB, Better Auth</w:t>
       </w:r>
     </w:p>
     <w:p>
       <w:pPr>
-        <w:spacing w:after="20" w:before="0"/>
+        <w:widowControl/>
+        <w:spacing w:after="10" w:line="240" w:lineRule="auto"/>
       </w:pPr>
       <w:r>
         <w:rPr>
-          <w:rFonts w:ascii="Calibri" w:hAnsi="Calibri" w:eastAsia="Calibri"/>
+          <w:rFonts w:ascii="Calibri" w:hAnsi="Calibri"/>
           <w:b/>
           <w:color w:val="1A1A1A"/>
-          <w:sz w:val="21"/>
+          <w:sz w:val="19"/>
         </w:rPr>
-        <w:t xml:space="preserve">Auth &amp; i18n: </w:t>
+        <w:t xml:space="preserve">Auth &amp; security: </w:t>
       </w:r>
       <w:r>
         <w:rPr>
-          <w:rFonts w:ascii="Calibri" w:hAnsi="Calibri" w:eastAsia="Calibri"/>
+          <w:rFonts w:ascii="Calibri" w:hAnsi="Calibri"/>
           <w:b w:val="0"/>
           <w:color w:val="1A1A1A"/>
-          <w:sz w:val="21"/>
+          <w:sz w:val="19"/>
         </w:rPr>
-        <w:t xml:space="preserve">OAuth 2.0 / OIDC, JWT, HttpOnly cookies, CORS, RBAC, next-intl</w:t>
+        <w:t>OAuth 2.0/OIDC, JWT, HttpOnly cookies, CORS, RBAC</w:t>
       </w:r>
     </w:p>
     <w:p>
       <w:pPr>
-        <w:spacing w:after="20" w:before="0"/>
+        <w:widowControl/>
+        <w:spacing w:after="10" w:line="240" w:lineRule="auto"/>
       </w:pPr>
       <w:r>
         <w:rPr>
-          <w:rFonts w:ascii="Calibri" w:hAnsi="Calibri" w:eastAsia="Calibri"/>
+          <w:rFonts w:ascii="Calibri" w:hAnsi="Calibri"/>
           <w:b/>
           <w:color w:val="1A1A1A"/>
-          <w:sz w:val="21"/>
+          <w:sz w:val="19"/>
         </w:rPr>
         <w:t xml:space="preserve">AI: </w:t>
       </w:r>
       <w:r>
         <w:rPr>
-          <w:rFonts w:ascii="Calibri" w:hAnsi="Calibri" w:eastAsia="Calibri"/>
+          <w:rFonts w:ascii="Calibri" w:hAnsi="Calibri"/>
           <w:b w:val="0"/>
           <w:color w:val="1A1A1A"/>
-          <w:sz w:val="21"/>
+          <w:sz w:val="19"/>
         </w:rPr>
-        <w:t xml:space="preserve">Mastra, Vercel AI SDK, Langchain, Pinecone, Strands, AWS Bedrock</w:t>
+        <w:t>Mastra, Vercel AI SDK, LangChain, Pinecone, Strands, AWS Bedrock, evals, ClickHouse tracing</w:t>
       </w:r>
     </w:p>
     <w:p>
       <w:pPr>
-        <w:spacing w:after="20" w:before="0"/>
+        <w:widowControl/>
+        <w:spacing w:after="10" w:line="240" w:lineRule="auto"/>
       </w:pPr>
       <w:r>
         <w:rPr>
-          <w:rFonts w:ascii="Calibri" w:hAnsi="Calibri" w:eastAsia="Calibri"/>
+          <w:rFonts w:ascii="Calibri" w:hAnsi="Calibri"/>
           <w:b/>
           <w:color w:val="1A1A1A"/>
-          <w:sz w:val="21"/>
+          <w:sz w:val="19"/>
         </w:rPr>
-        <w:t xml:space="preserve">Testing &amp; monitoring: </w:t>
+        <w:t xml:space="preserve">Quality: </w:t>
       </w:r>
       <w:r>
         <w:rPr>
-          <w:rFonts w:ascii="Calibri" w:hAnsi="Calibri" w:eastAsia="Calibri"/>
+          <w:rFonts w:ascii="Calibri" w:hAnsi="Calibri"/>
           <w:b w:val="0"/>
           <w:color w:val="1A1A1A"/>
-          <w:sz w:val="21"/>
+          <w:sz w:val="19"/>
         </w:rPr>
-        <w:t xml:space="preserve">Cypress, Vitest, React Testing Library, Lighthouse, axe, Sentry, PostHog</w:t>
+        <w:t>Vitest, Playwright, Cypress, React Testing Library, Lighthouse, axe, Sentry</w:t>
       </w:r>
     </w:p>
     <w:p>
       <w:pPr>
-        <w:spacing w:after="20" w:before="0"/>
+        <w:widowControl/>
+        <w:spacing w:after="10" w:line="240" w:lineRule="auto"/>
       </w:pPr>
       <w:r>
         <w:rPr>
-          <w:rFonts w:ascii="Calibri" w:hAnsi="Calibri" w:eastAsia="Calibri"/>
+          <w:rFonts w:ascii="Calibri" w:hAnsi="Calibri"/>
           <w:b/>
           <w:color w:val="1A1A1A"/>
-          <w:sz w:val="21"/>
+          <w:sz w:val="19"/>
         </w:rPr>
-        <w:t xml:space="preserve">Workflow: </w:t>
+        <w:t xml:space="preserve">Mobile: </w:t>
       </w:r>
       <w:r>
         <w:rPr>
-          <w:rFonts w:ascii="Calibri" w:hAnsi="Calibri" w:eastAsia="Calibri"/>
+          <w:rFonts w:ascii="Calibri" w:hAnsi="Calibri"/>
           <w:b w:val="0"/>
           <w:color w:val="1A1A1A"/>
-          <w:sz w:val="21"/>
+          <w:sz w:val="19"/>
         </w:rPr>
-        <w:t xml:space="preserve">Cursor, Claude Code</w:t>
+        <w:t>FlashList, Reanimated, Moti, Skia, Unistyles, SecureStore/biometrics, FCM</w:t>
       </w:r>
     </w:p>
     <w:p>
       <w:pPr>
-        <w:spacing w:after="20" w:before="0"/>
+        <w:widowControl/>
+        <w:spacing w:after="10" w:line="240" w:lineRule="auto"/>
       </w:pPr>
       <w:r>
         <w:rPr>
-          <w:rFonts w:ascii="Calibri" w:hAnsi="Calibri" w:eastAsia="Calibri"/>
+          <w:rFonts w:ascii="Calibri" w:hAnsi="Calibri"/>
           <w:b/>
           <w:color w:val="1A1A1A"/>
-          <w:sz w:val="21"/>
+          <w:sz w:val="19"/>
         </w:rPr>
-        <w:t xml:space="preserve">DevOps: </w:t>
+        <w:t xml:space="preserve">AWS &amp; DevOps: </w:t>
       </w:r>
       <w:r>
         <w:rPr>
-          <w:rFonts w:ascii="Calibri" w:hAnsi="Calibri" w:eastAsia="Calibri"/>
+          <w:rFonts w:ascii="Calibri" w:hAnsi="Calibri"/>
           <w:b w:val="0"/>
           <w:color w:val="1A1A1A"/>
-          <w:sz w:val="21"/>
+          <w:sz w:val="19"/>
         </w:rPr>
-        <w:t xml:space="preserve">SST, Docker, ECS Fargate, GitHub Actions, AWS, Turborepo</w:t>
+        <w:t>SST, Docker, ECS Fargate, Lambda/API Gateway, CloudFront/CDN, GitHub Actions, AWS, Turborepo</w:t>
       </w:r>
     </w:p>
     <w:p>
       <w:pPr>
-        <w:spacing w:before="200" w:after="80"/>
-        <w:pBdr>
-          <w:bottom w:val="single" w:sz="12" w:space="1" w:color="2C2C2C"/>
-        </w:pBdr>
+        <w:keepNext/>
+        <w:widowControl/>
+        <w:spacing w:before="140" w:after="60"/>
       </w:pPr>
       <w:r>
         <w:rPr>
-          <w:rFonts w:ascii="Calibri" w:hAnsi="Calibri" w:eastAsia="Calibri"/>
+          <w:rFonts w:ascii="Calibri" w:hAnsi="Calibri"/>
           <w:b/>
           <w:color w:val="2C2C2C"/>
-          <w:sz w:val="22"/>
+          <w:sz w:val="21"/>
         </w:rPr>
-        <w:t xml:space="preserve">QUALIFICATIONS</w:t>
+        <w:t>QUALIFICATIONS</w:t>
       </w:r>
     </w:p>
     <w:p>
       <w:pPr>
         <w:pStyle w:val="ListBullet"/>
-        <w:spacing w:after="30" w:before="0"/>
+        <w:widowControl/>
+        <w:spacing w:before="0" w:after="10" w:line="240" w:lineRule="auto"/>
         <w:ind w:left="288"/>
       </w:pPr>
       <w:r>
         <w:rPr>
-          <w:rFonts w:ascii="Calibri" w:hAnsi="Calibri" w:eastAsia="Calibri"/>
+          <w:rFonts w:ascii="Calibri" w:hAnsi="Calibri"/>
           <w:b w:val="0"/>
           <w:color w:val="1A1A1A"/>
-          <w:sz w:val="21"/>
+          <w:sz w:val="19"/>
         </w:rPr>
-        <w:t xml:space="preserve">AWS Solutions Architect Associate, 2026</w:t>
+        <w:t>AWS Certified Solutions Architect – Associate, 2026</w:t>
       </w:r>
     </w:p>
     <w:p>
       <w:pPr>
         <w:pStyle w:val="ListBullet"/>
-        <w:spacing w:after="30" w:before="0"/>
+        <w:widowControl/>
+        <w:spacing w:before="0" w:after="10" w:line="240" w:lineRule="auto"/>
         <w:ind w:left="288"/>
       </w:pPr>
       <w:r>
         <w:rPr>
-          <w:rFonts w:ascii="Calibri" w:hAnsi="Calibri" w:eastAsia="Calibri"/>
+          <w:rFonts w:ascii="Calibri" w:hAnsi="Calibri"/>
           <w:b w:val="0"/>
           <w:color w:val="1A1A1A"/>
-          <w:sz w:val="21"/>
+          <w:sz w:val="19"/>
         </w:rPr>
-        <w:t xml:space="preserve">AWS Cloud Practitioner, 2025</w:t>
+        <w:t>AWS Certified Cloud Practitioner, 2025</w:t>
       </w:r>
     </w:p>
     <w:p>
       <w:pPr>
-        <w:spacing w:before="200" w:after="80"/>
-        <w:pBdr>
-          <w:bottom w:val="single" w:sz="12" w:space="1" w:color="2C2C2C"/>
-        </w:pBdr>
+        <w:keepNext/>
+        <w:widowControl/>
+        <w:spacing w:before="140" w:after="60"/>
       </w:pPr>
       <w:r>
         <w:rPr>
-          <w:rFonts w:ascii="Calibri" w:hAnsi="Calibri" w:eastAsia="Calibri"/>
+          <w:rFonts w:ascii="Calibri" w:hAnsi="Calibri"/>
           <w:b/>
           <w:color w:val="2C2C2C"/>
-          <w:sz w:val="22"/>
+          <w:sz w:val="21"/>
         </w:rPr>
-        <w:t xml:space="preserve">EDUCATION</w:t>
+        <w:t>EDUCATION</w:t>
       </w:r>
     </w:p>
     <w:p>
       <w:pPr>
+        <w:keepNext/>
+        <w:widowControl/>
         <w:tabs>
           <w:tab w:pos="10224" w:val="right"/>
         </w:tabs>
-        <w:spacing w:before="160" w:after="20"/>
+        <w:spacing w:before="100" w:after="20"/>
       </w:pPr>
       <w:r>
         <w:rPr>
-          <w:rFonts w:ascii="Calibri" w:hAnsi="Calibri" w:eastAsia="Calibri"/>
+          <w:rFonts w:ascii="Calibri" w:hAnsi="Calibri"/>
           <w:b/>
           <w:color w:val="1A1A1A"/>
-          <w:sz w:val="22"/>
+          <w:sz w:val="21"/>
         </w:rPr>
-        <w:t xml:space="preserve">University College London</w:t>
+        <w:t>University College London</w:t>
       </w:r>
       <w:r>
         <w:rPr>
-          <w:rFonts w:ascii="Calibri" w:hAnsi="Calibri" w:eastAsia="Calibri"/>
+          <w:rFonts w:ascii="Calibri" w:hAnsi="Calibri"/>
           <w:b w:val="0"/>
           <w:color w:val="4A4A4A"/>
-          <w:sz w:val="20"/>
+          <w:sz w:val="19"/>
         </w:rPr>
         <w:tab/>
-        <w:t xml:space="preserve">2016 – 2020</w:t>
+        <w:t>2016 – 2020</w:t>
       </w:r>
     </w:p>
     <w:p>
       <w:pPr>
         <w:pStyle w:val="ListBullet"/>
-        <w:spacing w:after="30" w:before="0"/>
+        <w:widowControl/>
+        <w:spacing w:before="0" w:after="10" w:line="240" w:lineRule="auto"/>
         <w:ind w:left="288"/>
       </w:pPr>
       <w:r>
         <w:rPr>
-          <w:rFonts w:ascii="Calibri" w:hAnsi="Calibri" w:eastAsia="Calibri"/>
+          <w:rFonts w:ascii="Calibri" w:hAnsi="Calibri"/>
           <w:b w:val="0"/>
           <w:color w:val="1A1A1A"/>
-          <w:sz w:val="21"/>
+          <w:sz w:val="19"/>
         </w:rPr>
-        <w:t xml:space="preserve">MPharm Pharmacy — First Class Honours</w:t>
+        <w:t>Master of Pharmacy (MPharm) — First Class Honours</w:t>
       </w:r>
     </w:p>
     <w:p>
       <w:pPr>
         <w:pStyle w:val="ListBullet"/>
-        <w:spacing w:after="30" w:before="0"/>
+        <w:widowControl/>
+        <w:spacing w:before="0" w:after="10" w:line="240" w:lineRule="auto"/>
         <w:ind w:left="288"/>
       </w:pPr>
       <w:r>
         <w:rPr>
-          <w:rFonts w:ascii="Calibri" w:hAnsi="Calibri" w:eastAsia="Calibri"/>
+          <w:rFonts w:ascii="Calibri" w:hAnsi="Calibri"/>
           <w:b w:val="0"/>
           <w:color w:val="1A1A1A"/>
-          <w:sz w:val="21"/>
+          <w:sz w:val="19"/>
         </w:rPr>
-        <w:t xml:space="preserve">Passion for building things. Career switch from pharmacy to software development.</w:t>
+        <w:t>Transitioned from pharmacy to software development after finding passion in building applications.</w:t>
       </w:r>
     </w:p>
     <w:sectPr>

</xml_diff>

<commit_message>
Update resumes and related documents
- Updated the binary files for the resumes in PDF and DOCX formats to the latest versions.
- Made minor content adjustments in the resume block to enhance clarity and remove redundancy in the mobile section.
- Added a temporary file for the new resume draft to facilitate ongoing edits.
</commit_message>
<xml_diff>
--- a/apps/web/src/features/resume/wilsonchow_resume_v4_full-stack.docx
+++ b/apps/web/src/features/resume/wilsonchow_resume_v4_full-stack.docx
@@ -1444,7 +1444,7 @@
           <w:color w:val="1A1A1A"/>
           <w:sz w:val="19"/>
         </w:rPr>
-        <w:t xml:space="preserve"> / Keychain, gated sessions with biometrics, and generated typed </w:t>
+        <w:t xml:space="preserve"> / Keychain and generated typed </w:t>
       </w:r>
       <w:r>
         <w:rPr>
@@ -1884,7 +1884,7 @@
           <w:color w:val="1A1A1A"/>
           <w:sz w:val="19"/>
         </w:rPr>
-        <w:t>FlashList, Reanimated, Moti, Skia, Unistyles, SecureStore/biometrics, FCM</w:t>
+        <w:t>FlashList, Reanimated, Moti, Skia, Unistyles, SecureStore, FCM</w:t>
       </w:r>
     </w:p>
     <w:p>

</xml_diff>

<commit_message>
Update resume content and enhance clarity in documentation
- Updated the resume document to the latest version, reflecting recent changes and improvements.
- Revised content in the resume block for better clarity, including updates to project descriptions and technology references.
- Enhanced the structure of the Healthcare AI Agent section to provide clearer insights into functionalities and technologies used.
</commit_message>
<xml_diff>
--- a/apps/web/src/features/resume/wilsonchow_resume_v4_full-stack.docx
+++ b/apps/web/src/features/resume/wilsonchow_resume_v4_full-stack.docx
@@ -1,6 +1,6 @@
 
 <file path=word/document.xml><?xml version="1.0" encoding="utf-8"?>
-<w:document xmlns:wpc="http://schemas.microsoft.com/office/word/2010/wordprocessingCanvas" xmlns:mo="http://schemas.microsoft.com/office/mac/office/2008/main" xmlns:mc="http://schemas.openxmlformats.org/markup-compatibility/2006" xmlns:mv="urn:schemas-microsoft-com:mac:vml" xmlns:o="urn:schemas-microsoft-com:office:office" xmlns:r="http://schemas.openxmlformats.org/officeDocument/2006/relationships" xmlns:m="http://schemas.openxmlformats.org/officeDocument/2006/math" xmlns:v="urn:schemas-microsoft-com:vml" xmlns:wp14="http://schemas.microsoft.com/office/word/2010/wordprocessingDrawing" xmlns:wp="http://schemas.openxmlformats.org/drawingml/2006/wordprocessingDrawing" xmlns:w10="urn:schemas-microsoft-com:office:word" xmlns:w="http://schemas.openxmlformats.org/wordprocessingml/2006/main" xmlns:w14="http://schemas.microsoft.com/office/word/2010/wordml" xmlns:wpg="http://schemas.microsoft.com/office/word/2010/wordprocessingGroup" xmlns:wpi="http://schemas.microsoft.com/office/word/2010/wordprocessingInk" xmlns:wne="http://schemas.microsoft.com/office/word/2006/wordml" xmlns:wps="http://schemas.microsoft.com/office/word/2010/wordprocessingShape" mc:Ignorable="w14 wp14">
+<w:document xmlns:mc="http://schemas.openxmlformats.org/markup-compatibility/2006" xmlns:w="http://schemas.openxmlformats.org/wordprocessingml/2006/main" mc:Ignorable="w14 wp14">
   <w:body>
     <w:p>
       <w:pPr>
@@ -819,7 +819,7 @@
           <w:color w:val="4A4A4A"/>
           <w:sz w:val="18"/>
         </w:rPr>
-        <w:t>Durable agent platform across web and Discord.</w:t>
+        <w:t>Durable agent that empowers internal tools and workflows.</w:t>
       </w:r>
     </w:p>
     <w:p>
@@ -836,7 +836,7 @@
           <w:color w:val="1A1A1A"/>
           <w:sz w:val="19"/>
         </w:rPr>
-        <w:t>Made agent runs durable streams so clients could disconnect, reconnect, and resume without losing progress.</w:t>
+        <w:t>Built agent runs durable streams so clients could disconnect, reconnect, and resume without losing progress.</w:t>
       </w:r>
     </w:p>
     <w:p>
@@ -853,7 +853,7 @@
           <w:color w:val="1A1A1A"/>
           <w:sz w:val="19"/>
         </w:rPr>
-        <w:t>Built Mastra / AI SDK workflows, memory, schedules, tools, pause/resume, retries, sandboxing, and skills.</w:t>
+        <w:t>Built Mastra workflows, memory, schedules, tools, pause/resume, retries, sandboxing, and skills.</w:t>
       </w:r>
     </w:p>
     <w:p>
@@ -905,7 +905,7 @@
           <w:color w:val="1A1A1A"/>
           <w:sz w:val="19"/>
         </w:rPr>
-        <w:t>, with Postgres, S3, and non-blocking ClickHouse traces for cost/latency.</w:t>
+        <w:t>, with Postgres, S3, and Mastra Platform for observability.</w:t>
       </w:r>
     </w:p>
     <w:p>
@@ -922,7 +922,7 @@
           <w:color w:val="1A1A1A"/>
           <w:sz w:val="19"/>
         </w:rPr>
-        <w:t>Shipped chat, tool-invocation, multi-step flows, and TipTap @mentions for attaching workspace files.</w:t>
+        <w:t>Shipped chat, tool-invocation UIs, a custom TipTap @mentions input component for attaching workspace files.</w:t>
       </w:r>
     </w:p>
     <w:p>
@@ -966,7 +966,7 @@
           <w:color w:val="4A4A4A"/>
           <w:sz w:val="18"/>
         </w:rPr>
-        <w:t>Healthcare and shopping assistant grounded in uploaded documents and product data.</w:t>
+        <w:t>Healthcare and shopping assistant grounded in uploaded documents and Shopify store product data.</w:t>
       </w:r>
     </w:p>
     <w:p>
@@ -983,7 +983,7 @@
           <w:color w:val="1A1A1A"/>
           <w:sz w:val="19"/>
         </w:rPr>
-        <w:t>Owned document upload, questionnaires, product/cart actions, and admin flows; Better Auth, HttpOnly cookies, and RBAC separated client/admin roles.</w:t>
+        <w:t>Questionnaires/health report -&gt; structured insights -&gt; personalized product recommendations -&gt; add to product cart.</w:t>
       </w:r>
     </w:p>
     <w:p>
@@ -1000,43 +1000,7 @@
           <w:color w:val="1A1A1A"/>
           <w:sz w:val="19"/>
         </w:rPr>
-        <w:t xml:space="preserve">Split admin list state: URL-owned filters/pagination, </w:t>
-      </w:r>
-      <w:r>
-        <w:rPr>
-          <w:rFonts w:ascii="Calibri" w:hAnsi="Calibri"/>
-          <w:b/>
-          <w:color w:val="1A1A1A"/>
-          <w:sz w:val="19"/>
-        </w:rPr>
-        <w:t>TanStack Query</w:t>
-      </w:r>
-      <w:r>
-        <w:rPr>
-          <w:rFonts w:ascii="Calibri" w:hAnsi="Calibri"/>
-          <w:b w:val="0"/>
-          <w:color w:val="1A1A1A"/>
-          <w:sz w:val="19"/>
-        </w:rPr>
-        <w:t xml:space="preserve"> server cache, and </w:t>
-      </w:r>
-      <w:r>
-        <w:rPr>
-          <w:rFonts w:ascii="Calibri" w:hAnsi="Calibri"/>
-          <w:b/>
-          <w:color w:val="1A1A1A"/>
-          <w:sz w:val="19"/>
-        </w:rPr>
-        <w:t>TanStack Table</w:t>
-      </w:r>
-      <w:r>
-        <w:rPr>
-          <w:rFonts w:ascii="Calibri" w:hAnsi="Calibri"/>
-          <w:b w:val="0"/>
-          <w:color w:val="1A1A1A"/>
-          <w:sz w:val="19"/>
-        </w:rPr>
-        <w:t xml:space="preserve"> presentation.</w:t>
+        <w:t>Owned document upload, questionnaires, product/cart actions, and admin flows.</w:t>
       </w:r>
     </w:p>
     <w:p>
@@ -1053,7 +1017,132 @@
           <w:color w:val="1A1A1A"/>
           <w:sz w:val="19"/>
         </w:rPr>
-        <w:t>Built document ingestion and scoped RAG so recommendations stayed grounded in the uploaded report.</w:t>
+        <w:t xml:space="preserve">Built backend with </w:t>
+      </w:r>
+      <w:r>
+        <w:rPr>
+          <w:rFonts w:ascii="Calibri" w:hAnsi="Calibri"/>
+          <w:b/>
+          <w:color w:val="1A1A1A"/>
+          <w:sz w:val="19"/>
+        </w:rPr>
+        <w:t>Hono</w:t>
+      </w:r>
+      <w:r>
+        <w:rPr>
+          <w:rFonts w:ascii="Calibri" w:hAnsi="Calibri"/>
+          <w:b w:val="0"/>
+          <w:color w:val="1A1A1A"/>
+          <w:sz w:val="19"/>
+        </w:rPr>
+        <w:t xml:space="preserve">, </w:t>
+      </w:r>
+      <w:r>
+        <w:rPr>
+          <w:rFonts w:ascii="Calibri" w:hAnsi="Calibri"/>
+          <w:b/>
+          <w:color w:val="1A1A1A"/>
+          <w:sz w:val="19"/>
+        </w:rPr>
+        <w:t>LangChain</w:t>
+      </w:r>
+      <w:r>
+        <w:rPr>
+          <w:rFonts w:ascii="Calibri" w:hAnsi="Calibri"/>
+          <w:b w:val="0"/>
+          <w:color w:val="1A1A1A"/>
+          <w:sz w:val="19"/>
+        </w:rPr>
+        <w:t xml:space="preserve">, </w:t>
+      </w:r>
+      <w:r>
+        <w:rPr>
+          <w:rFonts w:ascii="Calibri" w:hAnsi="Calibri"/>
+          <w:b/>
+          <w:color w:val="1A1A1A"/>
+          <w:sz w:val="19"/>
+        </w:rPr>
+        <w:t>Qdrant</w:t>
+      </w:r>
+      <w:r>
+        <w:rPr>
+          <w:rFonts w:ascii="Calibri" w:hAnsi="Calibri"/>
+          <w:b w:val="0"/>
+          <w:color w:val="1A1A1A"/>
+          <w:sz w:val="19"/>
+        </w:rPr>
+        <w:t xml:space="preserve">, </w:t>
+      </w:r>
+      <w:r>
+        <w:rPr>
+          <w:rFonts w:ascii="Calibri" w:hAnsi="Calibri"/>
+          <w:b/>
+          <w:color w:val="1A1A1A"/>
+          <w:sz w:val="19"/>
+        </w:rPr>
+        <w:t>Better Auth</w:t>
+      </w:r>
+      <w:r>
+        <w:rPr>
+          <w:rFonts w:ascii="Calibri" w:hAnsi="Calibri"/>
+          <w:b w:val="0"/>
+          <w:color w:val="1A1A1A"/>
+          <w:sz w:val="19"/>
+        </w:rPr>
+        <w:t xml:space="preserve">; Frontend with </w:t>
+      </w:r>
+      <w:r>
+        <w:rPr>
+          <w:rFonts w:ascii="Calibri" w:hAnsi="Calibri"/>
+          <w:b/>
+          <w:color w:val="1A1A1A"/>
+          <w:sz w:val="19"/>
+        </w:rPr>
+        <w:t>Next.js</w:t>
+      </w:r>
+      <w:r>
+        <w:rPr>
+          <w:rFonts w:ascii="Calibri" w:hAnsi="Calibri"/>
+          <w:b w:val="0"/>
+          <w:color w:val="1A1A1A"/>
+          <w:sz w:val="19"/>
+        </w:rPr>
+        <w:t xml:space="preserve">, </w:t>
+      </w:r>
+      <w:r>
+        <w:rPr>
+          <w:rFonts w:ascii="Calibri" w:hAnsi="Calibri"/>
+          <w:b/>
+          <w:color w:val="1A1A1A"/>
+          <w:sz w:val="19"/>
+        </w:rPr>
+        <w:t>AI SDK</w:t>
+      </w:r>
+      <w:r>
+        <w:rPr>
+          <w:rFonts w:ascii="Calibri" w:hAnsi="Calibri"/>
+          <w:b w:val="0"/>
+          <w:color w:val="1A1A1A"/>
+          <w:sz w:val="19"/>
+        </w:rPr>
+        <w:t>.</w:t>
+      </w:r>
+    </w:p>
+    <w:p>
+      <w:pPr>
+        <w:pStyle w:val="ListBullet"/>
+        <w:widowControl/>
+        <w:spacing w:before="0" w:after="10" w:line="240" w:lineRule="auto"/>
+        <w:ind w:left="288"/>
+      </w:pPr>
+      <w:r>
+        <w:rPr>
+          <w:rFonts w:ascii="Calibri" w:hAnsi="Calibri"/>
+          <w:b w:val="0"/>
+          <w:color w:val="1A1A1A"/>
+          <w:sz w:val="19"/>
+        </w:rPr>
+        <w:t>Deployed on AWS with IaC for scalable, production-ready infrastructure.</w:t>
       </w:r>
     </w:p>
     <w:p>
@@ -1141,7 +1230,7 @@
           <w:color w:val="1A1A1A"/>
           <w:sz w:val="19"/>
         </w:rPr>
-        <w:t>LCP &amp;lt; 0.5s</w:t>
+        <w:t>LCP &lt; 0.5s</w:t>
       </w:r>
       <w:r>
         <w:rPr>
@@ -1159,7 +1248,7 @@
           <w:color w:val="1A1A1A"/>
           <w:sz w:val="19"/>
         </w:rPr>
-        <w:t>CLS &amp;lt; 0.1</w:t>
+        <w:t>CLS &lt; 0.1</w:t>
       </w:r>
       <w:r>
         <w:rPr>

</xml_diff>

<commit_message>
Update resume files to latest versions
- Replaced existing PDF and DOCX resume files with the most recent updates.
- Ensured all resume formats are aligned with the latest content revisions for consistency and clarity.
</commit_message>
<xml_diff>
--- a/apps/web/src/features/resume/wilsonchow_resume_v4_full-stack.docx
+++ b/apps/web/src/features/resume/wilsonchow_resume_v4_full-stack.docx
@@ -4,13 +4,14 @@
   <w:body>
     <w:p>
       <w:pPr>
-        <w:widowControl/>
-        <w:spacing w:after="40"/>
+        <w:keepNext w:val="0"/>
+        <w:pageBreakBefore w:val="0"/>
+        <w:spacing w:before="0" w:after="40" w:line="240" w:lineRule="auto"/>
         <w:jc w:val="center"/>
       </w:pPr>
       <w:r>
         <w:rPr>
-          <w:rFonts w:ascii="Calibri" w:hAnsi="Calibri"/>
+          <w:rFonts w:ascii="Calibri" w:hAnsi="Calibri" w:eastAsia="Calibri"/>
           <w:b/>
           <w:color w:val="1A1A1A"/>
           <w:sz w:val="44"/>
@@ -20,13 +21,14 @@
     </w:p>
     <w:p>
       <w:pPr>
-        <w:widowControl/>
-        <w:spacing w:after="40"/>
+        <w:keepNext w:val="0"/>
+        <w:pageBreakBefore w:val="0"/>
+        <w:spacing w:before="0" w:after="40" w:line="240" w:lineRule="auto"/>
         <w:jc w:val="center"/>
       </w:pPr>
       <w:r>
         <w:rPr>
-          <w:rFonts w:ascii="Calibri" w:hAnsi="Calibri"/>
+          <w:rFonts w:ascii="Calibri" w:hAnsi="Calibri" w:eastAsia="Calibri"/>
           <w:b w:val="0"/>
           <w:color w:val="4A4A4A"/>
           <w:sz w:val="18"/>
@@ -36,13 +38,14 @@
     </w:p>
     <w:p>
       <w:pPr>
-        <w:widowControl/>
-        <w:spacing w:after="40"/>
+        <w:keepNext w:val="0"/>
+        <w:pageBreakBefore w:val="0"/>
+        <w:spacing w:before="0" w:after="40" w:line="240" w:lineRule="auto"/>
         <w:jc w:val="center"/>
       </w:pPr>
       <w:r>
         <w:rPr>
-          <w:rFonts w:ascii="Calibri" w:hAnsi="Calibri"/>
+          <w:rFonts w:ascii="Calibri" w:hAnsi="Calibri" w:eastAsia="Calibri"/>
           <w:b/>
           <w:color w:val="2C2C2C"/>
           <w:sz w:val="19"/>
@@ -53,12 +56,12 @@
     <w:p>
       <w:pPr>
         <w:keepNext/>
-        <w:widowControl/>
-        <w:spacing w:before="140" w:after="60"/>
+        <w:pageBreakBefore w:val="0"/>
+        <w:spacing w:before="140" w:after="60" w:line="240" w:lineRule="auto"/>
       </w:pPr>
       <w:r>
         <w:rPr>
-          <w:rFonts w:ascii="Calibri" w:hAnsi="Calibri"/>
+          <w:rFonts w:ascii="Calibri" w:hAnsi="Calibri" w:eastAsia="Calibri"/>
           <w:b/>
           <w:color w:val="2C2C2C"/>
           <w:sz w:val="21"/>
@@ -68,12 +71,13 @@
     </w:p>
     <w:p>
       <w:pPr>
-        <w:widowControl/>
-        <w:spacing w:after="40" w:line="240" w:lineRule="auto"/>
+        <w:keepNext w:val="0"/>
+        <w:pageBreakBefore w:val="0"/>
+        <w:spacing w:before="0" w:after="40" w:line="240" w:lineRule="auto"/>
       </w:pPr>
       <w:r>
         <w:rPr>
-          <w:rFonts w:ascii="Calibri" w:hAnsi="Calibri"/>
+          <w:rFonts w:ascii="Calibri" w:hAnsi="Calibri" w:eastAsia="Calibri"/>
           <w:b w:val="0"/>
           <w:color w:val="1A1A1A"/>
           <w:sz w:val="19"/>
@@ -82,7 +86,7 @@
       </w:r>
       <w:r>
         <w:rPr>
-          <w:rFonts w:ascii="Calibri" w:hAnsi="Calibri"/>
+          <w:rFonts w:ascii="Calibri" w:hAnsi="Calibri" w:eastAsia="Calibri"/>
           <w:b/>
           <w:color w:val="1A1A1A"/>
           <w:sz w:val="19"/>
@@ -91,7 +95,7 @@
       </w:r>
       <w:r>
         <w:rPr>
-          <w:rFonts w:ascii="Calibri" w:hAnsi="Calibri"/>
+          <w:rFonts w:ascii="Calibri" w:hAnsi="Calibri" w:eastAsia="Calibri"/>
           <w:b w:val="0"/>
           <w:color w:val="1A1A1A"/>
           <w:sz w:val="19"/>
@@ -100,7 +104,7 @@
       </w:r>
       <w:r>
         <w:rPr>
-          <w:rFonts w:ascii="Calibri" w:hAnsi="Calibri"/>
+          <w:rFonts w:ascii="Calibri" w:hAnsi="Calibri" w:eastAsia="Calibri"/>
           <w:b/>
           <w:color w:val="1A1A1A"/>
           <w:sz w:val="19"/>
@@ -109,7 +113,7 @@
       </w:r>
       <w:r>
         <w:rPr>
-          <w:rFonts w:ascii="Calibri" w:hAnsi="Calibri"/>
+          <w:rFonts w:ascii="Calibri" w:hAnsi="Calibri" w:eastAsia="Calibri"/>
           <w:b w:val="0"/>
           <w:color w:val="1A1A1A"/>
           <w:sz w:val="19"/>
@@ -118,7 +122,7 @@
       </w:r>
       <w:r>
         <w:rPr>
-          <w:rFonts w:ascii="Calibri" w:hAnsi="Calibri"/>
+          <w:rFonts w:ascii="Calibri" w:hAnsi="Calibri" w:eastAsia="Calibri"/>
           <w:b/>
           <w:color w:val="1A1A1A"/>
           <w:sz w:val="19"/>
@@ -127,7 +131,7 @@
       </w:r>
       <w:r>
         <w:rPr>
-          <w:rFonts w:ascii="Calibri" w:hAnsi="Calibri"/>
+          <w:rFonts w:ascii="Calibri" w:hAnsi="Calibri" w:eastAsia="Calibri"/>
           <w:b w:val="0"/>
           <w:color w:val="1A1A1A"/>
           <w:sz w:val="19"/>
@@ -136,7 +140,7 @@
       </w:r>
       <w:r>
         <w:rPr>
-          <w:rFonts w:ascii="Calibri" w:hAnsi="Calibri"/>
+          <w:rFonts w:ascii="Calibri" w:hAnsi="Calibri" w:eastAsia="Calibri"/>
           <w:b/>
           <w:color w:val="1A1A1A"/>
           <w:sz w:val="19"/>
@@ -145,7 +149,7 @@
       </w:r>
       <w:r>
         <w:rPr>
-          <w:rFonts w:ascii="Calibri" w:hAnsi="Calibri"/>
+          <w:rFonts w:ascii="Calibri" w:hAnsi="Calibri" w:eastAsia="Calibri"/>
           <w:b w:val="0"/>
           <w:color w:val="1A1A1A"/>
           <w:sz w:val="19"/>
@@ -154,7 +158,7 @@
       </w:r>
       <w:r>
         <w:rPr>
-          <w:rFonts w:ascii="Calibri" w:hAnsi="Calibri"/>
+          <w:rFonts w:ascii="Calibri" w:hAnsi="Calibri" w:eastAsia="Calibri"/>
           <w:b/>
           <w:color w:val="1A1A1A"/>
           <w:sz w:val="19"/>
@@ -163,7 +167,7 @@
       </w:r>
       <w:r>
         <w:rPr>
-          <w:rFonts w:ascii="Calibri" w:hAnsi="Calibri"/>
+          <w:rFonts w:ascii="Calibri" w:hAnsi="Calibri" w:eastAsia="Calibri"/>
           <w:b w:val="0"/>
           <w:color w:val="1A1A1A"/>
           <w:sz w:val="19"/>
@@ -172,7 +176,7 @@
       </w:r>
       <w:r>
         <w:rPr>
-          <w:rFonts w:ascii="Calibri" w:hAnsi="Calibri"/>
+          <w:rFonts w:ascii="Calibri" w:hAnsi="Calibri" w:eastAsia="Calibri"/>
           <w:b/>
           <w:color w:val="1A1A1A"/>
           <w:sz w:val="19"/>
@@ -181,7 +185,7 @@
       </w:r>
       <w:r>
         <w:rPr>
-          <w:rFonts w:ascii="Calibri" w:hAnsi="Calibri"/>
+          <w:rFonts w:ascii="Calibri" w:hAnsi="Calibri" w:eastAsia="Calibri"/>
           <w:b w:val="0"/>
           <w:color w:val="1A1A1A"/>
           <w:sz w:val="19"/>
@@ -190,7 +194,7 @@
       </w:r>
       <w:r>
         <w:rPr>
-          <w:rFonts w:ascii="Calibri" w:hAnsi="Calibri"/>
+          <w:rFonts w:ascii="Calibri" w:hAnsi="Calibri" w:eastAsia="Calibri"/>
           <w:b/>
           <w:color w:val="1A1A1A"/>
           <w:sz w:val="19"/>
@@ -199,7 +203,7 @@
       </w:r>
       <w:r>
         <w:rPr>
-          <w:rFonts w:ascii="Calibri" w:hAnsi="Calibri"/>
+          <w:rFonts w:ascii="Calibri" w:hAnsi="Calibri" w:eastAsia="Calibri"/>
           <w:b w:val="0"/>
           <w:color w:val="1A1A1A"/>
           <w:sz w:val="19"/>
@@ -210,12 +214,12 @@
     <w:p>
       <w:pPr>
         <w:keepNext/>
-        <w:widowControl/>
-        <w:spacing w:before="140" w:after="60"/>
+        <w:pageBreakBefore w:val="0"/>
+        <w:spacing w:before="140" w:after="60" w:line="240" w:lineRule="auto"/>
       </w:pPr>
       <w:r>
         <w:rPr>
-          <w:rFonts w:ascii="Calibri" w:hAnsi="Calibri"/>
+          <w:rFonts w:ascii="Calibri" w:hAnsi="Calibri" w:eastAsia="Calibri"/>
           <w:b/>
           <w:color w:val="2C2C2C"/>
           <w:sz w:val="21"/>
@@ -226,15 +230,15 @@
     <w:p>
       <w:pPr>
         <w:keepNext/>
-        <w:widowControl/>
+        <w:pageBreakBefore w:val="0"/>
         <w:tabs>
           <w:tab w:pos="10224" w:val="right"/>
         </w:tabs>
-        <w:spacing w:before="100" w:after="20"/>
+        <w:spacing w:before="100" w:after="20" w:line="240" w:lineRule="auto"/>
       </w:pPr>
       <w:r>
         <w:rPr>
-          <w:rFonts w:ascii="Calibri" w:hAnsi="Calibri"/>
+          <w:rFonts w:ascii="Calibri" w:hAnsi="Calibri" w:eastAsia="Calibri"/>
           <w:b/>
           <w:color w:val="1A1A1A"/>
           <w:sz w:val="21"/>
@@ -243,7 +247,7 @@
       </w:r>
       <w:r>
         <w:rPr>
-          <w:rFonts w:ascii="Calibri" w:hAnsi="Calibri"/>
+          <w:rFonts w:ascii="Calibri" w:hAnsi="Calibri" w:eastAsia="Calibri"/>
           <w:b w:val="0"/>
           <w:color w:val="4A4A4A"/>
           <w:sz w:val="19"/>
@@ -254,12 +258,13 @@
     </w:p>
     <w:p>
       <w:pPr>
-        <w:widowControl/>
-        <w:spacing w:after="40" w:line="240" w:lineRule="auto"/>
+        <w:keepNext w:val="0"/>
+        <w:pageBreakBefore w:val="0"/>
+        <w:spacing w:before="0" w:after="20" w:line="240" w:lineRule="auto"/>
       </w:pPr>
       <w:r>
         <w:rPr>
-          <w:rFonts w:ascii="Calibri" w:hAnsi="Calibri"/>
+          <w:rFonts w:ascii="Calibri" w:hAnsi="Calibri" w:eastAsia="Calibri"/>
           <w:b w:val="0"/>
           <w:color w:val="4A4A4A"/>
           <w:sz w:val="18"/>
@@ -270,13 +275,14 @@
     <w:p>
       <w:pPr>
         <w:pStyle w:val="ListBullet"/>
-        <w:widowControl/>
+        <w:keepNext w:val="0"/>
+        <w:pageBreakBefore w:val="0"/>
         <w:spacing w:before="0" w:after="10" w:line="240" w:lineRule="auto"/>
         <w:ind w:left="288"/>
       </w:pPr>
       <w:r>
         <w:rPr>
-          <w:rFonts w:ascii="Calibri" w:hAnsi="Calibri"/>
+          <w:rFonts w:ascii="Calibri" w:hAnsi="Calibri" w:eastAsia="Calibri"/>
           <w:b w:val="0"/>
           <w:color w:val="1A1A1A"/>
           <w:sz w:val="19"/>
@@ -285,7 +291,7 @@
       </w:r>
       <w:r>
         <w:rPr>
-          <w:rFonts w:ascii="Calibri" w:hAnsi="Calibri"/>
+          <w:rFonts w:ascii="Calibri" w:hAnsi="Calibri" w:eastAsia="Calibri"/>
           <w:b/>
           <w:color w:val="1A1A1A"/>
           <w:sz w:val="19"/>
@@ -294,7 +300,7 @@
       </w:r>
       <w:r>
         <w:rPr>
-          <w:rFonts w:ascii="Calibri" w:hAnsi="Calibri"/>
+          <w:rFonts w:ascii="Calibri" w:hAnsi="Calibri" w:eastAsia="Calibri"/>
           <w:b w:val="0"/>
           <w:color w:val="1A1A1A"/>
           <w:sz w:val="19"/>
@@ -305,13 +311,14 @@
     <w:p>
       <w:pPr>
         <w:pStyle w:val="ListBullet"/>
-        <w:widowControl/>
+        <w:keepNext w:val="0"/>
+        <w:pageBreakBefore w:val="0"/>
         <w:spacing w:before="0" w:after="10" w:line="240" w:lineRule="auto"/>
         <w:ind w:left="288"/>
       </w:pPr>
       <w:r>
         <w:rPr>
-          <w:rFonts w:ascii="Calibri" w:hAnsi="Calibri"/>
+          <w:rFonts w:ascii="Calibri" w:hAnsi="Calibri" w:eastAsia="Calibri"/>
           <w:b w:val="0"/>
           <w:color w:val="1A1A1A"/>
           <w:sz w:val="19"/>
@@ -320,7 +327,7 @@
       </w:r>
       <w:r>
         <w:rPr>
-          <w:rFonts w:ascii="Calibri" w:hAnsi="Calibri"/>
+          <w:rFonts w:ascii="Calibri" w:hAnsi="Calibri" w:eastAsia="Calibri"/>
           <w:b/>
           <w:color w:val="1A1A1A"/>
           <w:sz w:val="19"/>
@@ -329,7 +336,7 @@
       </w:r>
       <w:r>
         <w:rPr>
-          <w:rFonts w:ascii="Calibri" w:hAnsi="Calibri"/>
+          <w:rFonts w:ascii="Calibri" w:hAnsi="Calibri" w:eastAsia="Calibri"/>
           <w:b w:val="0"/>
           <w:color w:val="1A1A1A"/>
           <w:sz w:val="19"/>
@@ -338,7 +345,7 @@
       </w:r>
       <w:r>
         <w:rPr>
-          <w:rFonts w:ascii="Calibri" w:hAnsi="Calibri"/>
+          <w:rFonts w:ascii="Calibri" w:hAnsi="Calibri" w:eastAsia="Calibri"/>
           <w:b/>
           <w:color w:val="1A1A1A"/>
           <w:sz w:val="19"/>
@@ -347,7 +354,7 @@
       </w:r>
       <w:r>
         <w:rPr>
-          <w:rFonts w:ascii="Calibri" w:hAnsi="Calibri"/>
+          <w:rFonts w:ascii="Calibri" w:hAnsi="Calibri" w:eastAsia="Calibri"/>
           <w:b w:val="0"/>
           <w:color w:val="1A1A1A"/>
           <w:sz w:val="19"/>
@@ -356,7 +363,7 @@
       </w:r>
       <w:r>
         <w:rPr>
-          <w:rFonts w:ascii="Calibri" w:hAnsi="Calibri"/>
+          <w:rFonts w:ascii="Calibri" w:hAnsi="Calibri" w:eastAsia="Calibri"/>
           <w:b/>
           <w:color w:val="1A1A1A"/>
           <w:sz w:val="19"/>
@@ -365,7 +372,7 @@
       </w:r>
       <w:r>
         <w:rPr>
-          <w:rFonts w:ascii="Calibri" w:hAnsi="Calibri"/>
+          <w:rFonts w:ascii="Calibri" w:hAnsi="Calibri" w:eastAsia="Calibri"/>
           <w:b w:val="0"/>
           <w:color w:val="1A1A1A"/>
           <w:sz w:val="19"/>
@@ -374,7 +381,7 @@
       </w:r>
       <w:r>
         <w:rPr>
-          <w:rFonts w:ascii="Calibri" w:hAnsi="Calibri"/>
+          <w:rFonts w:ascii="Calibri" w:hAnsi="Calibri" w:eastAsia="Calibri"/>
           <w:b/>
           <w:color w:val="1A1A1A"/>
           <w:sz w:val="19"/>
@@ -383,7 +390,7 @@
       </w:r>
       <w:r>
         <w:rPr>
-          <w:rFonts w:ascii="Calibri" w:hAnsi="Calibri"/>
+          <w:rFonts w:ascii="Calibri" w:hAnsi="Calibri" w:eastAsia="Calibri"/>
           <w:b w:val="0"/>
           <w:color w:val="1A1A1A"/>
           <w:sz w:val="19"/>
@@ -392,7 +399,7 @@
       </w:r>
       <w:r>
         <w:rPr>
-          <w:rFonts w:ascii="Calibri" w:hAnsi="Calibri"/>
+          <w:rFonts w:ascii="Calibri" w:hAnsi="Calibri" w:eastAsia="Calibri"/>
           <w:b/>
           <w:color w:val="1A1A1A"/>
           <w:sz w:val="19"/>
@@ -401,7 +408,7 @@
       </w:r>
       <w:r>
         <w:rPr>
-          <w:rFonts w:ascii="Calibri" w:hAnsi="Calibri"/>
+          <w:rFonts w:ascii="Calibri" w:hAnsi="Calibri" w:eastAsia="Calibri"/>
           <w:b w:val="0"/>
           <w:color w:val="1A1A1A"/>
           <w:sz w:val="19"/>
@@ -412,13 +419,14 @@
     <w:p>
       <w:pPr>
         <w:pStyle w:val="ListBullet"/>
-        <w:widowControl/>
+        <w:keepNext w:val="0"/>
+        <w:pageBreakBefore w:val="0"/>
         <w:spacing w:before="0" w:after="10" w:line="240" w:lineRule="auto"/>
         <w:ind w:left="288"/>
       </w:pPr>
       <w:r>
         <w:rPr>
-          <w:rFonts w:ascii="Calibri" w:hAnsi="Calibri"/>
+          <w:rFonts w:ascii="Calibri" w:hAnsi="Calibri" w:eastAsia="Calibri"/>
           <w:b w:val="0"/>
           <w:color w:val="1A1A1A"/>
           <w:sz w:val="19"/>
@@ -427,7 +435,7 @@
       </w:r>
       <w:r>
         <w:rPr>
-          <w:rFonts w:ascii="Calibri" w:hAnsi="Calibri"/>
+          <w:rFonts w:ascii="Calibri" w:hAnsi="Calibri" w:eastAsia="Calibri"/>
           <w:b/>
           <w:color w:val="1A1A1A"/>
           <w:sz w:val="19"/>
@@ -436,7 +444,7 @@
       </w:r>
       <w:r>
         <w:rPr>
-          <w:rFonts w:ascii="Calibri" w:hAnsi="Calibri"/>
+          <w:rFonts w:ascii="Calibri" w:hAnsi="Calibri" w:eastAsia="Calibri"/>
           <w:b w:val="0"/>
           <w:color w:val="1A1A1A"/>
           <w:sz w:val="19"/>
@@ -447,13 +455,14 @@
     <w:p>
       <w:pPr>
         <w:pStyle w:val="ListBullet"/>
-        <w:widowControl/>
+        <w:keepNext w:val="0"/>
+        <w:pageBreakBefore w:val="0"/>
         <w:spacing w:before="0" w:after="10" w:line="240" w:lineRule="auto"/>
         <w:ind w:left="288"/>
       </w:pPr>
       <w:r>
         <w:rPr>
-          <w:rFonts w:ascii="Calibri" w:hAnsi="Calibri"/>
+          <w:rFonts w:ascii="Calibri" w:hAnsi="Calibri" w:eastAsia="Calibri"/>
           <w:b w:val="0"/>
           <w:color w:val="1A1A1A"/>
           <w:sz w:val="19"/>
@@ -462,7 +471,7 @@
       </w:r>
       <w:r>
         <w:rPr>
-          <w:rFonts w:ascii="Calibri" w:hAnsi="Calibri"/>
+          <w:rFonts w:ascii="Calibri" w:hAnsi="Calibri" w:eastAsia="Calibri"/>
           <w:b/>
           <w:color w:val="1A1A1A"/>
           <w:sz w:val="19"/>
@@ -471,7 +480,7 @@
       </w:r>
       <w:r>
         <w:rPr>
-          <w:rFonts w:ascii="Calibri" w:hAnsi="Calibri"/>
+          <w:rFonts w:ascii="Calibri" w:hAnsi="Calibri" w:eastAsia="Calibri"/>
           <w:b w:val="0"/>
           <w:color w:val="1A1A1A"/>
           <w:sz w:val="19"/>
@@ -480,7 +489,7 @@
       </w:r>
       <w:r>
         <w:rPr>
-          <w:rFonts w:ascii="Calibri" w:hAnsi="Calibri"/>
+          <w:rFonts w:ascii="Calibri" w:hAnsi="Calibri" w:eastAsia="Calibri"/>
           <w:b/>
           <w:color w:val="1A1A1A"/>
           <w:sz w:val="19"/>
@@ -489,7 +498,7 @@
       </w:r>
       <w:r>
         <w:rPr>
-          <w:rFonts w:ascii="Calibri" w:hAnsi="Calibri"/>
+          <w:rFonts w:ascii="Calibri" w:hAnsi="Calibri" w:eastAsia="Calibri"/>
           <w:b w:val="0"/>
           <w:color w:val="1A1A1A"/>
           <w:sz w:val="19"/>
@@ -498,7 +507,7 @@
       </w:r>
       <w:r>
         <w:rPr>
-          <w:rFonts w:ascii="Calibri" w:hAnsi="Calibri"/>
+          <w:rFonts w:ascii="Calibri" w:hAnsi="Calibri" w:eastAsia="Calibri"/>
           <w:b/>
           <w:color w:val="1A1A1A"/>
           <w:sz w:val="19"/>
@@ -507,7 +516,7 @@
       </w:r>
       <w:r>
         <w:rPr>
-          <w:rFonts w:ascii="Calibri" w:hAnsi="Calibri"/>
+          <w:rFonts w:ascii="Calibri" w:hAnsi="Calibri" w:eastAsia="Calibri"/>
           <w:b w:val="0"/>
           <w:color w:val="1A1A1A"/>
           <w:sz w:val="19"/>
@@ -516,7 +525,7 @@
       </w:r>
       <w:r>
         <w:rPr>
-          <w:rFonts w:ascii="Calibri" w:hAnsi="Calibri"/>
+          <w:rFonts w:ascii="Calibri" w:hAnsi="Calibri" w:eastAsia="Calibri"/>
           <w:b/>
           <w:color w:val="1A1A1A"/>
           <w:sz w:val="19"/>
@@ -525,7 +534,7 @@
       </w:r>
       <w:r>
         <w:rPr>
-          <w:rFonts w:ascii="Calibri" w:hAnsi="Calibri"/>
+          <w:rFonts w:ascii="Calibri" w:hAnsi="Calibri" w:eastAsia="Calibri"/>
           <w:b w:val="0"/>
           <w:color w:val="1A1A1A"/>
           <w:sz w:val="19"/>
@@ -536,13 +545,14 @@
     <w:p>
       <w:pPr>
         <w:pStyle w:val="ListBullet"/>
-        <w:widowControl/>
+        <w:keepNext w:val="0"/>
+        <w:pageBreakBefore w:val="0"/>
         <w:spacing w:before="0" w:after="10" w:line="240" w:lineRule="auto"/>
         <w:ind w:left="288"/>
       </w:pPr>
       <w:r>
         <w:rPr>
-          <w:rFonts w:ascii="Calibri" w:hAnsi="Calibri"/>
+          <w:rFonts w:ascii="Calibri" w:hAnsi="Calibri" w:eastAsia="Calibri"/>
           <w:b w:val="0"/>
           <w:color w:val="1A1A1A"/>
           <w:sz w:val="19"/>
@@ -551,7 +561,7 @@
       </w:r>
       <w:r>
         <w:rPr>
-          <w:rFonts w:ascii="Calibri" w:hAnsi="Calibri"/>
+          <w:rFonts w:ascii="Calibri" w:hAnsi="Calibri" w:eastAsia="Calibri"/>
           <w:b/>
           <w:color w:val="1A1A1A"/>
           <w:sz w:val="19"/>
@@ -560,7 +570,7 @@
       </w:r>
       <w:r>
         <w:rPr>
-          <w:rFonts w:ascii="Calibri" w:hAnsi="Calibri"/>
+          <w:rFonts w:ascii="Calibri" w:hAnsi="Calibri" w:eastAsia="Calibri"/>
           <w:b w:val="0"/>
           <w:color w:val="1A1A1A"/>
           <w:sz w:val="19"/>
@@ -569,7 +579,7 @@
       </w:r>
       <w:r>
         <w:rPr>
-          <w:rFonts w:ascii="Calibri" w:hAnsi="Calibri"/>
+          <w:rFonts w:ascii="Calibri" w:hAnsi="Calibri" w:eastAsia="Calibri"/>
           <w:b/>
           <w:color w:val="1A1A1A"/>
           <w:sz w:val="19"/>
@@ -578,7 +588,7 @@
       </w:r>
       <w:r>
         <w:rPr>
-          <w:rFonts w:ascii="Calibri" w:hAnsi="Calibri"/>
+          <w:rFonts w:ascii="Calibri" w:hAnsi="Calibri" w:eastAsia="Calibri"/>
           <w:b w:val="0"/>
           <w:color w:val="1A1A1A"/>
           <w:sz w:val="19"/>
@@ -587,7 +597,7 @@
       </w:r>
       <w:r>
         <w:rPr>
-          <w:rFonts w:ascii="Calibri" w:hAnsi="Calibri"/>
+          <w:rFonts w:ascii="Calibri" w:hAnsi="Calibri" w:eastAsia="Calibri"/>
           <w:b/>
           <w:color w:val="1A1A1A"/>
           <w:sz w:val="19"/>
@@ -596,7 +606,7 @@
       </w:r>
       <w:r>
         <w:rPr>
-          <w:rFonts w:ascii="Calibri" w:hAnsi="Calibri"/>
+          <w:rFonts w:ascii="Calibri" w:hAnsi="Calibri" w:eastAsia="Calibri"/>
           <w:b w:val="0"/>
           <w:color w:val="1A1A1A"/>
           <w:sz w:val="19"/>
@@ -607,13 +617,14 @@
     <w:p>
       <w:pPr>
         <w:pStyle w:val="ListBullet"/>
-        <w:widowControl/>
+        <w:keepNext w:val="0"/>
+        <w:pageBreakBefore w:val="0"/>
         <w:spacing w:before="0" w:after="10" w:line="240" w:lineRule="auto"/>
         <w:ind w:left="288"/>
       </w:pPr>
       <w:r>
         <w:rPr>
-          <w:rFonts w:ascii="Calibri" w:hAnsi="Calibri"/>
+          <w:rFonts w:ascii="Calibri" w:hAnsi="Calibri" w:eastAsia="Calibri"/>
           <w:b w:val="0"/>
           <w:color w:val="1A1A1A"/>
           <w:sz w:val="19"/>
@@ -622,7 +633,7 @@
       </w:r>
       <w:r>
         <w:rPr>
-          <w:rFonts w:ascii="Calibri" w:hAnsi="Calibri"/>
+          <w:rFonts w:ascii="Calibri" w:hAnsi="Calibri" w:eastAsia="Calibri"/>
           <w:b/>
           <w:color w:val="1A1A1A"/>
           <w:sz w:val="19"/>
@@ -631,7 +642,7 @@
       </w:r>
       <w:r>
         <w:rPr>
-          <w:rFonts w:ascii="Calibri" w:hAnsi="Calibri"/>
+          <w:rFonts w:ascii="Calibri" w:hAnsi="Calibri" w:eastAsia="Calibri"/>
           <w:b w:val="0"/>
           <w:color w:val="1A1A1A"/>
           <w:sz w:val="19"/>
@@ -642,13 +653,14 @@
     <w:p>
       <w:pPr>
         <w:pStyle w:val="ListBullet"/>
-        <w:widowControl/>
+        <w:keepNext w:val="0"/>
+        <w:pageBreakBefore w:val="0"/>
         <w:spacing w:before="0" w:after="10" w:line="240" w:lineRule="auto"/>
         <w:ind w:left="288"/>
       </w:pPr>
       <w:r>
         <w:rPr>
-          <w:rFonts w:ascii="Calibri" w:hAnsi="Calibri"/>
+          <w:rFonts w:ascii="Calibri" w:hAnsi="Calibri" w:eastAsia="Calibri"/>
           <w:b w:val="0"/>
           <w:color w:val="1A1A1A"/>
           <w:sz w:val="19"/>
@@ -657,7 +669,7 @@
       </w:r>
       <w:r>
         <w:rPr>
-          <w:rFonts w:ascii="Calibri" w:hAnsi="Calibri"/>
+          <w:rFonts w:ascii="Calibri" w:hAnsi="Calibri" w:eastAsia="Calibri"/>
           <w:b/>
           <w:color w:val="1A1A1A"/>
           <w:sz w:val="19"/>
@@ -666,7 +678,7 @@
       </w:r>
       <w:r>
         <w:rPr>
-          <w:rFonts w:ascii="Calibri" w:hAnsi="Calibri"/>
+          <w:rFonts w:ascii="Calibri" w:hAnsi="Calibri" w:eastAsia="Calibri"/>
           <w:b w:val="0"/>
           <w:color w:val="1A1A1A"/>
           <w:sz w:val="19"/>
@@ -675,7 +687,7 @@
       </w:r>
       <w:r>
         <w:rPr>
-          <w:rFonts w:ascii="Calibri" w:hAnsi="Calibri"/>
+          <w:rFonts w:ascii="Calibri" w:hAnsi="Calibri" w:eastAsia="Calibri"/>
           <w:b/>
           <w:color w:val="1A1A1A"/>
           <w:sz w:val="19"/>
@@ -684,7 +696,7 @@
       </w:r>
       <w:r>
         <w:rPr>
-          <w:rFonts w:ascii="Calibri" w:hAnsi="Calibri"/>
+          <w:rFonts w:ascii="Calibri" w:hAnsi="Calibri" w:eastAsia="Calibri"/>
           <w:b w:val="0"/>
           <w:color w:val="1A1A1A"/>
           <w:sz w:val="19"/>
@@ -695,13 +707,14 @@
     <w:p>
       <w:pPr>
         <w:pStyle w:val="ListBullet"/>
-        <w:widowControl/>
+        <w:keepNext w:val="0"/>
+        <w:pageBreakBefore w:val="0"/>
         <w:spacing w:before="0" w:after="10" w:line="240" w:lineRule="auto"/>
         <w:ind w:left="288"/>
       </w:pPr>
       <w:r>
         <w:rPr>
-          <w:rFonts w:ascii="Calibri" w:hAnsi="Calibri"/>
+          <w:rFonts w:ascii="Calibri" w:hAnsi="Calibri" w:eastAsia="Calibri"/>
           <w:b w:val="0"/>
           <w:color w:val="1A1A1A"/>
           <w:sz w:val="19"/>
@@ -710,7 +723,7 @@
       </w:r>
       <w:r>
         <w:rPr>
-          <w:rFonts w:ascii="Calibri" w:hAnsi="Calibri"/>
+          <w:rFonts w:ascii="Calibri" w:hAnsi="Calibri" w:eastAsia="Calibri"/>
           <w:b/>
           <w:color w:val="1A1A1A"/>
           <w:sz w:val="19"/>
@@ -719,7 +732,7 @@
       </w:r>
       <w:r>
         <w:rPr>
-          <w:rFonts w:ascii="Calibri" w:hAnsi="Calibri"/>
+          <w:rFonts w:ascii="Calibri" w:hAnsi="Calibri" w:eastAsia="Calibri"/>
           <w:b w:val="0"/>
           <w:color w:val="1A1A1A"/>
           <w:sz w:val="19"/>
@@ -728,7 +741,7 @@
       </w:r>
       <w:r>
         <w:rPr>
-          <w:rFonts w:ascii="Calibri" w:hAnsi="Calibri"/>
+          <w:rFonts w:ascii="Calibri" w:hAnsi="Calibri" w:eastAsia="Calibri"/>
           <w:b/>
           <w:color w:val="1A1A1A"/>
           <w:sz w:val="19"/>
@@ -737,7 +750,7 @@
       </w:r>
       <w:r>
         <w:rPr>
-          <w:rFonts w:ascii="Calibri" w:hAnsi="Calibri"/>
+          <w:rFonts w:ascii="Calibri" w:hAnsi="Calibri" w:eastAsia="Calibri"/>
           <w:b w:val="0"/>
           <w:color w:val="1A1A1A"/>
           <w:sz w:val="19"/>
@@ -748,13 +761,14 @@
     <w:p>
       <w:pPr>
         <w:pStyle w:val="ListBullet"/>
-        <w:widowControl/>
+        <w:keepNext w:val="0"/>
+        <w:pageBreakBefore w:val="0"/>
         <w:spacing w:before="0" w:after="10" w:line="240" w:lineRule="auto"/>
         <w:ind w:left="288"/>
       </w:pPr>
       <w:r>
         <w:rPr>
-          <w:rFonts w:ascii="Calibri" w:hAnsi="Calibri"/>
+          <w:rFonts w:ascii="Calibri" w:hAnsi="Calibri" w:eastAsia="Calibri"/>
           <w:b w:val="0"/>
           <w:color w:val="1A1A1A"/>
           <w:sz w:val="19"/>
@@ -765,12 +779,12 @@
     <w:p>
       <w:pPr>
         <w:keepNext/>
-        <w:widowControl/>
-        <w:spacing w:before="140" w:after="60"/>
+        <w:pageBreakBefore w:val="0"/>
+        <w:spacing w:before="140" w:after="60" w:line="240" w:lineRule="auto"/>
       </w:pPr>
       <w:r>
         <w:rPr>
-          <w:rFonts w:ascii="Calibri" w:hAnsi="Calibri"/>
+          <w:rFonts w:ascii="Calibri" w:hAnsi="Calibri" w:eastAsia="Calibri"/>
           <w:b/>
           <w:color w:val="2C2C2C"/>
           <w:sz w:val="21"/>
@@ -781,15 +795,15 @@
     <w:p>
       <w:pPr>
         <w:keepNext/>
-        <w:widowControl/>
+        <w:pageBreakBefore w:val="0"/>
         <w:tabs>
           <w:tab w:pos="10224" w:val="right"/>
         </w:tabs>
-        <w:spacing w:before="100" w:after="20"/>
+        <w:spacing w:before="100" w:after="20" w:line="240" w:lineRule="auto"/>
       </w:pPr>
       <w:r>
         <w:rPr>
-          <w:rFonts w:ascii="Calibri" w:hAnsi="Calibri"/>
+          <w:rFonts w:ascii="Calibri" w:hAnsi="Calibri" w:eastAsia="Calibri"/>
           <w:b/>
           <w:color w:val="1A1A1A"/>
           <w:sz w:val="21"/>
@@ -798,7 +812,7 @@
       </w:r>
       <w:r>
         <w:rPr>
-          <w:rFonts w:ascii="Calibri" w:hAnsi="Calibri"/>
+          <w:rFonts w:ascii="Calibri" w:hAnsi="Calibri" w:eastAsia="Calibri"/>
           <w:b w:val="0"/>
           <w:color w:val="4A4A4A"/>
           <w:sz w:val="19"/>
@@ -809,12 +823,13 @@
     </w:p>
     <w:p>
       <w:pPr>
-        <w:widowControl/>
-        <w:spacing w:after="20" w:line="240" w:lineRule="auto"/>
+        <w:keepNext w:val="0"/>
+        <w:pageBreakBefore w:val="0"/>
+        <w:spacing w:before="0" w:after="20" w:line="240" w:lineRule="auto"/>
       </w:pPr>
       <w:r>
         <w:rPr>
-          <w:rFonts w:ascii="Calibri" w:hAnsi="Calibri"/>
+          <w:rFonts w:ascii="Calibri" w:hAnsi="Calibri" w:eastAsia="Calibri"/>
           <w:b w:val="0"/>
           <w:color w:val="4A4A4A"/>
           <w:sz w:val="18"/>
@@ -825,13 +840,14 @@
     <w:p>
       <w:pPr>
         <w:pStyle w:val="ListBullet"/>
-        <w:widowControl/>
+        <w:keepNext w:val="0"/>
+        <w:pageBreakBefore w:val="0"/>
         <w:spacing w:before="0" w:after="10" w:line="240" w:lineRule="auto"/>
         <w:ind w:left="288"/>
       </w:pPr>
       <w:r>
         <w:rPr>
-          <w:rFonts w:ascii="Calibri" w:hAnsi="Calibri"/>
+          <w:rFonts w:ascii="Calibri" w:hAnsi="Calibri" w:eastAsia="Calibri"/>
           <w:b w:val="0"/>
           <w:color w:val="1A1A1A"/>
           <w:sz w:val="19"/>
@@ -842,47 +858,104 @@
     <w:p>
       <w:pPr>
         <w:pStyle w:val="ListBullet"/>
-        <w:widowControl/>
+        <w:keepNext w:val="0"/>
+        <w:pageBreakBefore w:val="0"/>
         <w:spacing w:before="0" w:after="10" w:line="240" w:lineRule="auto"/>
         <w:ind w:left="288"/>
       </w:pPr>
       <w:r>
         <w:rPr>
-          <w:rFonts w:ascii="Calibri" w:hAnsi="Calibri"/>
+          <w:rFonts w:ascii="Calibri" w:hAnsi="Calibri" w:eastAsia="Calibri"/>
           <w:b w:val="0"/>
           <w:color w:val="1A1A1A"/>
           <w:sz w:val="19"/>
         </w:rPr>
-        <w:t>Built Mastra workflows, memory, schedules, tools, pause/resume, retries, sandboxing, and skills.</w:t>
+        <w:t xml:space="preserve">Built </w:t>
+      </w:r>
+      <w:r>
+        <w:rPr>
+          <w:rFonts w:ascii="Calibri" w:hAnsi="Calibri" w:eastAsia="Calibri"/>
+          <w:b/>
+          <w:color w:val="1A1A1A"/>
+          <w:sz w:val="19"/>
+        </w:rPr>
+        <w:t>Mastra workflows</w:t>
+      </w:r>
+      <w:r>
+        <w:rPr>
+          <w:rFonts w:ascii="Calibri" w:hAnsi="Calibri" w:eastAsia="Calibri"/>
+          <w:b w:val="0"/>
+          <w:color w:val="1A1A1A"/>
+          <w:sz w:val="19"/>
+        </w:rPr>
+        <w:t>, memory, schedules, tools, pause/resume, retries, sandboxing, and skills.</w:t>
       </w:r>
     </w:p>
     <w:p>
       <w:pPr>
         <w:pStyle w:val="ListBullet"/>
-        <w:widowControl/>
+        <w:keepNext w:val="0"/>
+        <w:pageBreakBefore w:val="0"/>
         <w:spacing w:before="0" w:after="10" w:line="240" w:lineRule="auto"/>
         <w:ind w:left="288"/>
       </w:pPr>
       <w:r>
         <w:rPr>
-          <w:rFonts w:ascii="Calibri" w:hAnsi="Calibri"/>
+          <w:rFonts w:ascii="Calibri" w:hAnsi="Calibri" w:eastAsia="Calibri"/>
           <w:b w:val="0"/>
           <w:color w:val="1A1A1A"/>
           <w:sz w:val="19"/>
         </w:rPr>
-        <w:t>Shipped org-scoped RAG (ingestion, chunking, Pinecone query/reranking) and eval-gated releases.</w:t>
+        <w:t xml:space="preserve">Shipped org-scoped </w:t>
+      </w:r>
+      <w:r>
+        <w:rPr>
+          <w:rFonts w:ascii="Calibri" w:hAnsi="Calibri" w:eastAsia="Calibri"/>
+          <w:b/>
+          <w:color w:val="1A1A1A"/>
+          <w:sz w:val="19"/>
+        </w:rPr>
+        <w:t>RAG</w:t>
+      </w:r>
+      <w:r>
+        <w:rPr>
+          <w:rFonts w:ascii="Calibri" w:hAnsi="Calibri" w:eastAsia="Calibri"/>
+          <w:b w:val="0"/>
+          <w:color w:val="1A1A1A"/>
+          <w:sz w:val="19"/>
+        </w:rPr>
+        <w:t xml:space="preserve"> (ingestion, chunking, </w:t>
+      </w:r>
+      <w:r>
+        <w:rPr>
+          <w:rFonts w:ascii="Calibri" w:hAnsi="Calibri" w:eastAsia="Calibri"/>
+          <w:b/>
+          <w:color w:val="1A1A1A"/>
+          <w:sz w:val="19"/>
+        </w:rPr>
+        <w:t>Pinecone</w:t>
+      </w:r>
+      <w:r>
+        <w:rPr>
+          <w:rFonts w:ascii="Calibri" w:hAnsi="Calibri" w:eastAsia="Calibri"/>
+          <w:b w:val="0"/>
+          <w:color w:val="1A1A1A"/>
+          <w:sz w:val="19"/>
+        </w:rPr>
+        <w:t xml:space="preserve"> query/reranking) and eval-gated releases.</w:t>
       </w:r>
     </w:p>
     <w:p>
       <w:pPr>
         <w:pStyle w:val="ListBullet"/>
-        <w:widowControl/>
+        <w:keepNext w:val="0"/>
+        <w:pageBreakBefore w:val="0"/>
         <w:spacing w:before="0" w:after="10" w:line="240" w:lineRule="auto"/>
         <w:ind w:left="288"/>
       </w:pPr>
       <w:r>
         <w:rPr>
-          <w:rFonts w:ascii="Calibri" w:hAnsi="Calibri"/>
+          <w:rFonts w:ascii="Calibri" w:hAnsi="Calibri" w:eastAsia="Calibri"/>
           <w:b w:val="0"/>
           <w:color w:val="1A1A1A"/>
           <w:sz w:val="19"/>
@@ -891,7 +964,7 @@
       </w:r>
       <w:r>
         <w:rPr>
-          <w:rFonts w:ascii="Calibri" w:hAnsi="Calibri"/>
+          <w:rFonts w:ascii="Calibri" w:hAnsi="Calibri" w:eastAsia="Calibri"/>
           <w:b/>
           <w:color w:val="1A1A1A"/>
           <w:sz w:val="19"/>
@@ -900,7 +973,7 @@
       </w:r>
       <w:r>
         <w:rPr>
-          <w:rFonts w:ascii="Calibri" w:hAnsi="Calibri"/>
+          <w:rFonts w:ascii="Calibri" w:hAnsi="Calibri" w:eastAsia="Calibri"/>
           <w:b w:val="0"/>
           <w:color w:val="1A1A1A"/>
           <w:sz w:val="19"/>
@@ -911,13 +984,14 @@
     <w:p>
       <w:pPr>
         <w:pStyle w:val="ListBullet"/>
-        <w:widowControl/>
+        <w:keepNext w:val="0"/>
+        <w:pageBreakBefore w:val="0"/>
         <w:spacing w:before="0" w:after="10" w:line="240" w:lineRule="auto"/>
         <w:ind w:left="288"/>
       </w:pPr>
       <w:r>
         <w:rPr>
-          <w:rFonts w:ascii="Calibri" w:hAnsi="Calibri"/>
+          <w:rFonts w:ascii="Calibri" w:hAnsi="Calibri" w:eastAsia="Calibri"/>
           <w:b w:val="0"/>
           <w:color w:val="1A1A1A"/>
           <w:sz w:val="19"/>
@@ -928,15 +1002,15 @@
     <w:p>
       <w:pPr>
         <w:keepNext/>
-        <w:widowControl/>
+        <w:pageBreakBefore w:val="0"/>
         <w:tabs>
           <w:tab w:pos="10224" w:val="right"/>
         </w:tabs>
-        <w:spacing w:before="100" w:after="20"/>
+        <w:spacing w:before="100" w:after="20" w:line="240" w:lineRule="auto"/>
       </w:pPr>
       <w:r>
         <w:rPr>
-          <w:rFonts w:ascii="Calibri" w:hAnsi="Calibri"/>
+          <w:rFonts w:ascii="Calibri" w:hAnsi="Calibri" w:eastAsia="Calibri"/>
           <w:b/>
           <w:color w:val="1A1A1A"/>
           <w:sz w:val="21"/>
@@ -945,7 +1019,7 @@
       </w:r>
       <w:r>
         <w:rPr>
-          <w:rFonts w:ascii="Calibri" w:hAnsi="Calibri"/>
+          <w:rFonts w:ascii="Calibri" w:hAnsi="Calibri" w:eastAsia="Calibri"/>
           <w:b w:val="0"/>
           <w:color w:val="4A4A4A"/>
           <w:sz w:val="19"/>
@@ -956,12 +1030,13 @@
     </w:p>
     <w:p>
       <w:pPr>
-        <w:widowControl/>
-        <w:spacing w:after="20" w:line="240" w:lineRule="auto"/>
+        <w:keepNext w:val="0"/>
+        <w:pageBreakBefore w:val="0"/>
+        <w:spacing w:before="0" w:after="20" w:line="240" w:lineRule="auto"/>
       </w:pPr>
       <w:r>
         <w:rPr>
-          <w:rFonts w:ascii="Calibri" w:hAnsi="Calibri"/>
+          <w:rFonts w:ascii="Calibri" w:hAnsi="Calibri" w:eastAsia="Calibri"/>
           <w:b w:val="0"/>
           <w:color w:val="4A4A4A"/>
           <w:sz w:val="18"/>
@@ -972,13 +1047,14 @@
     <w:p>
       <w:pPr>
         <w:pStyle w:val="ListBullet"/>
-        <w:widowControl/>
+        <w:keepNext w:val="0"/>
+        <w:pageBreakBefore w:val="0"/>
         <w:spacing w:before="0" w:after="10" w:line="240" w:lineRule="auto"/>
         <w:ind w:left="288"/>
       </w:pPr>
       <w:r>
         <w:rPr>
-          <w:rFonts w:ascii="Calibri" w:hAnsi="Calibri"/>
+          <w:rFonts w:ascii="Calibri" w:hAnsi="Calibri" w:eastAsia="Calibri"/>
           <w:b w:val="0"/>
           <w:color w:val="1A1A1A"/>
           <w:sz w:val="19"/>
@@ -989,13 +1065,14 @@
     <w:p>
       <w:pPr>
         <w:pStyle w:val="ListBullet"/>
-        <w:widowControl/>
+        <w:keepNext w:val="0"/>
+        <w:pageBreakBefore w:val="0"/>
         <w:spacing w:before="0" w:after="10" w:line="240" w:lineRule="auto"/>
         <w:ind w:left="288"/>
       </w:pPr>
       <w:r>
         <w:rPr>
-          <w:rFonts w:ascii="Calibri" w:hAnsi="Calibri"/>
+          <w:rFonts w:ascii="Calibri" w:hAnsi="Calibri" w:eastAsia="Calibri"/>
           <w:b w:val="0"/>
           <w:color w:val="1A1A1A"/>
           <w:sz w:val="19"/>
@@ -1006,13 +1083,14 @@
     <w:p>
       <w:pPr>
         <w:pStyle w:val="ListBullet"/>
-        <w:widowControl/>
+        <w:keepNext w:val="0"/>
+        <w:pageBreakBefore w:val="0"/>
         <w:spacing w:before="0" w:after="10" w:line="240" w:lineRule="auto"/>
         <w:ind w:left="288"/>
       </w:pPr>
       <w:r>
         <w:rPr>
-          <w:rFonts w:ascii="Calibri" w:hAnsi="Calibri"/>
+          <w:rFonts w:ascii="Calibri" w:hAnsi="Calibri" w:eastAsia="Calibri"/>
           <w:b w:val="0"/>
           <w:color w:val="1A1A1A"/>
           <w:sz w:val="19"/>
@@ -1021,7 +1099,7 @@
       </w:r>
       <w:r>
         <w:rPr>
-          <w:rFonts w:ascii="Calibri" w:hAnsi="Calibri"/>
+          <w:rFonts w:ascii="Calibri" w:hAnsi="Calibri" w:eastAsia="Calibri"/>
           <w:b/>
           <w:color w:val="1A1A1A"/>
           <w:sz w:val="19"/>
@@ -1030,7 +1108,7 @@
       </w:r>
       <w:r>
         <w:rPr>
-          <w:rFonts w:ascii="Calibri" w:hAnsi="Calibri"/>
+          <w:rFonts w:ascii="Calibri" w:hAnsi="Calibri" w:eastAsia="Calibri"/>
           <w:b w:val="0"/>
           <w:color w:val="1A1A1A"/>
           <w:sz w:val="19"/>
@@ -1039,7 +1117,7 @@
       </w:r>
       <w:r>
         <w:rPr>
-          <w:rFonts w:ascii="Calibri" w:hAnsi="Calibri"/>
+          <w:rFonts w:ascii="Calibri" w:hAnsi="Calibri" w:eastAsia="Calibri"/>
           <w:b/>
           <w:color w:val="1A1A1A"/>
           <w:sz w:val="19"/>
@@ -1048,7 +1126,7 @@
       </w:r>
       <w:r>
         <w:rPr>
-          <w:rFonts w:ascii="Calibri" w:hAnsi="Calibri"/>
+          <w:rFonts w:ascii="Calibri" w:hAnsi="Calibri" w:eastAsia="Calibri"/>
           <w:b w:val="0"/>
           <w:color w:val="1A1A1A"/>
           <w:sz w:val="19"/>
@@ -1057,7 +1135,7 @@
       </w:r>
       <w:r>
         <w:rPr>
-          <w:rFonts w:ascii="Calibri" w:hAnsi="Calibri"/>
+          <w:rFonts w:ascii="Calibri" w:hAnsi="Calibri" w:eastAsia="Calibri"/>
           <w:b/>
           <w:color w:val="1A1A1A"/>
           <w:sz w:val="19"/>
@@ -1066,7 +1144,7 @@
       </w:r>
       <w:r>
         <w:rPr>
-          <w:rFonts w:ascii="Calibri" w:hAnsi="Calibri"/>
+          <w:rFonts w:ascii="Calibri" w:hAnsi="Calibri" w:eastAsia="Calibri"/>
           <w:b w:val="0"/>
           <w:color w:val="1A1A1A"/>
           <w:sz w:val="19"/>
@@ -1075,7 +1153,7 @@
       </w:r>
       <w:r>
         <w:rPr>
-          <w:rFonts w:ascii="Calibri" w:hAnsi="Calibri"/>
+          <w:rFonts w:ascii="Calibri" w:hAnsi="Calibri" w:eastAsia="Calibri"/>
           <w:b/>
           <w:color w:val="1A1A1A"/>
           <w:sz w:val="19"/>
@@ -1084,7 +1162,7 @@
       </w:r>
       <w:r>
         <w:rPr>
-          <w:rFonts w:ascii="Calibri" w:hAnsi="Calibri"/>
+          <w:rFonts w:ascii="Calibri" w:hAnsi="Calibri" w:eastAsia="Calibri"/>
           <w:b w:val="0"/>
           <w:color w:val="1A1A1A"/>
           <w:sz w:val="19"/>
@@ -1093,7 +1171,7 @@
       </w:r>
       <w:r>
         <w:rPr>
-          <w:rFonts w:ascii="Calibri" w:hAnsi="Calibri"/>
+          <w:rFonts w:ascii="Calibri" w:hAnsi="Calibri" w:eastAsia="Calibri"/>
           <w:b/>
           <w:color w:val="1A1A1A"/>
           <w:sz w:val="19"/>
@@ -1102,7 +1180,7 @@
       </w:r>
       <w:r>
         <w:rPr>
-          <w:rFonts w:ascii="Calibri" w:hAnsi="Calibri"/>
+          <w:rFonts w:ascii="Calibri" w:hAnsi="Calibri" w:eastAsia="Calibri"/>
           <w:b w:val="0"/>
           <w:color w:val="1A1A1A"/>
           <w:sz w:val="19"/>
@@ -1111,7 +1189,7 @@
       </w:r>
       <w:r>
         <w:rPr>
-          <w:rFonts w:ascii="Calibri" w:hAnsi="Calibri"/>
+          <w:rFonts w:ascii="Calibri" w:hAnsi="Calibri" w:eastAsia="Calibri"/>
           <w:b/>
           <w:color w:val="1A1A1A"/>
           <w:sz w:val="19"/>
@@ -1120,7 +1198,7 @@
       </w:r>
       <w:r>
         <w:rPr>
-          <w:rFonts w:ascii="Calibri" w:hAnsi="Calibri"/>
+          <w:rFonts w:ascii="Calibri" w:hAnsi="Calibri" w:eastAsia="Calibri"/>
           <w:b w:val="0"/>
           <w:color w:val="1A1A1A"/>
           <w:sz w:val="19"/>
@@ -1131,13 +1209,14 @@
     <w:p>
       <w:pPr>
         <w:pStyle w:val="ListBullet"/>
-        <w:widowControl/>
+        <w:keepNext w:val="0"/>
+        <w:pageBreakBefore w:val="0"/>
         <w:spacing w:before="0" w:after="10" w:line="240" w:lineRule="auto"/>
         <w:ind w:left="288"/>
       </w:pPr>
       <w:r>
         <w:rPr>
-          <w:rFonts w:ascii="Calibri" w:hAnsi="Calibri"/>
+          <w:rFonts w:ascii="Calibri" w:hAnsi="Calibri" w:eastAsia="Calibri"/>
           <w:b w:val="0"/>
           <w:color w:val="1A1A1A"/>
           <w:sz w:val="19"/>
@@ -1148,15 +1227,15 @@
     <w:p>
       <w:pPr>
         <w:keepNext/>
-        <w:widowControl/>
+        <w:pageBreakBefore w:val="0"/>
         <w:tabs>
           <w:tab w:pos="10224" w:val="right"/>
         </w:tabs>
-        <w:spacing w:before="100" w:after="20"/>
+        <w:spacing w:before="100" w:after="20" w:line="240" w:lineRule="auto"/>
       </w:pPr>
       <w:r>
         <w:rPr>
-          <w:rFonts w:ascii="Calibri" w:hAnsi="Calibri"/>
+          <w:rFonts w:ascii="Calibri" w:hAnsi="Calibri" w:eastAsia="Calibri"/>
           <w:b/>
           <w:color w:val="1A1A1A"/>
           <w:sz w:val="21"/>
@@ -1165,7 +1244,7 @@
       </w:r>
       <w:r>
         <w:rPr>
-          <w:rFonts w:ascii="Calibri" w:hAnsi="Calibri"/>
+          <w:rFonts w:ascii="Calibri" w:hAnsi="Calibri" w:eastAsia="Calibri"/>
           <w:b w:val="0"/>
           <w:color w:val="4A4A4A"/>
           <w:sz w:val="19"/>
@@ -1176,47 +1255,31 @@
     </w:p>
     <w:p>
       <w:pPr>
-        <w:widowControl/>
-        <w:spacing w:after="20" w:line="240" w:lineRule="auto"/>
+        <w:keepNext w:val="0"/>
+        <w:pageBreakBefore w:val="0"/>
+        <w:spacing w:before="0" w:after="20" w:line="240" w:lineRule="auto"/>
       </w:pPr>
       <w:r>
         <w:rPr>
-          <w:rFonts w:ascii="Calibri" w:hAnsi="Calibri"/>
+          <w:rFonts w:ascii="Calibri" w:hAnsi="Calibri" w:eastAsia="Calibri"/>
           <w:b w:val="0"/>
           <w:color w:val="4A4A4A"/>
           <w:sz w:val="18"/>
         </w:rPr>
-        <w:t xml:space="preserve">Strapi, Meilisearch, and </w:t>
-      </w:r>
-      <w:r>
-        <w:rPr>
-          <w:rFonts w:ascii="Calibri" w:hAnsi="Calibri"/>
-          <w:b/>
-          <w:color w:val="4A4A4A"/>
-          <w:sz w:val="18"/>
-        </w:rPr>
-        <w:t>Next.js</w:t>
-      </w:r>
-      <w:r>
-        <w:rPr>
-          <w:rFonts w:ascii="Calibri" w:hAnsi="Calibri"/>
-          <w:b w:val="0"/>
-          <w:color w:val="4A4A4A"/>
-          <w:sz w:val="18"/>
-        </w:rPr>
-        <w:t xml:space="preserve"> editorial platform in the WordPress-to-headless migration.</w:t>
+        <w:t>Strapi, Meilisearch, and Next.js editorial platform in the WordPress-to-headless migration.</w:t>
       </w:r>
     </w:p>
     <w:p>
       <w:pPr>
         <w:pStyle w:val="ListBullet"/>
-        <w:widowControl/>
+        <w:keepNext w:val="0"/>
+        <w:pageBreakBefore w:val="0"/>
         <w:spacing w:before="0" w:after="10" w:line="240" w:lineRule="auto"/>
         <w:ind w:left="288"/>
       </w:pPr>
       <w:r>
         <w:rPr>
-          <w:rFonts w:ascii="Calibri" w:hAnsi="Calibri"/>
+          <w:rFonts w:ascii="Calibri" w:hAnsi="Calibri" w:eastAsia="Calibri"/>
           <w:b w:val="0"/>
           <w:color w:val="1A1A1A"/>
           <w:sz w:val="19"/>
@@ -1225,7 +1288,7 @@
       </w:r>
       <w:r>
         <w:rPr>
-          <w:rFonts w:ascii="Calibri" w:hAnsi="Calibri"/>
+          <w:rFonts w:ascii="Calibri" w:hAnsi="Calibri" w:eastAsia="Calibri"/>
           <w:b/>
           <w:color w:val="1A1A1A"/>
           <w:sz w:val="19"/>
@@ -1234,7 +1297,7 @@
       </w:r>
       <w:r>
         <w:rPr>
-          <w:rFonts w:ascii="Calibri" w:hAnsi="Calibri"/>
+          <w:rFonts w:ascii="Calibri" w:hAnsi="Calibri" w:eastAsia="Calibri"/>
           <w:b w:val="0"/>
           <w:color w:val="1A1A1A"/>
           <w:sz w:val="19"/>
@@ -1243,7 +1306,7 @@
       </w:r>
       <w:r>
         <w:rPr>
-          <w:rFonts w:ascii="Calibri" w:hAnsi="Calibri"/>
+          <w:rFonts w:ascii="Calibri" w:hAnsi="Calibri" w:eastAsia="Calibri"/>
           <w:b/>
           <w:color w:val="1A1A1A"/>
           <w:sz w:val="19"/>
@@ -1252,7 +1315,7 @@
       </w:r>
       <w:r>
         <w:rPr>
-          <w:rFonts w:ascii="Calibri" w:hAnsi="Calibri"/>
+          <w:rFonts w:ascii="Calibri" w:hAnsi="Calibri" w:eastAsia="Calibri"/>
           <w:b w:val="0"/>
           <w:color w:val="1A1A1A"/>
           <w:sz w:val="19"/>
@@ -1261,7 +1324,7 @@
       </w:r>
       <w:r>
         <w:rPr>
-          <w:rFonts w:ascii="Calibri" w:hAnsi="Calibri"/>
+          <w:rFonts w:ascii="Calibri" w:hAnsi="Calibri" w:eastAsia="Calibri"/>
           <w:b/>
           <w:color w:val="1A1A1A"/>
           <w:sz w:val="19"/>
@@ -1270,7 +1333,7 @@
       </w:r>
       <w:r>
         <w:rPr>
-          <w:rFonts w:ascii="Calibri" w:hAnsi="Calibri"/>
+          <w:rFonts w:ascii="Calibri" w:hAnsi="Calibri" w:eastAsia="Calibri"/>
           <w:b w:val="0"/>
           <w:color w:val="1A1A1A"/>
           <w:sz w:val="19"/>
@@ -1281,13 +1344,14 @@
     <w:p>
       <w:pPr>
         <w:pStyle w:val="ListBullet"/>
-        <w:widowControl/>
+        <w:keepNext w:val="0"/>
+        <w:pageBreakBefore w:val="0"/>
         <w:spacing w:before="0" w:after="10" w:line="240" w:lineRule="auto"/>
         <w:ind w:left="288"/>
       </w:pPr>
       <w:r>
         <w:rPr>
-          <w:rFonts w:ascii="Calibri" w:hAnsi="Calibri"/>
+          <w:rFonts w:ascii="Calibri" w:hAnsi="Calibri" w:eastAsia="Calibri"/>
           <w:b w:val="0"/>
           <w:color w:val="1A1A1A"/>
           <w:sz w:val="19"/>
@@ -1296,7 +1360,7 @@
       </w:r>
       <w:r>
         <w:rPr>
-          <w:rFonts w:ascii="Calibri" w:hAnsi="Calibri"/>
+          <w:rFonts w:ascii="Calibri" w:hAnsi="Calibri" w:eastAsia="Calibri"/>
           <w:b/>
           <w:color w:val="1A1A1A"/>
           <w:sz w:val="19"/>
@@ -1305,7 +1369,7 @@
       </w:r>
       <w:r>
         <w:rPr>
-          <w:rFonts w:ascii="Calibri" w:hAnsi="Calibri"/>
+          <w:rFonts w:ascii="Calibri" w:hAnsi="Calibri" w:eastAsia="Calibri"/>
           <w:b w:val="0"/>
           <w:color w:val="1A1A1A"/>
           <w:sz w:val="19"/>
@@ -1314,7 +1378,7 @@
       </w:r>
       <w:r>
         <w:rPr>
-          <w:rFonts w:ascii="Calibri" w:hAnsi="Calibri"/>
+          <w:rFonts w:ascii="Calibri" w:hAnsi="Calibri" w:eastAsia="Calibri"/>
           <w:b/>
           <w:color w:val="1A1A1A"/>
           <w:sz w:val="19"/>
@@ -1323,7 +1387,7 @@
       </w:r>
       <w:r>
         <w:rPr>
-          <w:rFonts w:ascii="Calibri" w:hAnsi="Calibri"/>
+          <w:rFonts w:ascii="Calibri" w:hAnsi="Calibri" w:eastAsia="Calibri"/>
           <w:b w:val="0"/>
           <w:color w:val="1A1A1A"/>
           <w:sz w:val="19"/>
@@ -1334,13 +1398,14 @@
     <w:p>
       <w:pPr>
         <w:pStyle w:val="ListBullet"/>
-        <w:widowControl/>
+        <w:keepNext w:val="0"/>
+        <w:pageBreakBefore w:val="0"/>
         <w:spacing w:before="0" w:after="10" w:line="240" w:lineRule="auto"/>
         <w:ind w:left="288"/>
       </w:pPr>
       <w:r>
         <w:rPr>
-          <w:rFonts w:ascii="Calibri" w:hAnsi="Calibri"/>
+          <w:rFonts w:ascii="Calibri" w:hAnsi="Calibri" w:eastAsia="Calibri"/>
           <w:b w:val="0"/>
           <w:color w:val="1A1A1A"/>
           <w:sz w:val="19"/>
@@ -1351,13 +1416,14 @@
     <w:p>
       <w:pPr>
         <w:pStyle w:val="ListBullet"/>
-        <w:widowControl/>
+        <w:keepNext w:val="0"/>
+        <w:pageBreakBefore w:val="0"/>
         <w:spacing w:before="0" w:after="10" w:line="240" w:lineRule="auto"/>
         <w:ind w:left="288"/>
       </w:pPr>
       <w:r>
         <w:rPr>
-          <w:rFonts w:ascii="Calibri" w:hAnsi="Calibri"/>
+          <w:rFonts w:ascii="Calibri" w:hAnsi="Calibri" w:eastAsia="Calibri"/>
           <w:b w:val="0"/>
           <w:color w:val="1A1A1A"/>
           <w:sz w:val="19"/>
@@ -1366,7 +1432,7 @@
       </w:r>
       <w:r>
         <w:rPr>
-          <w:rFonts w:ascii="Calibri" w:hAnsi="Calibri"/>
+          <w:rFonts w:ascii="Calibri" w:hAnsi="Calibri" w:eastAsia="Calibri"/>
           <w:b/>
           <w:color w:val="1A1A1A"/>
           <w:sz w:val="19"/>
@@ -1375,7 +1441,7 @@
       </w:r>
       <w:r>
         <w:rPr>
-          <w:rFonts w:ascii="Calibri" w:hAnsi="Calibri"/>
+          <w:rFonts w:ascii="Calibri" w:hAnsi="Calibri" w:eastAsia="Calibri"/>
           <w:b w:val="0"/>
           <w:color w:val="1A1A1A"/>
           <w:sz w:val="19"/>
@@ -1384,7 +1450,7 @@
       </w:r>
       <w:r>
         <w:rPr>
-          <w:rFonts w:ascii="Calibri" w:hAnsi="Calibri"/>
+          <w:rFonts w:ascii="Calibri" w:hAnsi="Calibri" w:eastAsia="Calibri"/>
           <w:b/>
           <w:color w:val="1A1A1A"/>
           <w:sz w:val="19"/>
@@ -1393,7 +1459,7 @@
       </w:r>
       <w:r>
         <w:rPr>
-          <w:rFonts w:ascii="Calibri" w:hAnsi="Calibri"/>
+          <w:rFonts w:ascii="Calibri" w:hAnsi="Calibri" w:eastAsia="Calibri"/>
           <w:b w:val="0"/>
           <w:color w:val="1A1A1A"/>
           <w:sz w:val="19"/>
@@ -1402,7 +1468,7 @@
       </w:r>
       <w:r>
         <w:rPr>
-          <w:rFonts w:ascii="Calibri" w:hAnsi="Calibri"/>
+          <w:rFonts w:ascii="Calibri" w:hAnsi="Calibri" w:eastAsia="Calibri"/>
           <w:b/>
           <w:color w:val="1A1A1A"/>
           <w:sz w:val="19"/>
@@ -1411,7 +1477,7 @@
       </w:r>
       <w:r>
         <w:rPr>
-          <w:rFonts w:ascii="Calibri" w:hAnsi="Calibri"/>
+          <w:rFonts w:ascii="Calibri" w:hAnsi="Calibri" w:eastAsia="Calibri"/>
           <w:b w:val="0"/>
           <w:color w:val="1A1A1A"/>
           <w:sz w:val="19"/>
@@ -1422,13 +1488,14 @@
     <w:p>
       <w:pPr>
         <w:pStyle w:val="ListBullet"/>
-        <w:widowControl/>
+        <w:keepNext w:val="0"/>
+        <w:pageBreakBefore w:val="0"/>
         <w:spacing w:before="0" w:after="10" w:line="240" w:lineRule="auto"/>
         <w:ind w:left="288"/>
       </w:pPr>
       <w:r>
         <w:rPr>
-          <w:rFonts w:ascii="Calibri" w:hAnsi="Calibri"/>
+          <w:rFonts w:ascii="Calibri" w:hAnsi="Calibri" w:eastAsia="Calibri"/>
           <w:b w:val="0"/>
           <w:color w:val="1A1A1A"/>
           <w:sz w:val="19"/>
@@ -1440,15 +1507,14 @@
       <w:pPr>
         <w:keepNext/>
         <w:pageBreakBefore/>
-        <w:widowControl/>
         <w:tabs>
           <w:tab w:pos="10224" w:val="right"/>
         </w:tabs>
-        <w:spacing w:before="100" w:after="20"/>
+        <w:spacing w:before="100" w:after="20" w:line="240" w:lineRule="auto"/>
       </w:pPr>
       <w:r>
         <w:rPr>
-          <w:rFonts w:ascii="Calibri" w:hAnsi="Calibri"/>
+          <w:rFonts w:ascii="Calibri" w:hAnsi="Calibri" w:eastAsia="Calibri"/>
           <w:b/>
           <w:color w:val="1A1A1A"/>
           <w:sz w:val="21"/>
@@ -1457,7 +1523,7 @@
       </w:r>
       <w:r>
         <w:rPr>
-          <w:rFonts w:ascii="Calibri" w:hAnsi="Calibri"/>
+          <w:rFonts w:ascii="Calibri" w:hAnsi="Calibri" w:eastAsia="Calibri"/>
           <w:b w:val="0"/>
           <w:color w:val="4A4A4A"/>
           <w:sz w:val="19"/>
@@ -1469,13 +1535,14 @@
     <w:p>
       <w:pPr>
         <w:pStyle w:val="ListBullet"/>
-        <w:widowControl/>
+        <w:keepNext w:val="0"/>
+        <w:pageBreakBefore w:val="0"/>
         <w:spacing w:before="0" w:after="10" w:line="240" w:lineRule="auto"/>
         <w:ind w:left="288"/>
       </w:pPr>
       <w:r>
         <w:rPr>
-          <w:rFonts w:ascii="Calibri" w:hAnsi="Calibri"/>
+          <w:rFonts w:ascii="Calibri" w:hAnsi="Calibri" w:eastAsia="Calibri"/>
           <w:b w:val="0"/>
           <w:color w:val="1A1A1A"/>
           <w:sz w:val="19"/>
@@ -1484,7 +1551,7 @@
       </w:r>
       <w:r>
         <w:rPr>
-          <w:rFonts w:ascii="Calibri" w:hAnsi="Calibri"/>
+          <w:rFonts w:ascii="Calibri" w:hAnsi="Calibri" w:eastAsia="Calibri"/>
           <w:b/>
           <w:color w:val="1A1A1A"/>
           <w:sz w:val="19"/>
@@ -1493,7 +1560,7 @@
       </w:r>
       <w:r>
         <w:rPr>
-          <w:rFonts w:ascii="Calibri" w:hAnsi="Calibri"/>
+          <w:rFonts w:ascii="Calibri" w:hAnsi="Calibri" w:eastAsia="Calibri"/>
           <w:b w:val="0"/>
           <w:color w:val="1A1A1A"/>
           <w:sz w:val="19"/>
@@ -1504,13 +1571,14 @@
     <w:p>
       <w:pPr>
         <w:pStyle w:val="ListBullet"/>
-        <w:widowControl/>
+        <w:keepNext w:val="0"/>
+        <w:pageBreakBefore w:val="0"/>
         <w:spacing w:before="0" w:after="10" w:line="240" w:lineRule="auto"/>
         <w:ind w:left="288"/>
       </w:pPr>
       <w:r>
         <w:rPr>
-          <w:rFonts w:ascii="Calibri" w:hAnsi="Calibri"/>
+          <w:rFonts w:ascii="Calibri" w:hAnsi="Calibri" w:eastAsia="Calibri"/>
           <w:b w:val="0"/>
           <w:color w:val="1A1A1A"/>
           <w:sz w:val="19"/>
@@ -1519,7 +1587,7 @@
       </w:r>
       <w:r>
         <w:rPr>
-          <w:rFonts w:ascii="Calibri" w:hAnsi="Calibri"/>
+          <w:rFonts w:ascii="Calibri" w:hAnsi="Calibri" w:eastAsia="Calibri"/>
           <w:b/>
           <w:color w:val="1A1A1A"/>
           <w:sz w:val="19"/>
@@ -1528,7 +1596,7 @@
       </w:r>
       <w:r>
         <w:rPr>
-          <w:rFonts w:ascii="Calibri" w:hAnsi="Calibri"/>
+          <w:rFonts w:ascii="Calibri" w:hAnsi="Calibri" w:eastAsia="Calibri"/>
           <w:b w:val="0"/>
           <w:color w:val="1A1A1A"/>
           <w:sz w:val="19"/>
@@ -1537,7 +1605,7 @@
       </w:r>
       <w:r>
         <w:rPr>
-          <w:rFonts w:ascii="Calibri" w:hAnsi="Calibri"/>
+          <w:rFonts w:ascii="Calibri" w:hAnsi="Calibri" w:eastAsia="Calibri"/>
           <w:b/>
           <w:color w:val="1A1A1A"/>
           <w:sz w:val="19"/>
@@ -1546,7 +1614,7 @@
       </w:r>
       <w:r>
         <w:rPr>
-          <w:rFonts w:ascii="Calibri" w:hAnsi="Calibri"/>
+          <w:rFonts w:ascii="Calibri" w:hAnsi="Calibri" w:eastAsia="Calibri"/>
           <w:b w:val="0"/>
           <w:color w:val="1A1A1A"/>
           <w:sz w:val="19"/>
@@ -1557,13 +1625,14 @@
     <w:p>
       <w:pPr>
         <w:pStyle w:val="ListBullet"/>
-        <w:widowControl/>
+        <w:keepNext w:val="0"/>
+        <w:pageBreakBefore w:val="0"/>
         <w:spacing w:before="0" w:after="10" w:line="240" w:lineRule="auto"/>
         <w:ind w:left="288"/>
       </w:pPr>
       <w:r>
         <w:rPr>
-          <w:rFonts w:ascii="Calibri" w:hAnsi="Calibri"/>
+          <w:rFonts w:ascii="Calibri" w:hAnsi="Calibri" w:eastAsia="Calibri"/>
           <w:b w:val="0"/>
           <w:color w:val="1A1A1A"/>
           <w:sz w:val="19"/>
@@ -1572,7 +1641,7 @@
       </w:r>
       <w:r>
         <w:rPr>
-          <w:rFonts w:ascii="Calibri" w:hAnsi="Calibri"/>
+          <w:rFonts w:ascii="Calibri" w:hAnsi="Calibri" w:eastAsia="Calibri"/>
           <w:b/>
           <w:color w:val="1A1A1A"/>
           <w:sz w:val="19"/>
@@ -1581,7 +1650,7 @@
       </w:r>
       <w:r>
         <w:rPr>
-          <w:rFonts w:ascii="Calibri" w:hAnsi="Calibri"/>
+          <w:rFonts w:ascii="Calibri" w:hAnsi="Calibri" w:eastAsia="Calibri"/>
           <w:b w:val="0"/>
           <w:color w:val="1A1A1A"/>
           <w:sz w:val="19"/>
@@ -1590,7 +1659,7 @@
       </w:r>
       <w:r>
         <w:rPr>
-          <w:rFonts w:ascii="Calibri" w:hAnsi="Calibri"/>
+          <w:rFonts w:ascii="Calibri" w:hAnsi="Calibri" w:eastAsia="Calibri"/>
           <w:b/>
           <w:color w:val="1A1A1A"/>
           <w:sz w:val="19"/>
@@ -1599,7 +1668,7 @@
       </w:r>
       <w:r>
         <w:rPr>
-          <w:rFonts w:ascii="Calibri" w:hAnsi="Calibri"/>
+          <w:rFonts w:ascii="Calibri" w:hAnsi="Calibri" w:eastAsia="Calibri"/>
           <w:b w:val="0"/>
           <w:color w:val="1A1A1A"/>
           <w:sz w:val="19"/>
@@ -1610,13 +1679,14 @@
     <w:p>
       <w:pPr>
         <w:pStyle w:val="ListBullet"/>
-        <w:widowControl/>
+        <w:keepNext w:val="0"/>
+        <w:pageBreakBefore w:val="0"/>
         <w:spacing w:before="0" w:after="10" w:line="240" w:lineRule="auto"/>
         <w:ind w:left="288"/>
       </w:pPr>
       <w:r>
         <w:rPr>
-          <w:rFonts w:ascii="Calibri" w:hAnsi="Calibri"/>
+          <w:rFonts w:ascii="Calibri" w:hAnsi="Calibri" w:eastAsia="Calibri"/>
           <w:b w:val="0"/>
           <w:color w:val="1A1A1A"/>
           <w:sz w:val="19"/>
@@ -1625,7 +1695,7 @@
       </w:r>
       <w:r>
         <w:rPr>
-          <w:rFonts w:ascii="Calibri" w:hAnsi="Calibri"/>
+          <w:rFonts w:ascii="Calibri" w:hAnsi="Calibri" w:eastAsia="Calibri"/>
           <w:b/>
           <w:color w:val="1A1A1A"/>
           <w:sz w:val="19"/>
@@ -1634,7 +1704,7 @@
       </w:r>
       <w:r>
         <w:rPr>
-          <w:rFonts w:ascii="Calibri" w:hAnsi="Calibri"/>
+          <w:rFonts w:ascii="Calibri" w:hAnsi="Calibri" w:eastAsia="Calibri"/>
           <w:b w:val="0"/>
           <w:color w:val="1A1A1A"/>
           <w:sz w:val="19"/>
@@ -1643,7 +1713,7 @@
       </w:r>
       <w:r>
         <w:rPr>
-          <w:rFonts w:ascii="Calibri" w:hAnsi="Calibri"/>
+          <w:rFonts w:ascii="Calibri" w:hAnsi="Calibri" w:eastAsia="Calibri"/>
           <w:b/>
           <w:color w:val="1A1A1A"/>
           <w:sz w:val="19"/>
@@ -1652,7 +1722,7 @@
       </w:r>
       <w:r>
         <w:rPr>
-          <w:rFonts w:ascii="Calibri" w:hAnsi="Calibri"/>
+          <w:rFonts w:ascii="Calibri" w:hAnsi="Calibri" w:eastAsia="Calibri"/>
           <w:b w:val="0"/>
           <w:color w:val="1A1A1A"/>
           <w:sz w:val="19"/>
@@ -1661,7 +1731,7 @@
       </w:r>
       <w:r>
         <w:rPr>
-          <w:rFonts w:ascii="Calibri" w:hAnsi="Calibri"/>
+          <w:rFonts w:ascii="Calibri" w:hAnsi="Calibri" w:eastAsia="Calibri"/>
           <w:b/>
           <w:color w:val="1A1A1A"/>
           <w:sz w:val="19"/>
@@ -1670,7 +1740,7 @@
       </w:r>
       <w:r>
         <w:rPr>
-          <w:rFonts w:ascii="Calibri" w:hAnsi="Calibri"/>
+          <w:rFonts w:ascii="Calibri" w:hAnsi="Calibri" w:eastAsia="Calibri"/>
           <w:b w:val="0"/>
           <w:color w:val="1A1A1A"/>
           <w:sz w:val="19"/>
@@ -1679,7 +1749,7 @@
       </w:r>
       <w:r>
         <w:rPr>
-          <w:rFonts w:ascii="Calibri" w:hAnsi="Calibri"/>
+          <w:rFonts w:ascii="Calibri" w:hAnsi="Calibri" w:eastAsia="Calibri"/>
           <w:b/>
           <w:color w:val="1A1A1A"/>
           <w:sz w:val="19"/>
@@ -1688,7 +1758,7 @@
       </w:r>
       <w:r>
         <w:rPr>
-          <w:rFonts w:ascii="Calibri" w:hAnsi="Calibri"/>
+          <w:rFonts w:ascii="Calibri" w:hAnsi="Calibri" w:eastAsia="Calibri"/>
           <w:b w:val="0"/>
           <w:color w:val="1A1A1A"/>
           <w:sz w:val="19"/>
@@ -1699,13 +1769,14 @@
     <w:p>
       <w:pPr>
         <w:pStyle w:val="ListBullet"/>
-        <w:widowControl/>
+        <w:keepNext w:val="0"/>
+        <w:pageBreakBefore w:val="0"/>
         <w:spacing w:before="0" w:after="10" w:line="240" w:lineRule="auto"/>
         <w:ind w:left="288"/>
       </w:pPr>
       <w:r>
         <w:rPr>
-          <w:rFonts w:ascii="Calibri" w:hAnsi="Calibri"/>
+          <w:rFonts w:ascii="Calibri" w:hAnsi="Calibri" w:eastAsia="Calibri"/>
           <w:b w:val="0"/>
           <w:color w:val="1A1A1A"/>
           <w:sz w:val="19"/>
@@ -1716,12 +1787,12 @@
     <w:p>
       <w:pPr>
         <w:keepNext/>
-        <w:widowControl/>
-        <w:spacing w:before="140" w:after="60"/>
+        <w:pageBreakBefore w:val="0"/>
+        <w:spacing w:before="140" w:after="60" w:line="240" w:lineRule="auto"/>
       </w:pPr>
       <w:r>
         <w:rPr>
-          <w:rFonts w:ascii="Calibri" w:hAnsi="Calibri"/>
+          <w:rFonts w:ascii="Calibri" w:hAnsi="Calibri" w:eastAsia="Calibri"/>
           <w:b/>
           <w:color w:val="2C2C2C"/>
           <w:sz w:val="21"/>
@@ -1731,12 +1802,13 @@
     </w:p>
     <w:p>
       <w:pPr>
-        <w:widowControl/>
-        <w:spacing w:after="40" w:line="240" w:lineRule="auto"/>
+        <w:keepNext w:val="0"/>
+        <w:pageBreakBefore w:val="0"/>
+        <w:spacing w:before="0" w:after="40" w:line="240" w:lineRule="auto"/>
       </w:pPr>
       <w:r>
         <w:rPr>
-          <w:rFonts w:ascii="Calibri" w:hAnsi="Calibri"/>
+          <w:rFonts w:ascii="Calibri" w:hAnsi="Calibri" w:eastAsia="Calibri"/>
           <w:b w:val="0"/>
           <w:color w:val="1A1A1A"/>
           <w:sz w:val="19"/>
@@ -1747,12 +1819,12 @@
     <w:p>
       <w:pPr>
         <w:keepNext/>
-        <w:widowControl/>
-        <w:spacing w:before="140" w:after="60"/>
+        <w:pageBreakBefore w:val="0"/>
+        <w:spacing w:before="140" w:after="60" w:line="240" w:lineRule="auto"/>
       </w:pPr>
       <w:r>
         <w:rPr>
-          <w:rFonts w:ascii="Calibri" w:hAnsi="Calibri"/>
+          <w:rFonts w:ascii="Calibri" w:hAnsi="Calibri" w:eastAsia="Calibri"/>
           <w:b/>
           <w:color w:val="2C2C2C"/>
           <w:sz w:val="21"/>
@@ -1762,12 +1834,13 @@
     </w:p>
     <w:p>
       <w:pPr>
-        <w:widowControl/>
-        <w:spacing w:after="10" w:line="240" w:lineRule="auto"/>
+        <w:keepNext w:val="0"/>
+        <w:pageBreakBefore w:val="0"/>
+        <w:spacing w:before="0" w:after="10" w:line="240" w:lineRule="auto"/>
       </w:pPr>
       <w:r>
         <w:rPr>
-          <w:rFonts w:ascii="Calibri" w:hAnsi="Calibri"/>
+          <w:rFonts w:ascii="Calibri" w:hAnsi="Calibri" w:eastAsia="Calibri"/>
           <w:b/>
           <w:color w:val="1A1A1A"/>
           <w:sz w:val="19"/>
@@ -1776,7 +1849,7 @@
       </w:r>
       <w:r>
         <w:rPr>
-          <w:rFonts w:ascii="Calibri" w:hAnsi="Calibri"/>
+          <w:rFonts w:ascii="Calibri" w:hAnsi="Calibri" w:eastAsia="Calibri"/>
           <w:b w:val="0"/>
           <w:color w:val="1A1A1A"/>
           <w:sz w:val="19"/>
@@ -1786,12 +1859,13 @@
     </w:p>
     <w:p>
       <w:pPr>
-        <w:widowControl/>
-        <w:spacing w:after="10" w:line="240" w:lineRule="auto"/>
+        <w:keepNext w:val="0"/>
+        <w:pageBreakBefore w:val="0"/>
+        <w:spacing w:before="0" w:after="10" w:line="240" w:lineRule="auto"/>
       </w:pPr>
       <w:r>
         <w:rPr>
-          <w:rFonts w:ascii="Calibri" w:hAnsi="Calibri"/>
+          <w:rFonts w:ascii="Calibri" w:hAnsi="Calibri" w:eastAsia="Calibri"/>
           <w:b/>
           <w:color w:val="1A1A1A"/>
           <w:sz w:val="19"/>
@@ -1800,7 +1874,7 @@
       </w:r>
       <w:r>
         <w:rPr>
-          <w:rFonts w:ascii="Calibri" w:hAnsi="Calibri"/>
+          <w:rFonts w:ascii="Calibri" w:hAnsi="Calibri" w:eastAsia="Calibri"/>
           <w:b w:val="0"/>
           <w:color w:val="1A1A1A"/>
           <w:sz w:val="19"/>
@@ -1810,12 +1884,13 @@
     </w:p>
     <w:p>
       <w:pPr>
-        <w:widowControl/>
-        <w:spacing w:after="10" w:line="240" w:lineRule="auto"/>
+        <w:keepNext w:val="0"/>
+        <w:pageBreakBefore w:val="0"/>
+        <w:spacing w:before="0" w:after="10" w:line="240" w:lineRule="auto"/>
       </w:pPr>
       <w:r>
         <w:rPr>
-          <w:rFonts w:ascii="Calibri" w:hAnsi="Calibri"/>
+          <w:rFonts w:ascii="Calibri" w:hAnsi="Calibri" w:eastAsia="Calibri"/>
           <w:b/>
           <w:color w:val="1A1A1A"/>
           <w:sz w:val="19"/>
@@ -1824,7 +1899,7 @@
       </w:r>
       <w:r>
         <w:rPr>
-          <w:rFonts w:ascii="Calibri" w:hAnsi="Calibri"/>
+          <w:rFonts w:ascii="Calibri" w:hAnsi="Calibri" w:eastAsia="Calibri"/>
           <w:b w:val="0"/>
           <w:color w:val="1A1A1A"/>
           <w:sz w:val="19"/>
@@ -1834,12 +1909,13 @@
     </w:p>
     <w:p>
       <w:pPr>
-        <w:widowControl/>
-        <w:spacing w:after="10" w:line="240" w:lineRule="auto"/>
+        <w:keepNext w:val="0"/>
+        <w:pageBreakBefore w:val="0"/>
+        <w:spacing w:before="0" w:after="10" w:line="240" w:lineRule="auto"/>
       </w:pPr>
       <w:r>
         <w:rPr>
-          <w:rFonts w:ascii="Calibri" w:hAnsi="Calibri"/>
+          <w:rFonts w:ascii="Calibri" w:hAnsi="Calibri" w:eastAsia="Calibri"/>
           <w:b/>
           <w:color w:val="1A1A1A"/>
           <w:sz w:val="19"/>
@@ -1848,7 +1924,7 @@
       </w:r>
       <w:r>
         <w:rPr>
-          <w:rFonts w:ascii="Calibri" w:hAnsi="Calibri"/>
+          <w:rFonts w:ascii="Calibri" w:hAnsi="Calibri" w:eastAsia="Calibri"/>
           <w:b w:val="0"/>
           <w:color w:val="1A1A1A"/>
           <w:sz w:val="19"/>
@@ -1858,12 +1934,13 @@
     </w:p>
     <w:p>
       <w:pPr>
-        <w:widowControl/>
-        <w:spacing w:after="10" w:line="240" w:lineRule="auto"/>
+        <w:keepNext w:val="0"/>
+        <w:pageBreakBefore w:val="0"/>
+        <w:spacing w:before="0" w:after="10" w:line="240" w:lineRule="auto"/>
       </w:pPr>
       <w:r>
         <w:rPr>
-          <w:rFonts w:ascii="Calibri" w:hAnsi="Calibri"/>
+          <w:rFonts w:ascii="Calibri" w:hAnsi="Calibri" w:eastAsia="Calibri"/>
           <w:b/>
           <w:color w:val="1A1A1A"/>
           <w:sz w:val="19"/>
@@ -1872,7 +1949,7 @@
       </w:r>
       <w:r>
         <w:rPr>
-          <w:rFonts w:ascii="Calibri" w:hAnsi="Calibri"/>
+          <w:rFonts w:ascii="Calibri" w:hAnsi="Calibri" w:eastAsia="Calibri"/>
           <w:b w:val="0"/>
           <w:color w:val="1A1A1A"/>
           <w:sz w:val="19"/>
@@ -1882,12 +1959,13 @@
     </w:p>
     <w:p>
       <w:pPr>
-        <w:widowControl/>
-        <w:spacing w:after="10" w:line="240" w:lineRule="auto"/>
+        <w:keepNext w:val="0"/>
+        <w:pageBreakBefore w:val="0"/>
+        <w:spacing w:before="0" w:after="10" w:line="240" w:lineRule="auto"/>
       </w:pPr>
       <w:r>
         <w:rPr>
-          <w:rFonts w:ascii="Calibri" w:hAnsi="Calibri"/>
+          <w:rFonts w:ascii="Calibri" w:hAnsi="Calibri" w:eastAsia="Calibri"/>
           <w:b/>
           <w:color w:val="1A1A1A"/>
           <w:sz w:val="19"/>
@@ -1896,7 +1974,7 @@
       </w:r>
       <w:r>
         <w:rPr>
-          <w:rFonts w:ascii="Calibri" w:hAnsi="Calibri"/>
+          <w:rFonts w:ascii="Calibri" w:hAnsi="Calibri" w:eastAsia="Calibri"/>
           <w:b w:val="0"/>
           <w:color w:val="1A1A1A"/>
           <w:sz w:val="19"/>
@@ -1906,12 +1984,13 @@
     </w:p>
     <w:p>
       <w:pPr>
-        <w:widowControl/>
-        <w:spacing w:after="10" w:line="240" w:lineRule="auto"/>
+        <w:keepNext w:val="0"/>
+        <w:pageBreakBefore w:val="0"/>
+        <w:spacing w:before="0" w:after="10" w:line="240" w:lineRule="auto"/>
       </w:pPr>
       <w:r>
         <w:rPr>
-          <w:rFonts w:ascii="Calibri" w:hAnsi="Calibri"/>
+          <w:rFonts w:ascii="Calibri" w:hAnsi="Calibri" w:eastAsia="Calibri"/>
           <w:b/>
           <w:color w:val="1A1A1A"/>
           <w:sz w:val="19"/>
@@ -1920,7 +1999,7 @@
       </w:r>
       <w:r>
         <w:rPr>
-          <w:rFonts w:ascii="Calibri" w:hAnsi="Calibri"/>
+          <w:rFonts w:ascii="Calibri" w:hAnsi="Calibri" w:eastAsia="Calibri"/>
           <w:b w:val="0"/>
           <w:color w:val="1A1A1A"/>
           <w:sz w:val="19"/>
@@ -1930,12 +2009,13 @@
     </w:p>
     <w:p>
       <w:pPr>
-        <w:widowControl/>
-        <w:spacing w:after="10" w:line="240" w:lineRule="auto"/>
+        <w:keepNext w:val="0"/>
+        <w:pageBreakBefore w:val="0"/>
+        <w:spacing w:before="0" w:after="10" w:line="240" w:lineRule="auto"/>
       </w:pPr>
       <w:r>
         <w:rPr>
-          <w:rFonts w:ascii="Calibri" w:hAnsi="Calibri"/>
+          <w:rFonts w:ascii="Calibri" w:hAnsi="Calibri" w:eastAsia="Calibri"/>
           <w:b/>
           <w:color w:val="1A1A1A"/>
           <w:sz w:val="19"/>
@@ -1944,7 +2024,7 @@
       </w:r>
       <w:r>
         <w:rPr>
-          <w:rFonts w:ascii="Calibri" w:hAnsi="Calibri"/>
+          <w:rFonts w:ascii="Calibri" w:hAnsi="Calibri" w:eastAsia="Calibri"/>
           <w:b w:val="0"/>
           <w:color w:val="1A1A1A"/>
           <w:sz w:val="19"/>
@@ -1954,12 +2034,13 @@
     </w:p>
     <w:p>
       <w:pPr>
-        <w:widowControl/>
-        <w:spacing w:after="10" w:line="240" w:lineRule="auto"/>
+        <w:keepNext w:val="0"/>
+        <w:pageBreakBefore w:val="0"/>
+        <w:spacing w:before="0" w:after="10" w:line="240" w:lineRule="auto"/>
       </w:pPr>
       <w:r>
         <w:rPr>
-          <w:rFonts w:ascii="Calibri" w:hAnsi="Calibri"/>
+          <w:rFonts w:ascii="Calibri" w:hAnsi="Calibri" w:eastAsia="Calibri"/>
           <w:b/>
           <w:color w:val="1A1A1A"/>
           <w:sz w:val="19"/>
@@ -1968,7 +2049,7 @@
       </w:r>
       <w:r>
         <w:rPr>
-          <w:rFonts w:ascii="Calibri" w:hAnsi="Calibri"/>
+          <w:rFonts w:ascii="Calibri" w:hAnsi="Calibri" w:eastAsia="Calibri"/>
           <w:b w:val="0"/>
           <w:color w:val="1A1A1A"/>
           <w:sz w:val="19"/>
@@ -1978,12 +2059,13 @@
     </w:p>
     <w:p>
       <w:pPr>
-        <w:widowControl/>
-        <w:spacing w:after="10" w:line="240" w:lineRule="auto"/>
+        <w:keepNext w:val="0"/>
+        <w:pageBreakBefore w:val="0"/>
+        <w:spacing w:before="0" w:after="10" w:line="240" w:lineRule="auto"/>
       </w:pPr>
       <w:r>
         <w:rPr>
-          <w:rFonts w:ascii="Calibri" w:hAnsi="Calibri"/>
+          <w:rFonts w:ascii="Calibri" w:hAnsi="Calibri" w:eastAsia="Calibri"/>
           <w:b/>
           <w:color w:val="1A1A1A"/>
           <w:sz w:val="19"/>
@@ -1992,7 +2074,7 @@
       </w:r>
       <w:r>
         <w:rPr>
-          <w:rFonts w:ascii="Calibri" w:hAnsi="Calibri"/>
+          <w:rFonts w:ascii="Calibri" w:hAnsi="Calibri" w:eastAsia="Calibri"/>
           <w:b w:val="0"/>
           <w:color w:val="1A1A1A"/>
           <w:sz w:val="19"/>
@@ -2003,12 +2085,12 @@
     <w:p>
       <w:pPr>
         <w:keepNext/>
-        <w:widowControl/>
-        <w:spacing w:before="140" w:after="60"/>
+        <w:pageBreakBefore w:val="0"/>
+        <w:spacing w:before="140" w:after="60" w:line="240" w:lineRule="auto"/>
       </w:pPr>
       <w:r>
         <w:rPr>
-          <w:rFonts w:ascii="Calibri" w:hAnsi="Calibri"/>
+          <w:rFonts w:ascii="Calibri" w:hAnsi="Calibri" w:eastAsia="Calibri"/>
           <w:b/>
           <w:color w:val="2C2C2C"/>
           <w:sz w:val="21"/>
@@ -2019,13 +2101,14 @@
     <w:p>
       <w:pPr>
         <w:pStyle w:val="ListBullet"/>
-        <w:widowControl/>
+        <w:keepNext w:val="0"/>
+        <w:pageBreakBefore w:val="0"/>
         <w:spacing w:before="0" w:after="10" w:line="240" w:lineRule="auto"/>
         <w:ind w:left="288"/>
       </w:pPr>
       <w:r>
         <w:rPr>
-          <w:rFonts w:ascii="Calibri" w:hAnsi="Calibri"/>
+          <w:rFonts w:ascii="Calibri" w:hAnsi="Calibri" w:eastAsia="Calibri"/>
           <w:b w:val="0"/>
           <w:color w:val="1A1A1A"/>
           <w:sz w:val="19"/>
@@ -2036,13 +2119,14 @@
     <w:p>
       <w:pPr>
         <w:pStyle w:val="ListBullet"/>
-        <w:widowControl/>
+        <w:keepNext w:val="0"/>
+        <w:pageBreakBefore w:val="0"/>
         <w:spacing w:before="0" w:after="10" w:line="240" w:lineRule="auto"/>
         <w:ind w:left="288"/>
       </w:pPr>
       <w:r>
         <w:rPr>
-          <w:rFonts w:ascii="Calibri" w:hAnsi="Calibri"/>
+          <w:rFonts w:ascii="Calibri" w:hAnsi="Calibri" w:eastAsia="Calibri"/>
           <w:b w:val="0"/>
           <w:color w:val="1A1A1A"/>
           <w:sz w:val="19"/>
@@ -2053,12 +2137,12 @@
     <w:p>
       <w:pPr>
         <w:keepNext/>
-        <w:widowControl/>
-        <w:spacing w:before="140" w:after="60"/>
+        <w:pageBreakBefore w:val="0"/>
+        <w:spacing w:before="140" w:after="60" w:line="240" w:lineRule="auto"/>
       </w:pPr>
       <w:r>
         <w:rPr>
-          <w:rFonts w:ascii="Calibri" w:hAnsi="Calibri"/>
+          <w:rFonts w:ascii="Calibri" w:hAnsi="Calibri" w:eastAsia="Calibri"/>
           <w:b/>
           <w:color w:val="2C2C2C"/>
           <w:sz w:val="21"/>
@@ -2069,15 +2153,15 @@
     <w:p>
       <w:pPr>
         <w:keepNext/>
-        <w:widowControl/>
+        <w:pageBreakBefore w:val="0"/>
         <w:tabs>
           <w:tab w:pos="10224" w:val="right"/>
         </w:tabs>
-        <w:spacing w:before="100" w:after="20"/>
+        <w:spacing w:before="100" w:after="20" w:line="240" w:lineRule="auto"/>
       </w:pPr>
       <w:r>
         <w:rPr>
-          <w:rFonts w:ascii="Calibri" w:hAnsi="Calibri"/>
+          <w:rFonts w:ascii="Calibri" w:hAnsi="Calibri" w:eastAsia="Calibri"/>
           <w:b/>
           <w:color w:val="1A1A1A"/>
           <w:sz w:val="21"/>
@@ -2086,7 +2170,7 @@
       </w:r>
       <w:r>
         <w:rPr>
-          <w:rFonts w:ascii="Calibri" w:hAnsi="Calibri"/>
+          <w:rFonts w:ascii="Calibri" w:hAnsi="Calibri" w:eastAsia="Calibri"/>
           <w:b w:val="0"/>
           <w:color w:val="4A4A4A"/>
           <w:sz w:val="19"/>
@@ -2098,13 +2182,14 @@
     <w:p>
       <w:pPr>
         <w:pStyle w:val="ListBullet"/>
-        <w:widowControl/>
+        <w:keepNext w:val="0"/>
+        <w:pageBreakBefore w:val="0"/>
         <w:spacing w:before="0" w:after="10" w:line="240" w:lineRule="auto"/>
         <w:ind w:left="288"/>
       </w:pPr>
       <w:r>
         <w:rPr>
-          <w:rFonts w:ascii="Calibri" w:hAnsi="Calibri"/>
+          <w:rFonts w:ascii="Calibri" w:hAnsi="Calibri" w:eastAsia="Calibri"/>
           <w:b w:val="0"/>
           <w:color w:val="1A1A1A"/>
           <w:sz w:val="19"/>
@@ -2115,13 +2200,14 @@
     <w:p>
       <w:pPr>
         <w:pStyle w:val="ListBullet"/>
-        <w:widowControl/>
+        <w:keepNext w:val="0"/>
+        <w:pageBreakBefore w:val="0"/>
         <w:spacing w:before="0" w:after="10" w:line="240" w:lineRule="auto"/>
         <w:ind w:left="288"/>
       </w:pPr>
       <w:r>
         <w:rPr>
-          <w:rFonts w:ascii="Calibri" w:hAnsi="Calibri"/>
+          <w:rFonts w:ascii="Calibri" w:hAnsi="Calibri" w:eastAsia="Calibri"/>
           <w:b w:val="0"/>
           <w:color w:val="1A1A1A"/>
           <w:sz w:val="19"/>

</xml_diff>

<commit_message>
Update resume links and files for improved accessibility
- Replaced the old resume link with a new link to the "resume-full-stack.pdf" across multiple content files for better clarity.
- Deleted the outdated "resume.pdf" file to streamline content management.
- Added the new "resume-full-stack.pdf" file to the public directory.
- Updated the Next.js routing configuration to redirect requests from "/resume.pdf" to "/resume-full-stack.pdf".
</commit_message>
<xml_diff>
--- a/apps/web/src/features/resume/wilsonchow_resume_v4_full-stack.docx
+++ b/apps/web/src/features/resume/wilsonchow_resume_v4_full-stack.docx
@@ -11,7 +11,7 @@
       </w:pPr>
       <w:r>
         <w:rPr>
-          <w:rFonts w:ascii="Calibri" w:hAnsi="Calibri" w:eastAsia="Calibri"/>
+          <w:rFonts w:ascii="Calibri" w:hAnsi="Calibri" w:eastAsia="Calibri" w:cs="Calibri"/>
           <w:b/>
           <w:color w:val="1A1A1A"/>
           <w:sz w:val="44"/>
@@ -23,15 +23,15 @@
       <w:pPr>
         <w:keepNext w:val="0"/>
         <w:pageBreakBefore w:val="0"/>
-        <w:spacing w:before="0" w:after="40" w:line="240" w:lineRule="auto"/>
+        <w:spacing w:before="0" w:after="20" w:line="240" w:lineRule="auto"/>
         <w:jc w:val="center"/>
       </w:pPr>
       <w:r>
         <w:rPr>
-          <w:rFonts w:ascii="Calibri" w:hAnsi="Calibri" w:eastAsia="Calibri"/>
+          <w:rFonts w:ascii="Calibri" w:hAnsi="Calibri" w:eastAsia="Calibri" w:cs="Calibri"/>
           <w:b w:val="0"/>
           <w:color w:val="4A4A4A"/>
-          <w:sz w:val="18"/>
+          <w:sz w:val="19"/>
         </w:rPr>
         <w:t>sinlongchow@gmail.com  ·  slchow.com  ·  linkedin.com/in/wilsonslchow  ·  github.com/ocwilsonchow</w:t>
       </w:r>
@@ -40,15 +40,15 @@
       <w:pPr>
         <w:keepNext w:val="0"/>
         <w:pageBreakBefore w:val="0"/>
-        <w:spacing w:before="0" w:after="40" w:line="240" w:lineRule="auto"/>
+        <w:spacing w:before="0" w:after="20" w:line="240" w:lineRule="auto"/>
         <w:jc w:val="center"/>
       </w:pPr>
       <w:r>
         <w:rPr>
-          <w:rFonts w:ascii="Calibri" w:hAnsi="Calibri" w:eastAsia="Calibri"/>
+          <w:rFonts w:ascii="Calibri" w:hAnsi="Calibri" w:eastAsia="Calibri" w:cs="Calibri"/>
           <w:b/>
           <w:color w:val="2C2C2C"/>
-          <w:sz w:val="19"/>
+          <w:sz w:val="20"/>
         </w:rPr>
         <w:t>Full-Stack Software Engineer  ·  AWS Certified Solutions Architect – Associate</w:t>
       </w:r>
@@ -57,14 +57,17 @@
       <w:pPr>
         <w:keepNext/>
         <w:pageBreakBefore w:val="0"/>
-        <w:spacing w:before="140" w:after="60" w:line="240" w:lineRule="auto"/>
+        <w:spacing w:before="100" w:after="40" w:line="240" w:lineRule="auto"/>
+        <w:pBdr>
+          <w:bottom w:val="single" w:sz="12" w:space="1" w:color="2C2C2C"/>
+        </w:pBdr>
       </w:pPr>
       <w:r>
         <w:rPr>
-          <w:rFonts w:ascii="Calibri" w:hAnsi="Calibri" w:eastAsia="Calibri"/>
+          <w:rFonts w:ascii="Calibri" w:hAnsi="Calibri" w:eastAsia="Calibri" w:cs="Calibri"/>
           <w:b/>
           <w:color w:val="2C2C2C"/>
-          <w:sz w:val="21"/>
+          <w:sz w:val="22"/>
         </w:rPr>
         <w:t>SUMMARY</w:t>
       </w:r>
@@ -73,140 +76,140 @@
       <w:pPr>
         <w:keepNext w:val="0"/>
         <w:pageBreakBefore w:val="0"/>
-        <w:spacing w:before="0" w:after="40" w:line="240" w:lineRule="auto"/>
+        <w:spacing w:before="0" w:after="28" w:line="240" w:lineRule="auto"/>
       </w:pPr>
       <w:r>
         <w:rPr>
-          <w:rFonts w:ascii="Calibri" w:hAnsi="Calibri" w:eastAsia="Calibri"/>
+          <w:rFonts w:ascii="Calibri" w:hAnsi="Calibri" w:eastAsia="Calibri" w:cs="Calibri"/>
           <w:b w:val="0"/>
           <w:color w:val="1A1A1A"/>
-          <w:sz w:val="19"/>
+          <w:sz w:val="20"/>
         </w:rPr>
         <w:t xml:space="preserve">Full-stack </w:t>
       </w:r>
       <w:r>
         <w:rPr>
-          <w:rFonts w:ascii="Calibri" w:hAnsi="Calibri" w:eastAsia="Calibri"/>
+          <w:rFonts w:ascii="Calibri" w:hAnsi="Calibri" w:eastAsia="Calibri" w:cs="Calibri"/>
           <w:b/>
           <w:color w:val="1A1A1A"/>
-          <w:sz w:val="19"/>
+          <w:sz w:val="20"/>
         </w:rPr>
         <w:t>software engineer</w:t>
       </w:r>
       <w:r>
         <w:rPr>
-          <w:rFonts w:ascii="Calibri" w:hAnsi="Calibri" w:eastAsia="Calibri"/>
+          <w:rFonts w:ascii="Calibri" w:hAnsi="Calibri" w:eastAsia="Calibri" w:cs="Calibri"/>
           <w:b w:val="0"/>
           <w:color w:val="1A1A1A"/>
-          <w:sz w:val="19"/>
+          <w:sz w:val="20"/>
         </w:rPr>
         <w:t xml:space="preserve"> with </w:t>
       </w:r>
       <w:r>
         <w:rPr>
-          <w:rFonts w:ascii="Calibri" w:hAnsi="Calibri" w:eastAsia="Calibri"/>
+          <w:rFonts w:ascii="Calibri" w:hAnsi="Calibri" w:eastAsia="Calibri" w:cs="Calibri"/>
           <w:b/>
           <w:color w:val="1A1A1A"/>
-          <w:sz w:val="19"/>
+          <w:sz w:val="20"/>
         </w:rPr>
         <w:t>5 years of experience</w:t>
       </w:r>
       <w:r>
         <w:rPr>
-          <w:rFonts w:ascii="Calibri" w:hAnsi="Calibri" w:eastAsia="Calibri"/>
+          <w:rFonts w:ascii="Calibri" w:hAnsi="Calibri" w:eastAsia="Calibri" w:cs="Calibri"/>
           <w:b w:val="0"/>
           <w:color w:val="1A1A1A"/>
-          <w:sz w:val="19"/>
+          <w:sz w:val="20"/>
         </w:rPr>
         <w:t xml:space="preserve"> delivering </w:t>
       </w:r>
       <w:r>
         <w:rPr>
-          <w:rFonts w:ascii="Calibri" w:hAnsi="Calibri" w:eastAsia="Calibri"/>
+          <w:rFonts w:ascii="Calibri" w:hAnsi="Calibri" w:eastAsia="Calibri" w:cs="Calibri"/>
           <w:b/>
           <w:color w:val="1A1A1A"/>
-          <w:sz w:val="19"/>
+          <w:sz w:val="20"/>
         </w:rPr>
         <w:t>15+</w:t>
       </w:r>
       <w:r>
         <w:rPr>
-          <w:rFonts w:ascii="Calibri" w:hAnsi="Calibri" w:eastAsia="Calibri"/>
+          <w:rFonts w:ascii="Calibri" w:hAnsi="Calibri" w:eastAsia="Calibri" w:cs="Calibri"/>
           <w:b w:val="0"/>
           <w:color w:val="1A1A1A"/>
-          <w:sz w:val="19"/>
+          <w:sz w:val="20"/>
         </w:rPr>
         <w:t xml:space="preserve"> React and React Native products from Figma through Node.js APIs and AWS, including Apple App Store and Google Play releases. Cut load times by </w:t>
       </w:r>
       <w:r>
         <w:rPr>
-          <w:rFonts w:ascii="Calibri" w:hAnsi="Calibri" w:eastAsia="Calibri"/>
+          <w:rFonts w:ascii="Calibri" w:hAnsi="Calibri" w:eastAsia="Calibri" w:cs="Calibri"/>
           <w:b/>
           <w:color w:val="1A1A1A"/>
-          <w:sz w:val="19"/>
+          <w:sz w:val="20"/>
         </w:rPr>
         <w:t>80%</w:t>
       </w:r>
       <w:r>
         <w:rPr>
-          <w:rFonts w:ascii="Calibri" w:hAnsi="Calibri" w:eastAsia="Calibri"/>
+          <w:rFonts w:ascii="Calibri" w:hAnsi="Calibri" w:eastAsia="Calibri" w:cs="Calibri"/>
           <w:b w:val="0"/>
           <w:color w:val="1A1A1A"/>
-          <w:sz w:val="19"/>
+          <w:sz w:val="20"/>
         </w:rPr>
         <w:t xml:space="preserve"> and search latency by </w:t>
       </w:r>
       <w:r>
         <w:rPr>
-          <w:rFonts w:ascii="Calibri" w:hAnsi="Calibri" w:eastAsia="Calibri"/>
+          <w:rFonts w:ascii="Calibri" w:hAnsi="Calibri" w:eastAsia="Calibri" w:cs="Calibri"/>
           <w:b/>
           <w:color w:val="1A1A1A"/>
-          <w:sz w:val="19"/>
+          <w:sz w:val="20"/>
         </w:rPr>
         <w:t>90%</w:t>
       </w:r>
       <w:r>
         <w:rPr>
-          <w:rFonts w:ascii="Calibri" w:hAnsi="Calibri" w:eastAsia="Calibri"/>
+          <w:rFonts w:ascii="Calibri" w:hAnsi="Calibri" w:eastAsia="Calibri" w:cs="Calibri"/>
           <w:b w:val="0"/>
           <w:color w:val="1A1A1A"/>
-          <w:sz w:val="19"/>
+          <w:sz w:val="20"/>
         </w:rPr>
         <w:t xml:space="preserve">. Now leading a multi-channel </w:t>
       </w:r>
       <w:r>
         <w:rPr>
-          <w:rFonts w:ascii="Calibri" w:hAnsi="Calibri" w:eastAsia="Calibri"/>
+          <w:rFonts w:ascii="Calibri" w:hAnsi="Calibri" w:eastAsia="Calibri" w:cs="Calibri"/>
           <w:b/>
           <w:color w:val="1A1A1A"/>
-          <w:sz w:val="19"/>
+          <w:sz w:val="20"/>
         </w:rPr>
         <w:t>Generative AI</w:t>
       </w:r>
       <w:r>
         <w:rPr>
-          <w:rFonts w:ascii="Calibri" w:hAnsi="Calibri" w:eastAsia="Calibri"/>
+          <w:rFonts w:ascii="Calibri" w:hAnsi="Calibri" w:eastAsia="Calibri" w:cs="Calibri"/>
           <w:b w:val="0"/>
           <w:color w:val="1A1A1A"/>
-          <w:sz w:val="19"/>
+          <w:sz w:val="20"/>
         </w:rPr>
         <w:t xml:space="preserve"> platform with durable workflows, memory, RAG, and evals. </w:t>
       </w:r>
       <w:r>
         <w:rPr>
-          <w:rFonts w:ascii="Calibri" w:hAnsi="Calibri" w:eastAsia="Calibri"/>
+          <w:rFonts w:ascii="Calibri" w:hAnsi="Calibri" w:eastAsia="Calibri" w:cs="Calibri"/>
           <w:b/>
           <w:color w:val="1A1A1A"/>
-          <w:sz w:val="19"/>
+          <w:sz w:val="20"/>
         </w:rPr>
         <w:t>AWS Certified Solutions Architect – Associate</w:t>
       </w:r>
       <w:r>
         <w:rPr>
-          <w:rFonts w:ascii="Calibri" w:hAnsi="Calibri" w:eastAsia="Calibri"/>
+          <w:rFonts w:ascii="Calibri" w:hAnsi="Calibri" w:eastAsia="Calibri" w:cs="Calibri"/>
           <w:b w:val="0"/>
           <w:color w:val="1A1A1A"/>
-          <w:sz w:val="19"/>
+          <w:sz w:val="20"/>
         </w:rPr>
         <w:t>.</w:t>
       </w:r>
@@ -215,14 +218,17 @@
       <w:pPr>
         <w:keepNext/>
         <w:pageBreakBefore w:val="0"/>
-        <w:spacing w:before="140" w:after="60" w:line="240" w:lineRule="auto"/>
+        <w:spacing w:before="100" w:after="40" w:line="240" w:lineRule="auto"/>
+        <w:pBdr>
+          <w:bottom w:val="single" w:sz="12" w:space="1" w:color="2C2C2C"/>
+        </w:pBdr>
       </w:pPr>
       <w:r>
         <w:rPr>
-          <w:rFonts w:ascii="Calibri" w:hAnsi="Calibri" w:eastAsia="Calibri"/>
+          <w:rFonts w:ascii="Calibri" w:hAnsi="Calibri" w:eastAsia="Calibri" w:cs="Calibri"/>
           <w:b/>
           <w:color w:val="2C2C2C"/>
-          <w:sz w:val="21"/>
+          <w:sz w:val="22"/>
         </w:rPr>
         <w:t>EXPERIENCE</w:t>
       </w:r>
@@ -234,23 +240,23 @@
         <w:tabs>
           <w:tab w:pos="10224" w:val="right"/>
         </w:tabs>
-        <w:spacing w:before="100" w:after="20" w:line="240" w:lineRule="auto"/>
+        <w:spacing w:before="80" w:after="12" w:line="240" w:lineRule="auto"/>
       </w:pPr>
       <w:r>
         <w:rPr>
-          <w:rFonts w:ascii="Calibri" w:hAnsi="Calibri" w:eastAsia="Calibri"/>
+          <w:rFonts w:ascii="Calibri" w:hAnsi="Calibri" w:eastAsia="Calibri" w:cs="Calibri"/>
           <w:b/>
           <w:color w:val="1A1A1A"/>
-          <w:sz w:val="21"/>
+          <w:sz w:val="22"/>
         </w:rPr>
         <w:t>Software Developer, Vioo Company Limited</w:t>
       </w:r>
       <w:r>
         <w:rPr>
-          <w:rFonts w:ascii="Calibri" w:hAnsi="Calibri" w:eastAsia="Calibri"/>
+          <w:rFonts w:ascii="Calibri" w:hAnsi="Calibri" w:eastAsia="Calibri" w:cs="Calibri"/>
           <w:b w:val="0"/>
           <w:color w:val="4A4A4A"/>
-          <w:sz w:val="19"/>
+          <w:sz w:val="20"/>
         </w:rPr>
         <w:tab/>
         <w:t>May 2022 – Present</w:t>
@@ -260,14 +266,14 @@
       <w:pPr>
         <w:keepNext w:val="0"/>
         <w:pageBreakBefore w:val="0"/>
-        <w:spacing w:before="0" w:after="20" w:line="240" w:lineRule="auto"/>
+        <w:spacing w:before="0" w:after="16" w:line="240" w:lineRule="auto"/>
       </w:pPr>
       <w:r>
         <w:rPr>
-          <w:rFonts w:ascii="Calibri" w:hAnsi="Calibri" w:eastAsia="Calibri"/>
+          <w:rFonts w:ascii="Calibri" w:hAnsi="Calibri" w:eastAsia="Calibri" w:cs="Calibri"/>
           <w:b w:val="0"/>
           <w:color w:val="4A4A4A"/>
-          <w:sz w:val="18"/>
+          <w:sz w:val="19"/>
         </w:rPr>
         <w:t>Primary engineer for concurrent client products, owning delivery from UX scoping through cloud deployment.</w:t>
       </w:r>
@@ -277,12 +283,12 @@
         <w:pStyle w:val="ListBullet"/>
         <w:keepNext w:val="0"/>
         <w:pageBreakBefore w:val="0"/>
-        <w:spacing w:before="0" w:after="10" w:line="240" w:lineRule="auto"/>
+        <w:spacing w:before="0" w:after="8" w:line="240" w:lineRule="auto"/>
         <w:ind w:left="288"/>
       </w:pPr>
       <w:r>
         <w:rPr>
-          <w:rFonts w:ascii="Calibri" w:hAnsi="Calibri" w:eastAsia="Calibri"/>
+          <w:rFonts w:ascii="Calibri" w:hAnsi="Calibri" w:eastAsia="Calibri" w:cs="Calibri"/>
           <w:b w:val="0"/>
           <w:color w:val="1A1A1A"/>
           <w:sz w:val="19"/>
@@ -291,7 +297,7 @@
       </w:r>
       <w:r>
         <w:rPr>
-          <w:rFonts w:ascii="Calibri" w:hAnsi="Calibri" w:eastAsia="Calibri"/>
+          <w:rFonts w:ascii="Calibri" w:hAnsi="Calibri" w:eastAsia="Calibri" w:cs="Calibri"/>
           <w:b/>
           <w:color w:val="1A1A1A"/>
           <w:sz w:val="19"/>
@@ -300,7 +306,7 @@
       </w:r>
       <w:r>
         <w:rPr>
-          <w:rFonts w:ascii="Calibri" w:hAnsi="Calibri" w:eastAsia="Calibri"/>
+          <w:rFonts w:ascii="Calibri" w:hAnsi="Calibri" w:eastAsia="Calibri" w:cs="Calibri"/>
           <w:b w:val="0"/>
           <w:color w:val="1A1A1A"/>
           <w:sz w:val="19"/>
@@ -313,12 +319,12 @@
         <w:pStyle w:val="ListBullet"/>
         <w:keepNext w:val="0"/>
         <w:pageBreakBefore w:val="0"/>
-        <w:spacing w:before="0" w:after="10" w:line="240" w:lineRule="auto"/>
+        <w:spacing w:before="0" w:after="8" w:line="240" w:lineRule="auto"/>
         <w:ind w:left="288"/>
       </w:pPr>
       <w:r>
         <w:rPr>
-          <w:rFonts w:ascii="Calibri" w:hAnsi="Calibri" w:eastAsia="Calibri"/>
+          <w:rFonts w:ascii="Calibri" w:hAnsi="Calibri" w:eastAsia="Calibri" w:cs="Calibri"/>
           <w:b w:val="0"/>
           <w:color w:val="1A1A1A"/>
           <w:sz w:val="19"/>
@@ -327,7 +333,7 @@
       </w:r>
       <w:r>
         <w:rPr>
-          <w:rFonts w:ascii="Calibri" w:hAnsi="Calibri" w:eastAsia="Calibri"/>
+          <w:rFonts w:ascii="Calibri" w:hAnsi="Calibri" w:eastAsia="Calibri" w:cs="Calibri"/>
           <w:b/>
           <w:color w:val="1A1A1A"/>
           <w:sz w:val="19"/>
@@ -336,7 +342,7 @@
       </w:r>
       <w:r>
         <w:rPr>
-          <w:rFonts w:ascii="Calibri" w:hAnsi="Calibri" w:eastAsia="Calibri"/>
+          <w:rFonts w:ascii="Calibri" w:hAnsi="Calibri" w:eastAsia="Calibri" w:cs="Calibri"/>
           <w:b w:val="0"/>
           <w:color w:val="1A1A1A"/>
           <w:sz w:val="19"/>
@@ -345,7 +351,7 @@
       </w:r>
       <w:r>
         <w:rPr>
-          <w:rFonts w:ascii="Calibri" w:hAnsi="Calibri" w:eastAsia="Calibri"/>
+          <w:rFonts w:ascii="Calibri" w:hAnsi="Calibri" w:eastAsia="Calibri" w:cs="Calibri"/>
           <w:b/>
           <w:color w:val="1A1A1A"/>
           <w:sz w:val="19"/>
@@ -354,7 +360,7 @@
       </w:r>
       <w:r>
         <w:rPr>
-          <w:rFonts w:ascii="Calibri" w:hAnsi="Calibri" w:eastAsia="Calibri"/>
+          <w:rFonts w:ascii="Calibri" w:hAnsi="Calibri" w:eastAsia="Calibri" w:cs="Calibri"/>
           <w:b w:val="0"/>
           <w:color w:val="1A1A1A"/>
           <w:sz w:val="19"/>
@@ -363,7 +369,7 @@
       </w:r>
       <w:r>
         <w:rPr>
-          <w:rFonts w:ascii="Calibri" w:hAnsi="Calibri" w:eastAsia="Calibri"/>
+          <w:rFonts w:ascii="Calibri" w:hAnsi="Calibri" w:eastAsia="Calibri" w:cs="Calibri"/>
           <w:b/>
           <w:color w:val="1A1A1A"/>
           <w:sz w:val="19"/>
@@ -372,7 +378,7 @@
       </w:r>
       <w:r>
         <w:rPr>
-          <w:rFonts w:ascii="Calibri" w:hAnsi="Calibri" w:eastAsia="Calibri"/>
+          <w:rFonts w:ascii="Calibri" w:hAnsi="Calibri" w:eastAsia="Calibri" w:cs="Calibri"/>
           <w:b w:val="0"/>
           <w:color w:val="1A1A1A"/>
           <w:sz w:val="19"/>
@@ -381,7 +387,7 @@
       </w:r>
       <w:r>
         <w:rPr>
-          <w:rFonts w:ascii="Calibri" w:hAnsi="Calibri" w:eastAsia="Calibri"/>
+          <w:rFonts w:ascii="Calibri" w:hAnsi="Calibri" w:eastAsia="Calibri" w:cs="Calibri"/>
           <w:b/>
           <w:color w:val="1A1A1A"/>
           <w:sz w:val="19"/>
@@ -390,7 +396,7 @@
       </w:r>
       <w:r>
         <w:rPr>
-          <w:rFonts w:ascii="Calibri" w:hAnsi="Calibri" w:eastAsia="Calibri"/>
+          <w:rFonts w:ascii="Calibri" w:hAnsi="Calibri" w:eastAsia="Calibri" w:cs="Calibri"/>
           <w:b w:val="0"/>
           <w:color w:val="1A1A1A"/>
           <w:sz w:val="19"/>
@@ -399,7 +405,7 @@
       </w:r>
       <w:r>
         <w:rPr>
-          <w:rFonts w:ascii="Calibri" w:hAnsi="Calibri" w:eastAsia="Calibri"/>
+          <w:rFonts w:ascii="Calibri" w:hAnsi="Calibri" w:eastAsia="Calibri" w:cs="Calibri"/>
           <w:b/>
           <w:color w:val="1A1A1A"/>
           <w:sz w:val="19"/>
@@ -408,7 +414,7 @@
       </w:r>
       <w:r>
         <w:rPr>
-          <w:rFonts w:ascii="Calibri" w:hAnsi="Calibri" w:eastAsia="Calibri"/>
+          <w:rFonts w:ascii="Calibri" w:hAnsi="Calibri" w:eastAsia="Calibri" w:cs="Calibri"/>
           <w:b w:val="0"/>
           <w:color w:val="1A1A1A"/>
           <w:sz w:val="19"/>
@@ -421,12 +427,12 @@
         <w:pStyle w:val="ListBullet"/>
         <w:keepNext w:val="0"/>
         <w:pageBreakBefore w:val="0"/>
-        <w:spacing w:before="0" w:after="10" w:line="240" w:lineRule="auto"/>
+        <w:spacing w:before="0" w:after="8" w:line="240" w:lineRule="auto"/>
         <w:ind w:left="288"/>
       </w:pPr>
       <w:r>
         <w:rPr>
-          <w:rFonts w:ascii="Calibri" w:hAnsi="Calibri" w:eastAsia="Calibri"/>
+          <w:rFonts w:ascii="Calibri" w:hAnsi="Calibri" w:eastAsia="Calibri" w:cs="Calibri"/>
           <w:b w:val="0"/>
           <w:color w:val="1A1A1A"/>
           <w:sz w:val="19"/>
@@ -435,7 +441,7 @@
       </w:r>
       <w:r>
         <w:rPr>
-          <w:rFonts w:ascii="Calibri" w:hAnsi="Calibri" w:eastAsia="Calibri"/>
+          <w:rFonts w:ascii="Calibri" w:hAnsi="Calibri" w:eastAsia="Calibri" w:cs="Calibri"/>
           <w:b/>
           <w:color w:val="1A1A1A"/>
           <w:sz w:val="19"/>
@@ -444,7 +450,7 @@
       </w:r>
       <w:r>
         <w:rPr>
-          <w:rFonts w:ascii="Calibri" w:hAnsi="Calibri" w:eastAsia="Calibri"/>
+          <w:rFonts w:ascii="Calibri" w:hAnsi="Calibri" w:eastAsia="Calibri" w:cs="Calibri"/>
           <w:b w:val="0"/>
           <w:color w:val="1A1A1A"/>
           <w:sz w:val="19"/>
@@ -457,12 +463,12 @@
         <w:pStyle w:val="ListBullet"/>
         <w:keepNext w:val="0"/>
         <w:pageBreakBefore w:val="0"/>
-        <w:spacing w:before="0" w:after="10" w:line="240" w:lineRule="auto"/>
+        <w:spacing w:before="0" w:after="8" w:line="240" w:lineRule="auto"/>
         <w:ind w:left="288"/>
       </w:pPr>
       <w:r>
         <w:rPr>
-          <w:rFonts w:ascii="Calibri" w:hAnsi="Calibri" w:eastAsia="Calibri"/>
+          <w:rFonts w:ascii="Calibri" w:hAnsi="Calibri" w:eastAsia="Calibri" w:cs="Calibri"/>
           <w:b w:val="0"/>
           <w:color w:val="1A1A1A"/>
           <w:sz w:val="19"/>
@@ -471,7 +477,7 @@
       </w:r>
       <w:r>
         <w:rPr>
-          <w:rFonts w:ascii="Calibri" w:hAnsi="Calibri" w:eastAsia="Calibri"/>
+          <w:rFonts w:ascii="Calibri" w:hAnsi="Calibri" w:eastAsia="Calibri" w:cs="Calibri"/>
           <w:b/>
           <w:color w:val="1A1A1A"/>
           <w:sz w:val="19"/>
@@ -480,7 +486,7 @@
       </w:r>
       <w:r>
         <w:rPr>
-          <w:rFonts w:ascii="Calibri" w:hAnsi="Calibri" w:eastAsia="Calibri"/>
+          <w:rFonts w:ascii="Calibri" w:hAnsi="Calibri" w:eastAsia="Calibri" w:cs="Calibri"/>
           <w:b w:val="0"/>
           <w:color w:val="1A1A1A"/>
           <w:sz w:val="19"/>
@@ -489,7 +495,7 @@
       </w:r>
       <w:r>
         <w:rPr>
-          <w:rFonts w:ascii="Calibri" w:hAnsi="Calibri" w:eastAsia="Calibri"/>
+          <w:rFonts w:ascii="Calibri" w:hAnsi="Calibri" w:eastAsia="Calibri" w:cs="Calibri"/>
           <w:b/>
           <w:color w:val="1A1A1A"/>
           <w:sz w:val="19"/>
@@ -498,7 +504,7 @@
       </w:r>
       <w:r>
         <w:rPr>
-          <w:rFonts w:ascii="Calibri" w:hAnsi="Calibri" w:eastAsia="Calibri"/>
+          <w:rFonts w:ascii="Calibri" w:hAnsi="Calibri" w:eastAsia="Calibri" w:cs="Calibri"/>
           <w:b w:val="0"/>
           <w:color w:val="1A1A1A"/>
           <w:sz w:val="19"/>
@@ -507,7 +513,7 @@
       </w:r>
       <w:r>
         <w:rPr>
-          <w:rFonts w:ascii="Calibri" w:hAnsi="Calibri" w:eastAsia="Calibri"/>
+          <w:rFonts w:ascii="Calibri" w:hAnsi="Calibri" w:eastAsia="Calibri" w:cs="Calibri"/>
           <w:b/>
           <w:color w:val="1A1A1A"/>
           <w:sz w:val="19"/>
@@ -516,7 +522,7 @@
       </w:r>
       <w:r>
         <w:rPr>
-          <w:rFonts w:ascii="Calibri" w:hAnsi="Calibri" w:eastAsia="Calibri"/>
+          <w:rFonts w:ascii="Calibri" w:hAnsi="Calibri" w:eastAsia="Calibri" w:cs="Calibri"/>
           <w:b w:val="0"/>
           <w:color w:val="1A1A1A"/>
           <w:sz w:val="19"/>
@@ -525,7 +531,7 @@
       </w:r>
       <w:r>
         <w:rPr>
-          <w:rFonts w:ascii="Calibri" w:hAnsi="Calibri" w:eastAsia="Calibri"/>
+          <w:rFonts w:ascii="Calibri" w:hAnsi="Calibri" w:eastAsia="Calibri" w:cs="Calibri"/>
           <w:b/>
           <w:color w:val="1A1A1A"/>
           <w:sz w:val="19"/>
@@ -534,7 +540,7 @@
       </w:r>
       <w:r>
         <w:rPr>
-          <w:rFonts w:ascii="Calibri" w:hAnsi="Calibri" w:eastAsia="Calibri"/>
+          <w:rFonts w:ascii="Calibri" w:hAnsi="Calibri" w:eastAsia="Calibri" w:cs="Calibri"/>
           <w:b w:val="0"/>
           <w:color w:val="1A1A1A"/>
           <w:sz w:val="19"/>
@@ -547,12 +553,12 @@
         <w:pStyle w:val="ListBullet"/>
         <w:keepNext w:val="0"/>
         <w:pageBreakBefore w:val="0"/>
-        <w:spacing w:before="0" w:after="10" w:line="240" w:lineRule="auto"/>
+        <w:spacing w:before="0" w:after="8" w:line="240" w:lineRule="auto"/>
         <w:ind w:left="288"/>
       </w:pPr>
       <w:r>
         <w:rPr>
-          <w:rFonts w:ascii="Calibri" w:hAnsi="Calibri" w:eastAsia="Calibri"/>
+          <w:rFonts w:ascii="Calibri" w:hAnsi="Calibri" w:eastAsia="Calibri" w:cs="Calibri"/>
           <w:b w:val="0"/>
           <w:color w:val="1A1A1A"/>
           <w:sz w:val="19"/>
@@ -561,7 +567,7 @@
       </w:r>
       <w:r>
         <w:rPr>
-          <w:rFonts w:ascii="Calibri" w:hAnsi="Calibri" w:eastAsia="Calibri"/>
+          <w:rFonts w:ascii="Calibri" w:hAnsi="Calibri" w:eastAsia="Calibri" w:cs="Calibri"/>
           <w:b/>
           <w:color w:val="1A1A1A"/>
           <w:sz w:val="19"/>
@@ -570,7 +576,7 @@
       </w:r>
       <w:r>
         <w:rPr>
-          <w:rFonts w:ascii="Calibri" w:hAnsi="Calibri" w:eastAsia="Calibri"/>
+          <w:rFonts w:ascii="Calibri" w:hAnsi="Calibri" w:eastAsia="Calibri" w:cs="Calibri"/>
           <w:b w:val="0"/>
           <w:color w:val="1A1A1A"/>
           <w:sz w:val="19"/>
@@ -579,7 +585,7 @@
       </w:r>
       <w:r>
         <w:rPr>
-          <w:rFonts w:ascii="Calibri" w:hAnsi="Calibri" w:eastAsia="Calibri"/>
+          <w:rFonts w:ascii="Calibri" w:hAnsi="Calibri" w:eastAsia="Calibri" w:cs="Calibri"/>
           <w:b/>
           <w:color w:val="1A1A1A"/>
           <w:sz w:val="19"/>
@@ -588,7 +594,7 @@
       </w:r>
       <w:r>
         <w:rPr>
-          <w:rFonts w:ascii="Calibri" w:hAnsi="Calibri" w:eastAsia="Calibri"/>
+          <w:rFonts w:ascii="Calibri" w:hAnsi="Calibri" w:eastAsia="Calibri" w:cs="Calibri"/>
           <w:b w:val="0"/>
           <w:color w:val="1A1A1A"/>
           <w:sz w:val="19"/>
@@ -597,7 +603,7 @@
       </w:r>
       <w:r>
         <w:rPr>
-          <w:rFonts w:ascii="Calibri" w:hAnsi="Calibri" w:eastAsia="Calibri"/>
+          <w:rFonts w:ascii="Calibri" w:hAnsi="Calibri" w:eastAsia="Calibri" w:cs="Calibri"/>
           <w:b/>
           <w:color w:val="1A1A1A"/>
           <w:sz w:val="19"/>
@@ -606,7 +612,7 @@
       </w:r>
       <w:r>
         <w:rPr>
-          <w:rFonts w:ascii="Calibri" w:hAnsi="Calibri" w:eastAsia="Calibri"/>
+          <w:rFonts w:ascii="Calibri" w:hAnsi="Calibri" w:eastAsia="Calibri" w:cs="Calibri"/>
           <w:b w:val="0"/>
           <w:color w:val="1A1A1A"/>
           <w:sz w:val="19"/>
@@ -619,12 +625,12 @@
         <w:pStyle w:val="ListBullet"/>
         <w:keepNext w:val="0"/>
         <w:pageBreakBefore w:val="0"/>
-        <w:spacing w:before="0" w:after="10" w:line="240" w:lineRule="auto"/>
+        <w:spacing w:before="0" w:after="8" w:line="240" w:lineRule="auto"/>
         <w:ind w:left="288"/>
       </w:pPr>
       <w:r>
         <w:rPr>
-          <w:rFonts w:ascii="Calibri" w:hAnsi="Calibri" w:eastAsia="Calibri"/>
+          <w:rFonts w:ascii="Calibri" w:hAnsi="Calibri" w:eastAsia="Calibri" w:cs="Calibri"/>
           <w:b w:val="0"/>
           <w:color w:val="1A1A1A"/>
           <w:sz w:val="19"/>
@@ -633,7 +639,7 @@
       </w:r>
       <w:r>
         <w:rPr>
-          <w:rFonts w:ascii="Calibri" w:hAnsi="Calibri" w:eastAsia="Calibri"/>
+          <w:rFonts w:ascii="Calibri" w:hAnsi="Calibri" w:eastAsia="Calibri" w:cs="Calibri"/>
           <w:b/>
           <w:color w:val="1A1A1A"/>
           <w:sz w:val="19"/>
@@ -642,7 +648,7 @@
       </w:r>
       <w:r>
         <w:rPr>
-          <w:rFonts w:ascii="Calibri" w:hAnsi="Calibri" w:eastAsia="Calibri"/>
+          <w:rFonts w:ascii="Calibri" w:hAnsi="Calibri" w:eastAsia="Calibri" w:cs="Calibri"/>
           <w:b w:val="0"/>
           <w:color w:val="1A1A1A"/>
           <w:sz w:val="19"/>
@@ -655,12 +661,12 @@
         <w:pStyle w:val="ListBullet"/>
         <w:keepNext w:val="0"/>
         <w:pageBreakBefore w:val="0"/>
-        <w:spacing w:before="0" w:after="10" w:line="240" w:lineRule="auto"/>
+        <w:spacing w:before="0" w:after="8" w:line="240" w:lineRule="auto"/>
         <w:ind w:left="288"/>
       </w:pPr>
       <w:r>
         <w:rPr>
-          <w:rFonts w:ascii="Calibri" w:hAnsi="Calibri" w:eastAsia="Calibri"/>
+          <w:rFonts w:ascii="Calibri" w:hAnsi="Calibri" w:eastAsia="Calibri" w:cs="Calibri"/>
           <w:b w:val="0"/>
           <w:color w:val="1A1A1A"/>
           <w:sz w:val="19"/>
@@ -669,7 +675,7 @@
       </w:r>
       <w:r>
         <w:rPr>
-          <w:rFonts w:ascii="Calibri" w:hAnsi="Calibri" w:eastAsia="Calibri"/>
+          <w:rFonts w:ascii="Calibri" w:hAnsi="Calibri" w:eastAsia="Calibri" w:cs="Calibri"/>
           <w:b/>
           <w:color w:val="1A1A1A"/>
           <w:sz w:val="19"/>
@@ -678,7 +684,7 @@
       </w:r>
       <w:r>
         <w:rPr>
-          <w:rFonts w:ascii="Calibri" w:hAnsi="Calibri" w:eastAsia="Calibri"/>
+          <w:rFonts w:ascii="Calibri" w:hAnsi="Calibri" w:eastAsia="Calibri" w:cs="Calibri"/>
           <w:b w:val="0"/>
           <w:color w:val="1A1A1A"/>
           <w:sz w:val="19"/>
@@ -687,7 +693,7 @@
       </w:r>
       <w:r>
         <w:rPr>
-          <w:rFonts w:ascii="Calibri" w:hAnsi="Calibri" w:eastAsia="Calibri"/>
+          <w:rFonts w:ascii="Calibri" w:hAnsi="Calibri" w:eastAsia="Calibri" w:cs="Calibri"/>
           <w:b/>
           <w:color w:val="1A1A1A"/>
           <w:sz w:val="19"/>
@@ -696,7 +702,7 @@
       </w:r>
       <w:r>
         <w:rPr>
-          <w:rFonts w:ascii="Calibri" w:hAnsi="Calibri" w:eastAsia="Calibri"/>
+          <w:rFonts w:ascii="Calibri" w:hAnsi="Calibri" w:eastAsia="Calibri" w:cs="Calibri"/>
           <w:b w:val="0"/>
           <w:color w:val="1A1A1A"/>
           <w:sz w:val="19"/>
@@ -709,12 +715,12 @@
         <w:pStyle w:val="ListBullet"/>
         <w:keepNext w:val="0"/>
         <w:pageBreakBefore w:val="0"/>
-        <w:spacing w:before="0" w:after="10" w:line="240" w:lineRule="auto"/>
+        <w:spacing w:before="0" w:after="8" w:line="240" w:lineRule="auto"/>
         <w:ind w:left="288"/>
       </w:pPr>
       <w:r>
         <w:rPr>
-          <w:rFonts w:ascii="Calibri" w:hAnsi="Calibri" w:eastAsia="Calibri"/>
+          <w:rFonts w:ascii="Calibri" w:hAnsi="Calibri" w:eastAsia="Calibri" w:cs="Calibri"/>
           <w:b w:val="0"/>
           <w:color w:val="1A1A1A"/>
           <w:sz w:val="19"/>
@@ -723,7 +729,7 @@
       </w:r>
       <w:r>
         <w:rPr>
-          <w:rFonts w:ascii="Calibri" w:hAnsi="Calibri" w:eastAsia="Calibri"/>
+          <w:rFonts w:ascii="Calibri" w:hAnsi="Calibri" w:eastAsia="Calibri" w:cs="Calibri"/>
           <w:b/>
           <w:color w:val="1A1A1A"/>
           <w:sz w:val="19"/>
@@ -732,7 +738,7 @@
       </w:r>
       <w:r>
         <w:rPr>
-          <w:rFonts w:ascii="Calibri" w:hAnsi="Calibri" w:eastAsia="Calibri"/>
+          <w:rFonts w:ascii="Calibri" w:hAnsi="Calibri" w:eastAsia="Calibri" w:cs="Calibri"/>
           <w:b w:val="0"/>
           <w:color w:val="1A1A1A"/>
           <w:sz w:val="19"/>
@@ -741,7 +747,7 @@
       </w:r>
       <w:r>
         <w:rPr>
-          <w:rFonts w:ascii="Calibri" w:hAnsi="Calibri" w:eastAsia="Calibri"/>
+          <w:rFonts w:ascii="Calibri" w:hAnsi="Calibri" w:eastAsia="Calibri" w:cs="Calibri"/>
           <w:b/>
           <w:color w:val="1A1A1A"/>
           <w:sz w:val="19"/>
@@ -750,7 +756,7 @@
       </w:r>
       <w:r>
         <w:rPr>
-          <w:rFonts w:ascii="Calibri" w:hAnsi="Calibri" w:eastAsia="Calibri"/>
+          <w:rFonts w:ascii="Calibri" w:hAnsi="Calibri" w:eastAsia="Calibri" w:cs="Calibri"/>
           <w:b w:val="0"/>
           <w:color w:val="1A1A1A"/>
           <w:sz w:val="19"/>
@@ -763,12 +769,12 @@
         <w:pStyle w:val="ListBullet"/>
         <w:keepNext w:val="0"/>
         <w:pageBreakBefore w:val="0"/>
-        <w:spacing w:before="0" w:after="10" w:line="240" w:lineRule="auto"/>
+        <w:spacing w:before="0" w:after="8" w:line="240" w:lineRule="auto"/>
         <w:ind w:left="288"/>
       </w:pPr>
       <w:r>
         <w:rPr>
-          <w:rFonts w:ascii="Calibri" w:hAnsi="Calibri" w:eastAsia="Calibri"/>
+          <w:rFonts w:ascii="Calibri" w:hAnsi="Calibri" w:eastAsia="Calibri" w:cs="Calibri"/>
           <w:b w:val="0"/>
           <w:color w:val="1A1A1A"/>
           <w:sz w:val="19"/>
@@ -780,14 +786,17 @@
       <w:pPr>
         <w:keepNext/>
         <w:pageBreakBefore w:val="0"/>
-        <w:spacing w:before="140" w:after="60" w:line="240" w:lineRule="auto"/>
+        <w:spacing w:before="100" w:after="40" w:line="240" w:lineRule="auto"/>
+        <w:pBdr>
+          <w:bottom w:val="single" w:sz="12" w:space="1" w:color="2C2C2C"/>
+        </w:pBdr>
       </w:pPr>
       <w:r>
         <w:rPr>
-          <w:rFonts w:ascii="Calibri" w:hAnsi="Calibri" w:eastAsia="Calibri"/>
+          <w:rFonts w:ascii="Calibri" w:hAnsi="Calibri" w:eastAsia="Calibri" w:cs="Calibri"/>
           <w:b/>
           <w:color w:val="2C2C2C"/>
-          <w:sz w:val="21"/>
+          <w:sz w:val="22"/>
         </w:rPr>
         <w:t>SELECTED PROJECTS</w:t>
       </w:r>
@@ -799,23 +808,23 @@
         <w:tabs>
           <w:tab w:pos="10224" w:val="right"/>
         </w:tabs>
-        <w:spacing w:before="100" w:after="20" w:line="240" w:lineRule="auto"/>
+        <w:spacing w:before="80" w:after="12" w:line="240" w:lineRule="auto"/>
       </w:pPr>
       <w:r>
         <w:rPr>
-          <w:rFonts w:ascii="Calibri" w:hAnsi="Calibri" w:eastAsia="Calibri"/>
+          <w:rFonts w:ascii="Calibri" w:hAnsi="Calibri" w:eastAsia="Calibri" w:cs="Calibri"/>
           <w:b/>
           <w:color w:val="1A1A1A"/>
-          <w:sz w:val="21"/>
+          <w:sz w:val="22"/>
         </w:rPr>
         <w:t>Multi-Channel Agentic Platform</w:t>
       </w:r>
       <w:r>
         <w:rPr>
-          <w:rFonts w:ascii="Calibri" w:hAnsi="Calibri" w:eastAsia="Calibri"/>
+          <w:rFonts w:ascii="Calibri" w:hAnsi="Calibri" w:eastAsia="Calibri" w:cs="Calibri"/>
           <w:b w:val="0"/>
           <w:color w:val="4A4A4A"/>
-          <w:sz w:val="19"/>
+          <w:sz w:val="20"/>
         </w:rPr>
         <w:tab/>
         <w:t>Apr 2026 – Present</w:t>
@@ -825,14 +834,14 @@
       <w:pPr>
         <w:keepNext w:val="0"/>
         <w:pageBreakBefore w:val="0"/>
-        <w:spacing w:before="0" w:after="20" w:line="240" w:lineRule="auto"/>
+        <w:spacing w:before="0" w:after="16" w:line="240" w:lineRule="auto"/>
       </w:pPr>
       <w:r>
         <w:rPr>
-          <w:rFonts w:ascii="Calibri" w:hAnsi="Calibri" w:eastAsia="Calibri"/>
+          <w:rFonts w:ascii="Calibri" w:hAnsi="Calibri" w:eastAsia="Calibri" w:cs="Calibri"/>
           <w:b w:val="0"/>
           <w:color w:val="4A4A4A"/>
-          <w:sz w:val="18"/>
+          <w:sz w:val="19"/>
         </w:rPr>
         <w:t>Durable agent that empowers internal tools and workflows.</w:t>
       </w:r>
@@ -842,12 +851,12 @@
         <w:pStyle w:val="ListBullet"/>
         <w:keepNext w:val="0"/>
         <w:pageBreakBefore w:val="0"/>
-        <w:spacing w:before="0" w:after="10" w:line="240" w:lineRule="auto"/>
+        <w:spacing w:before="0" w:after="8" w:line="240" w:lineRule="auto"/>
         <w:ind w:left="288"/>
       </w:pPr>
       <w:r>
         <w:rPr>
-          <w:rFonts w:ascii="Calibri" w:hAnsi="Calibri" w:eastAsia="Calibri"/>
+          <w:rFonts w:ascii="Calibri" w:hAnsi="Calibri" w:eastAsia="Calibri" w:cs="Calibri"/>
           <w:b w:val="0"/>
           <w:color w:val="1A1A1A"/>
           <w:sz w:val="19"/>
@@ -860,12 +869,12 @@
         <w:pStyle w:val="ListBullet"/>
         <w:keepNext w:val="0"/>
         <w:pageBreakBefore w:val="0"/>
-        <w:spacing w:before="0" w:after="10" w:line="240" w:lineRule="auto"/>
+        <w:spacing w:before="0" w:after="8" w:line="240" w:lineRule="auto"/>
         <w:ind w:left="288"/>
       </w:pPr>
       <w:r>
         <w:rPr>
-          <w:rFonts w:ascii="Calibri" w:hAnsi="Calibri" w:eastAsia="Calibri"/>
+          <w:rFonts w:ascii="Calibri" w:hAnsi="Calibri" w:eastAsia="Calibri" w:cs="Calibri"/>
           <w:b w:val="0"/>
           <w:color w:val="1A1A1A"/>
           <w:sz w:val="19"/>
@@ -874,7 +883,7 @@
       </w:r>
       <w:r>
         <w:rPr>
-          <w:rFonts w:ascii="Calibri" w:hAnsi="Calibri" w:eastAsia="Calibri"/>
+          <w:rFonts w:ascii="Calibri" w:hAnsi="Calibri" w:eastAsia="Calibri" w:cs="Calibri"/>
           <w:b/>
           <w:color w:val="1A1A1A"/>
           <w:sz w:val="19"/>
@@ -883,7 +892,7 @@
       </w:r>
       <w:r>
         <w:rPr>
-          <w:rFonts w:ascii="Calibri" w:hAnsi="Calibri" w:eastAsia="Calibri"/>
+          <w:rFonts w:ascii="Calibri" w:hAnsi="Calibri" w:eastAsia="Calibri" w:cs="Calibri"/>
           <w:b w:val="0"/>
           <w:color w:val="1A1A1A"/>
           <w:sz w:val="19"/>
@@ -896,12 +905,12 @@
         <w:pStyle w:val="ListBullet"/>
         <w:keepNext w:val="0"/>
         <w:pageBreakBefore w:val="0"/>
-        <w:spacing w:before="0" w:after="10" w:line="240" w:lineRule="auto"/>
+        <w:spacing w:before="0" w:after="8" w:line="240" w:lineRule="auto"/>
         <w:ind w:left="288"/>
       </w:pPr>
       <w:r>
         <w:rPr>
-          <w:rFonts w:ascii="Calibri" w:hAnsi="Calibri" w:eastAsia="Calibri"/>
+          <w:rFonts w:ascii="Calibri" w:hAnsi="Calibri" w:eastAsia="Calibri" w:cs="Calibri"/>
           <w:b/>
           <w:color w:val="1A1A1A"/>
           <w:sz w:val="19"/>
@@ -910,7 +919,7 @@
       </w:r>
       <w:r>
         <w:rPr>
-          <w:rFonts w:ascii="Calibri" w:hAnsi="Calibri" w:eastAsia="Calibri"/>
+          <w:rFonts w:ascii="Calibri" w:hAnsi="Calibri" w:eastAsia="Calibri" w:cs="Calibri"/>
           <w:b w:val="0"/>
           <w:color w:val="1A1A1A"/>
           <w:sz w:val="19"/>
@@ -919,7 +928,7 @@
       </w:r>
       <w:r>
         <w:rPr>
-          <w:rFonts w:ascii="Calibri" w:hAnsi="Calibri" w:eastAsia="Calibri"/>
+          <w:rFonts w:ascii="Calibri" w:hAnsi="Calibri" w:eastAsia="Calibri" w:cs="Calibri"/>
           <w:b/>
           <w:color w:val="1A1A1A"/>
           <w:sz w:val="19"/>
@@ -928,7 +937,7 @@
       </w:r>
       <w:r>
         <w:rPr>
-          <w:rFonts w:ascii="Calibri" w:hAnsi="Calibri" w:eastAsia="Calibri"/>
+          <w:rFonts w:ascii="Calibri" w:hAnsi="Calibri" w:eastAsia="Calibri" w:cs="Calibri"/>
           <w:b w:val="0"/>
           <w:color w:val="1A1A1A"/>
           <w:sz w:val="19"/>
@@ -937,7 +946,7 @@
       </w:r>
       <w:r>
         <w:rPr>
-          <w:rFonts w:ascii="Calibri" w:hAnsi="Calibri" w:eastAsia="Calibri"/>
+          <w:rFonts w:ascii="Calibri" w:hAnsi="Calibri" w:eastAsia="Calibri" w:cs="Calibri"/>
           <w:b/>
           <w:color w:val="1A1A1A"/>
           <w:sz w:val="19"/>
@@ -946,7 +955,7 @@
       </w:r>
       <w:r>
         <w:rPr>
-          <w:rFonts w:ascii="Calibri" w:hAnsi="Calibri" w:eastAsia="Calibri"/>
+          <w:rFonts w:ascii="Calibri" w:hAnsi="Calibri" w:eastAsia="Calibri" w:cs="Calibri"/>
           <w:b w:val="0"/>
           <w:color w:val="1A1A1A"/>
           <w:sz w:val="19"/>
@@ -959,12 +968,12 @@
         <w:pStyle w:val="ListBullet"/>
         <w:keepNext w:val="0"/>
         <w:pageBreakBefore w:val="0"/>
-        <w:spacing w:before="0" w:after="10" w:line="240" w:lineRule="auto"/>
+        <w:spacing w:before="0" w:after="8" w:line="240" w:lineRule="auto"/>
         <w:ind w:left="288"/>
       </w:pPr>
       <w:r>
         <w:rPr>
-          <w:rFonts w:ascii="Calibri" w:hAnsi="Calibri" w:eastAsia="Calibri"/>
+          <w:rFonts w:ascii="Calibri" w:hAnsi="Calibri" w:eastAsia="Calibri" w:cs="Calibri"/>
           <w:b w:val="0"/>
           <w:color w:val="1A1A1A"/>
           <w:sz w:val="19"/>
@@ -973,7 +982,7 @@
       </w:r>
       <w:r>
         <w:rPr>
-          <w:rFonts w:ascii="Calibri" w:hAnsi="Calibri" w:eastAsia="Calibri"/>
+          <w:rFonts w:ascii="Calibri" w:hAnsi="Calibri" w:eastAsia="Calibri" w:cs="Calibri"/>
           <w:b/>
           <w:color w:val="1A1A1A"/>
           <w:sz w:val="19"/>
@@ -982,7 +991,7 @@
       </w:r>
       <w:r>
         <w:rPr>
-          <w:rFonts w:ascii="Calibri" w:hAnsi="Calibri" w:eastAsia="Calibri"/>
+          <w:rFonts w:ascii="Calibri" w:hAnsi="Calibri" w:eastAsia="Calibri" w:cs="Calibri"/>
           <w:b w:val="0"/>
           <w:color w:val="1A1A1A"/>
           <w:sz w:val="19"/>
@@ -995,12 +1004,12 @@
         <w:pStyle w:val="ListBullet"/>
         <w:keepNext w:val="0"/>
         <w:pageBreakBefore w:val="0"/>
-        <w:spacing w:before="0" w:after="10" w:line="240" w:lineRule="auto"/>
+        <w:spacing w:before="0" w:after="8" w:line="240" w:lineRule="auto"/>
         <w:ind w:left="288"/>
       </w:pPr>
       <w:r>
         <w:rPr>
-          <w:rFonts w:ascii="Calibri" w:hAnsi="Calibri" w:eastAsia="Calibri"/>
+          <w:rFonts w:ascii="Calibri" w:hAnsi="Calibri" w:eastAsia="Calibri" w:cs="Calibri"/>
           <w:b w:val="0"/>
           <w:color w:val="1A1A1A"/>
           <w:sz w:val="19"/>
@@ -1009,7 +1018,7 @@
       </w:r>
       <w:r>
         <w:rPr>
-          <w:rFonts w:ascii="Calibri" w:hAnsi="Calibri" w:eastAsia="Calibri"/>
+          <w:rFonts w:ascii="Calibri" w:hAnsi="Calibri" w:eastAsia="Calibri" w:cs="Calibri"/>
           <w:b/>
           <w:color w:val="1A1A1A"/>
           <w:sz w:val="19"/>
@@ -1018,7 +1027,7 @@
       </w:r>
       <w:r>
         <w:rPr>
-          <w:rFonts w:ascii="Calibri" w:hAnsi="Calibri" w:eastAsia="Calibri"/>
+          <w:rFonts w:ascii="Calibri" w:hAnsi="Calibri" w:eastAsia="Calibri" w:cs="Calibri"/>
           <w:b w:val="0"/>
           <w:color w:val="1A1A1A"/>
           <w:sz w:val="19"/>
@@ -1027,7 +1036,7 @@
       </w:r>
       <w:r>
         <w:rPr>
-          <w:rFonts w:ascii="Calibri" w:hAnsi="Calibri" w:eastAsia="Calibri"/>
+          <w:rFonts w:ascii="Calibri" w:hAnsi="Calibri" w:eastAsia="Calibri" w:cs="Calibri"/>
           <w:b/>
           <w:color w:val="1A1A1A"/>
           <w:sz w:val="19"/>
@@ -1036,7 +1045,7 @@
       </w:r>
       <w:r>
         <w:rPr>
-          <w:rFonts w:ascii="Calibri" w:hAnsi="Calibri" w:eastAsia="Calibri"/>
+          <w:rFonts w:ascii="Calibri" w:hAnsi="Calibri" w:eastAsia="Calibri" w:cs="Calibri"/>
           <w:b w:val="0"/>
           <w:color w:val="1A1A1A"/>
           <w:sz w:val="19"/>
@@ -1051,23 +1060,23 @@
         <w:tabs>
           <w:tab w:pos="10224" w:val="right"/>
         </w:tabs>
-        <w:spacing w:before="100" w:after="20" w:line="240" w:lineRule="auto"/>
+        <w:spacing w:before="80" w:after="12" w:line="240" w:lineRule="auto"/>
       </w:pPr>
       <w:r>
         <w:rPr>
-          <w:rFonts w:ascii="Calibri" w:hAnsi="Calibri" w:eastAsia="Calibri"/>
+          <w:rFonts w:ascii="Calibri" w:hAnsi="Calibri" w:eastAsia="Calibri" w:cs="Calibri"/>
           <w:b/>
           <w:color w:val="1A1A1A"/>
-          <w:sz w:val="21"/>
+          <w:sz w:val="22"/>
         </w:rPr>
         <w:t>Healthcare AI Agent</w:t>
       </w:r>
       <w:r>
         <w:rPr>
-          <w:rFonts w:ascii="Calibri" w:hAnsi="Calibri" w:eastAsia="Calibri"/>
+          <w:rFonts w:ascii="Calibri" w:hAnsi="Calibri" w:eastAsia="Calibri" w:cs="Calibri"/>
           <w:b w:val="0"/>
           <w:color w:val="4A4A4A"/>
-          <w:sz w:val="19"/>
+          <w:sz w:val="20"/>
         </w:rPr>
         <w:tab/>
         <w:t>July 2025 – Apr 2026</w:t>
@@ -1077,14 +1086,14 @@
       <w:pPr>
         <w:keepNext w:val="0"/>
         <w:pageBreakBefore w:val="0"/>
-        <w:spacing w:before="0" w:after="20" w:line="240" w:lineRule="auto"/>
+        <w:spacing w:before="0" w:after="16" w:line="240" w:lineRule="auto"/>
       </w:pPr>
       <w:r>
         <w:rPr>
-          <w:rFonts w:ascii="Calibri" w:hAnsi="Calibri" w:eastAsia="Calibri"/>
+          <w:rFonts w:ascii="Calibri" w:hAnsi="Calibri" w:eastAsia="Calibri" w:cs="Calibri"/>
           <w:b w:val="0"/>
           <w:color w:val="4A4A4A"/>
-          <w:sz w:val="18"/>
+          <w:sz w:val="19"/>
         </w:rPr>
         <w:t>Healthcare and shopping assistant grounded in uploaded documents and Shopify store product data.</w:t>
       </w:r>
@@ -1094,12 +1103,12 @@
         <w:pStyle w:val="ListBullet"/>
         <w:keepNext w:val="0"/>
         <w:pageBreakBefore w:val="0"/>
-        <w:spacing w:before="0" w:after="10" w:line="240" w:lineRule="auto"/>
+        <w:spacing w:before="0" w:after="8" w:line="240" w:lineRule="auto"/>
         <w:ind w:left="288"/>
       </w:pPr>
       <w:r>
         <w:rPr>
-          <w:rFonts w:ascii="Calibri" w:hAnsi="Calibri" w:eastAsia="Calibri"/>
+          <w:rFonts w:ascii="Calibri" w:hAnsi="Calibri" w:eastAsia="Calibri" w:cs="Calibri"/>
           <w:b w:val="0"/>
           <w:color w:val="1A1A1A"/>
           <w:sz w:val="19"/>
@@ -1108,7 +1117,7 @@
       </w:r>
       <w:r>
         <w:rPr>
-          <w:rFonts w:ascii="Calibri" w:hAnsi="Calibri" w:eastAsia="Calibri"/>
+          <w:rFonts w:ascii="Calibri" w:hAnsi="Calibri" w:eastAsia="Calibri" w:cs="Calibri"/>
           <w:b/>
           <w:color w:val="1A1A1A"/>
           <w:sz w:val="19"/>
@@ -1117,7 +1126,7 @@
       </w:r>
       <w:r>
         <w:rPr>
-          <w:rFonts w:ascii="Calibri" w:hAnsi="Calibri" w:eastAsia="Calibri"/>
+          <w:rFonts w:ascii="Calibri" w:hAnsi="Calibri" w:eastAsia="Calibri" w:cs="Calibri"/>
           <w:b w:val="0"/>
           <w:color w:val="1A1A1A"/>
           <w:sz w:val="19"/>
@@ -1130,12 +1139,12 @@
         <w:pStyle w:val="ListBullet"/>
         <w:keepNext w:val="0"/>
         <w:pageBreakBefore w:val="0"/>
-        <w:spacing w:before="0" w:after="10" w:line="240" w:lineRule="auto"/>
+        <w:spacing w:before="0" w:after="8" w:line="240" w:lineRule="auto"/>
         <w:ind w:left="288"/>
       </w:pPr>
       <w:r>
         <w:rPr>
-          <w:rFonts w:ascii="Calibri" w:hAnsi="Calibri" w:eastAsia="Calibri"/>
+          <w:rFonts w:ascii="Calibri" w:hAnsi="Calibri" w:eastAsia="Calibri" w:cs="Calibri"/>
           <w:b w:val="0"/>
           <w:color w:val="1A1A1A"/>
           <w:sz w:val="19"/>
@@ -1144,7 +1153,7 @@
       </w:r>
       <w:r>
         <w:rPr>
-          <w:rFonts w:ascii="Calibri" w:hAnsi="Calibri" w:eastAsia="Calibri"/>
+          <w:rFonts w:ascii="Calibri" w:hAnsi="Calibri" w:eastAsia="Calibri" w:cs="Calibri"/>
           <w:b/>
           <w:color w:val="1A1A1A"/>
           <w:sz w:val="19"/>
@@ -1153,7 +1162,7 @@
       </w:r>
       <w:r>
         <w:rPr>
-          <w:rFonts w:ascii="Calibri" w:hAnsi="Calibri" w:eastAsia="Calibri"/>
+          <w:rFonts w:ascii="Calibri" w:hAnsi="Calibri" w:eastAsia="Calibri" w:cs="Calibri"/>
           <w:b w:val="0"/>
           <w:color w:val="1A1A1A"/>
           <w:sz w:val="19"/>
@@ -1162,7 +1171,7 @@
       </w:r>
       <w:r>
         <w:rPr>
-          <w:rFonts w:ascii="Calibri" w:hAnsi="Calibri" w:eastAsia="Calibri"/>
+          <w:rFonts w:ascii="Calibri" w:hAnsi="Calibri" w:eastAsia="Calibri" w:cs="Calibri"/>
           <w:b/>
           <w:color w:val="1A1A1A"/>
           <w:sz w:val="19"/>
@@ -1171,7 +1180,7 @@
       </w:r>
       <w:r>
         <w:rPr>
-          <w:rFonts w:ascii="Calibri" w:hAnsi="Calibri" w:eastAsia="Calibri"/>
+          <w:rFonts w:ascii="Calibri" w:hAnsi="Calibri" w:eastAsia="Calibri" w:cs="Calibri"/>
           <w:b w:val="0"/>
           <w:color w:val="1A1A1A"/>
           <w:sz w:val="19"/>
@@ -1180,7 +1189,7 @@
       </w:r>
       <w:r>
         <w:rPr>
-          <w:rFonts w:ascii="Calibri" w:hAnsi="Calibri" w:eastAsia="Calibri"/>
+          <w:rFonts w:ascii="Calibri" w:hAnsi="Calibri" w:eastAsia="Calibri" w:cs="Calibri"/>
           <w:b/>
           <w:color w:val="1A1A1A"/>
           <w:sz w:val="19"/>
@@ -1189,7 +1198,7 @@
       </w:r>
       <w:r>
         <w:rPr>
-          <w:rFonts w:ascii="Calibri" w:hAnsi="Calibri" w:eastAsia="Calibri"/>
+          <w:rFonts w:ascii="Calibri" w:hAnsi="Calibri" w:eastAsia="Calibri" w:cs="Calibri"/>
           <w:b w:val="0"/>
           <w:color w:val="1A1A1A"/>
           <w:sz w:val="19"/>
@@ -1198,7 +1207,7 @@
       </w:r>
       <w:r>
         <w:rPr>
-          <w:rFonts w:ascii="Calibri" w:hAnsi="Calibri" w:eastAsia="Calibri"/>
+          <w:rFonts w:ascii="Calibri" w:hAnsi="Calibri" w:eastAsia="Calibri" w:cs="Calibri"/>
           <w:b/>
           <w:color w:val="1A1A1A"/>
           <w:sz w:val="19"/>
@@ -1207,7 +1216,7 @@
       </w:r>
       <w:r>
         <w:rPr>
-          <w:rFonts w:ascii="Calibri" w:hAnsi="Calibri" w:eastAsia="Calibri"/>
+          <w:rFonts w:ascii="Calibri" w:hAnsi="Calibri" w:eastAsia="Calibri" w:cs="Calibri"/>
           <w:b w:val="0"/>
           <w:color w:val="1A1A1A"/>
           <w:sz w:val="19"/>
@@ -1220,12 +1229,12 @@
         <w:pStyle w:val="ListBullet"/>
         <w:keepNext w:val="0"/>
         <w:pageBreakBefore w:val="0"/>
-        <w:spacing w:before="0" w:after="10" w:line="240" w:lineRule="auto"/>
+        <w:spacing w:before="0" w:after="8" w:line="240" w:lineRule="auto"/>
         <w:ind w:left="288"/>
       </w:pPr>
       <w:r>
         <w:rPr>
-          <w:rFonts w:ascii="Calibri" w:hAnsi="Calibri" w:eastAsia="Calibri"/>
+          <w:rFonts w:ascii="Calibri" w:hAnsi="Calibri" w:eastAsia="Calibri" w:cs="Calibri"/>
           <w:b w:val="0"/>
           <w:color w:val="1A1A1A"/>
           <w:sz w:val="19"/>
@@ -1234,7 +1243,7 @@
       </w:r>
       <w:r>
         <w:rPr>
-          <w:rFonts w:ascii="Calibri" w:hAnsi="Calibri" w:eastAsia="Calibri"/>
+          <w:rFonts w:ascii="Calibri" w:hAnsi="Calibri" w:eastAsia="Calibri" w:cs="Calibri"/>
           <w:b/>
           <w:color w:val="1A1A1A"/>
           <w:sz w:val="19"/>
@@ -1243,7 +1252,7 @@
       </w:r>
       <w:r>
         <w:rPr>
-          <w:rFonts w:ascii="Calibri" w:hAnsi="Calibri" w:eastAsia="Calibri"/>
+          <w:rFonts w:ascii="Calibri" w:hAnsi="Calibri" w:eastAsia="Calibri" w:cs="Calibri"/>
           <w:b w:val="0"/>
           <w:color w:val="1A1A1A"/>
           <w:sz w:val="19"/>
@@ -1252,7 +1261,7 @@
       </w:r>
       <w:r>
         <w:rPr>
-          <w:rFonts w:ascii="Calibri" w:hAnsi="Calibri" w:eastAsia="Calibri"/>
+          <w:rFonts w:ascii="Calibri" w:hAnsi="Calibri" w:eastAsia="Calibri" w:cs="Calibri"/>
           <w:b/>
           <w:color w:val="1A1A1A"/>
           <w:sz w:val="19"/>
@@ -1261,7 +1270,7 @@
       </w:r>
       <w:r>
         <w:rPr>
-          <w:rFonts w:ascii="Calibri" w:hAnsi="Calibri" w:eastAsia="Calibri"/>
+          <w:rFonts w:ascii="Calibri" w:hAnsi="Calibri" w:eastAsia="Calibri" w:cs="Calibri"/>
           <w:b w:val="0"/>
           <w:color w:val="1A1A1A"/>
           <w:sz w:val="19"/>
@@ -1274,12 +1283,12 @@
         <w:pStyle w:val="ListBullet"/>
         <w:keepNext w:val="0"/>
         <w:pageBreakBefore w:val="0"/>
-        <w:spacing w:before="0" w:after="10" w:line="240" w:lineRule="auto"/>
+        <w:spacing w:before="0" w:after="8" w:line="240" w:lineRule="auto"/>
         <w:ind w:left="288"/>
       </w:pPr>
       <w:r>
         <w:rPr>
-          <w:rFonts w:ascii="Calibri" w:hAnsi="Calibri" w:eastAsia="Calibri"/>
+          <w:rFonts w:ascii="Calibri" w:hAnsi="Calibri" w:eastAsia="Calibri" w:cs="Calibri"/>
           <w:b w:val="0"/>
           <w:color w:val="1A1A1A"/>
           <w:sz w:val="19"/>
@@ -1288,7 +1297,7 @@
       </w:r>
       <w:r>
         <w:rPr>
-          <w:rFonts w:ascii="Calibri" w:hAnsi="Calibri" w:eastAsia="Calibri"/>
+          <w:rFonts w:ascii="Calibri" w:hAnsi="Calibri" w:eastAsia="Calibri" w:cs="Calibri"/>
           <w:b/>
           <w:color w:val="1A1A1A"/>
           <w:sz w:val="19"/>
@@ -1297,7 +1306,7 @@
       </w:r>
       <w:r>
         <w:rPr>
-          <w:rFonts w:ascii="Calibri" w:hAnsi="Calibri" w:eastAsia="Calibri"/>
+          <w:rFonts w:ascii="Calibri" w:hAnsi="Calibri" w:eastAsia="Calibri" w:cs="Calibri"/>
           <w:b w:val="0"/>
           <w:color w:val="1A1A1A"/>
           <w:sz w:val="19"/>
@@ -1306,7 +1315,7 @@
       </w:r>
       <w:r>
         <w:rPr>
-          <w:rFonts w:ascii="Calibri" w:hAnsi="Calibri" w:eastAsia="Calibri"/>
+          <w:rFonts w:ascii="Calibri" w:hAnsi="Calibri" w:eastAsia="Calibri" w:cs="Calibri"/>
           <w:b/>
           <w:color w:val="1A1A1A"/>
           <w:sz w:val="19"/>
@@ -1315,7 +1324,7 @@
       </w:r>
       <w:r>
         <w:rPr>
-          <w:rFonts w:ascii="Calibri" w:hAnsi="Calibri" w:eastAsia="Calibri"/>
+          <w:rFonts w:ascii="Calibri" w:hAnsi="Calibri" w:eastAsia="Calibri" w:cs="Calibri"/>
           <w:b w:val="0"/>
           <w:color w:val="1A1A1A"/>
           <w:sz w:val="19"/>
@@ -1324,7 +1333,7 @@
       </w:r>
       <w:r>
         <w:rPr>
-          <w:rFonts w:ascii="Calibri" w:hAnsi="Calibri" w:eastAsia="Calibri"/>
+          <w:rFonts w:ascii="Calibri" w:hAnsi="Calibri" w:eastAsia="Calibri" w:cs="Calibri"/>
           <w:b/>
           <w:color w:val="1A1A1A"/>
           <w:sz w:val="19"/>
@@ -1333,7 +1342,7 @@
       </w:r>
       <w:r>
         <w:rPr>
-          <w:rFonts w:ascii="Calibri" w:hAnsi="Calibri" w:eastAsia="Calibri"/>
+          <w:rFonts w:ascii="Calibri" w:hAnsi="Calibri" w:eastAsia="Calibri" w:cs="Calibri"/>
           <w:b w:val="0"/>
           <w:color w:val="1A1A1A"/>
           <w:sz w:val="19"/>
@@ -1346,12 +1355,12 @@
         <w:pStyle w:val="ListBullet"/>
         <w:keepNext w:val="0"/>
         <w:pageBreakBefore w:val="0"/>
-        <w:spacing w:before="0" w:after="10" w:line="240" w:lineRule="auto"/>
+        <w:spacing w:before="0" w:after="8" w:line="240" w:lineRule="auto"/>
         <w:ind w:left="288"/>
       </w:pPr>
       <w:r>
         <w:rPr>
-          <w:rFonts w:ascii="Calibri" w:hAnsi="Calibri" w:eastAsia="Calibri"/>
+          <w:rFonts w:ascii="Calibri" w:hAnsi="Calibri" w:eastAsia="Calibri" w:cs="Calibri"/>
           <w:b w:val="0"/>
           <w:color w:val="1A1A1A"/>
           <w:sz w:val="19"/>
@@ -1360,7 +1369,7 @@
       </w:r>
       <w:r>
         <w:rPr>
-          <w:rFonts w:ascii="Calibri" w:hAnsi="Calibri" w:eastAsia="Calibri"/>
+          <w:rFonts w:ascii="Calibri" w:hAnsi="Calibri" w:eastAsia="Calibri" w:cs="Calibri"/>
           <w:b/>
           <w:color w:val="1A1A1A"/>
           <w:sz w:val="19"/>
@@ -1369,7 +1378,7 @@
       </w:r>
       <w:r>
         <w:rPr>
-          <w:rFonts w:ascii="Calibri" w:hAnsi="Calibri" w:eastAsia="Calibri"/>
+          <w:rFonts w:ascii="Calibri" w:hAnsi="Calibri" w:eastAsia="Calibri" w:cs="Calibri"/>
           <w:b w:val="0"/>
           <w:color w:val="1A1A1A"/>
           <w:sz w:val="19"/>
@@ -1378,7 +1387,7 @@
       </w:r>
       <w:r>
         <w:rPr>
-          <w:rFonts w:ascii="Calibri" w:hAnsi="Calibri" w:eastAsia="Calibri"/>
+          <w:rFonts w:ascii="Calibri" w:hAnsi="Calibri" w:eastAsia="Calibri" w:cs="Calibri"/>
           <w:b/>
           <w:color w:val="1A1A1A"/>
           <w:sz w:val="19"/>
@@ -1387,7 +1396,7 @@
       </w:r>
       <w:r>
         <w:rPr>
-          <w:rFonts w:ascii="Calibri" w:hAnsi="Calibri" w:eastAsia="Calibri"/>
+          <w:rFonts w:ascii="Calibri" w:hAnsi="Calibri" w:eastAsia="Calibri" w:cs="Calibri"/>
           <w:b w:val="0"/>
           <w:color w:val="1A1A1A"/>
           <w:sz w:val="19"/>
@@ -1400,12 +1409,12 @@
         <w:pStyle w:val="ListBullet"/>
         <w:keepNext w:val="0"/>
         <w:pageBreakBefore w:val="0"/>
-        <w:spacing w:before="0" w:after="10" w:line="240" w:lineRule="auto"/>
+        <w:spacing w:before="0" w:after="8" w:line="240" w:lineRule="auto"/>
         <w:ind w:left="288"/>
       </w:pPr>
       <w:r>
         <w:rPr>
-          <w:rFonts w:ascii="Calibri" w:hAnsi="Calibri" w:eastAsia="Calibri"/>
+          <w:rFonts w:ascii="Calibri" w:hAnsi="Calibri" w:eastAsia="Calibri" w:cs="Calibri"/>
           <w:b w:val="0"/>
           <w:color w:val="1A1A1A"/>
           <w:sz w:val="19"/>
@@ -1414,7 +1423,7 @@
       </w:r>
       <w:r>
         <w:rPr>
-          <w:rFonts w:ascii="Calibri" w:hAnsi="Calibri" w:eastAsia="Calibri"/>
+          <w:rFonts w:ascii="Calibri" w:hAnsi="Calibri" w:eastAsia="Calibri" w:cs="Calibri"/>
           <w:b/>
           <w:color w:val="1A1A1A"/>
           <w:sz w:val="19"/>
@@ -1423,7 +1432,7 @@
       </w:r>
       <w:r>
         <w:rPr>
-          <w:rFonts w:ascii="Calibri" w:hAnsi="Calibri" w:eastAsia="Calibri"/>
+          <w:rFonts w:ascii="Calibri" w:hAnsi="Calibri" w:eastAsia="Calibri" w:cs="Calibri"/>
           <w:b w:val="0"/>
           <w:color w:val="1A1A1A"/>
           <w:sz w:val="19"/>
@@ -1432,7 +1441,7 @@
       </w:r>
       <w:r>
         <w:rPr>
-          <w:rFonts w:ascii="Calibri" w:hAnsi="Calibri" w:eastAsia="Calibri"/>
+          <w:rFonts w:ascii="Calibri" w:hAnsi="Calibri" w:eastAsia="Calibri" w:cs="Calibri"/>
           <w:b/>
           <w:color w:val="1A1A1A"/>
           <w:sz w:val="19"/>
@@ -1441,7 +1450,7 @@
       </w:r>
       <w:r>
         <w:rPr>
-          <w:rFonts w:ascii="Calibri" w:hAnsi="Calibri" w:eastAsia="Calibri"/>
+          <w:rFonts w:ascii="Calibri" w:hAnsi="Calibri" w:eastAsia="Calibri" w:cs="Calibri"/>
           <w:b w:val="0"/>
           <w:color w:val="1A1A1A"/>
           <w:sz w:val="19"/>
@@ -1454,12 +1463,12 @@
         <w:pStyle w:val="ListBullet"/>
         <w:keepNext w:val="0"/>
         <w:pageBreakBefore w:val="0"/>
-        <w:spacing w:before="0" w:after="10" w:line="240" w:lineRule="auto"/>
+        <w:spacing w:before="0" w:after="8" w:line="240" w:lineRule="auto"/>
         <w:ind w:left="288"/>
       </w:pPr>
       <w:r>
         <w:rPr>
-          <w:rFonts w:ascii="Calibri" w:hAnsi="Calibri" w:eastAsia="Calibri"/>
+          <w:rFonts w:ascii="Calibri" w:hAnsi="Calibri" w:eastAsia="Calibri" w:cs="Calibri"/>
           <w:b w:val="0"/>
           <w:color w:val="1A1A1A"/>
           <w:sz w:val="19"/>
@@ -1474,23 +1483,23 @@
         <w:tabs>
           <w:tab w:pos="10224" w:val="right"/>
         </w:tabs>
-        <w:spacing w:before="100" w:after="20" w:line="240" w:lineRule="auto"/>
+        <w:spacing w:before="80" w:after="12" w:line="240" w:lineRule="auto"/>
       </w:pPr>
       <w:r>
         <w:rPr>
-          <w:rFonts w:ascii="Calibri" w:hAnsi="Calibri" w:eastAsia="Calibri"/>
+          <w:rFonts w:ascii="Calibri" w:hAnsi="Calibri" w:eastAsia="Calibri" w:cs="Calibri"/>
           <w:b/>
           <w:color w:val="1A1A1A"/>
-          <w:sz w:val="21"/>
+          <w:sz w:val="22"/>
         </w:rPr>
         <w:t>High-Performance Editorial Platform</w:t>
       </w:r>
       <w:r>
         <w:rPr>
-          <w:rFonts w:ascii="Calibri" w:hAnsi="Calibri" w:eastAsia="Calibri"/>
+          <w:rFonts w:ascii="Calibri" w:hAnsi="Calibri" w:eastAsia="Calibri" w:cs="Calibri"/>
           <w:b w:val="0"/>
           <w:color w:val="4A4A4A"/>
-          <w:sz w:val="19"/>
+          <w:sz w:val="20"/>
         </w:rPr>
         <w:tab/>
         <w:t>2025</w:t>
@@ -1500,32 +1509,32 @@
       <w:pPr>
         <w:keepNext w:val="0"/>
         <w:pageBreakBefore w:val="0"/>
-        <w:spacing w:before="0" w:after="20" w:line="240" w:lineRule="auto"/>
+        <w:spacing w:before="0" w:after="16" w:line="240" w:lineRule="auto"/>
       </w:pPr>
       <w:r>
         <w:rPr>
-          <w:rFonts w:ascii="Calibri" w:hAnsi="Calibri" w:eastAsia="Calibri"/>
+          <w:rFonts w:ascii="Calibri" w:hAnsi="Calibri" w:eastAsia="Calibri" w:cs="Calibri"/>
           <w:b w:val="0"/>
           <w:color w:val="4A4A4A"/>
-          <w:sz w:val="18"/>
+          <w:sz w:val="19"/>
         </w:rPr>
         <w:t xml:space="preserve">Strapi, Meilisearch, and </w:t>
       </w:r>
       <w:r>
         <w:rPr>
-          <w:rFonts w:ascii="Calibri" w:hAnsi="Calibri" w:eastAsia="Calibri"/>
+          <w:rFonts w:ascii="Calibri" w:hAnsi="Calibri" w:eastAsia="Calibri" w:cs="Calibri"/>
           <w:b/>
           <w:color w:val="4A4A4A"/>
-          <w:sz w:val="18"/>
+          <w:sz w:val="19"/>
         </w:rPr>
         <w:t>Next.js</w:t>
       </w:r>
       <w:r>
         <w:rPr>
-          <w:rFonts w:ascii="Calibri" w:hAnsi="Calibri" w:eastAsia="Calibri"/>
+          <w:rFonts w:ascii="Calibri" w:hAnsi="Calibri" w:eastAsia="Calibri" w:cs="Calibri"/>
           <w:b w:val="0"/>
           <w:color w:val="4A4A4A"/>
-          <w:sz w:val="18"/>
+          <w:sz w:val="19"/>
         </w:rPr>
         <w:t xml:space="preserve"> editorial platform in the WordPress-to-headless migration.</w:t>
       </w:r>
@@ -1535,12 +1544,12 @@
         <w:pStyle w:val="ListBullet"/>
         <w:keepNext w:val="0"/>
         <w:pageBreakBefore w:val="0"/>
-        <w:spacing w:before="0" w:after="10" w:line="240" w:lineRule="auto"/>
+        <w:spacing w:before="0" w:after="8" w:line="240" w:lineRule="auto"/>
         <w:ind w:left="288"/>
       </w:pPr>
       <w:r>
         <w:rPr>
-          <w:rFonts w:ascii="Calibri" w:hAnsi="Calibri" w:eastAsia="Calibri"/>
+          <w:rFonts w:ascii="Calibri" w:hAnsi="Calibri" w:eastAsia="Calibri" w:cs="Calibri"/>
           <w:b w:val="0"/>
           <w:color w:val="1A1A1A"/>
           <w:sz w:val="19"/>
@@ -1549,7 +1558,7 @@
       </w:r>
       <w:r>
         <w:rPr>
-          <w:rFonts w:ascii="Calibri" w:hAnsi="Calibri" w:eastAsia="Calibri"/>
+          <w:rFonts w:ascii="Calibri" w:hAnsi="Calibri" w:eastAsia="Calibri" w:cs="Calibri"/>
           <w:b/>
           <w:color w:val="1A1A1A"/>
           <w:sz w:val="19"/>
@@ -1558,7 +1567,7 @@
       </w:r>
       <w:r>
         <w:rPr>
-          <w:rFonts w:ascii="Calibri" w:hAnsi="Calibri" w:eastAsia="Calibri"/>
+          <w:rFonts w:ascii="Calibri" w:hAnsi="Calibri" w:eastAsia="Calibri" w:cs="Calibri"/>
           <w:b w:val="0"/>
           <w:color w:val="1A1A1A"/>
           <w:sz w:val="19"/>
@@ -1567,7 +1576,7 @@
       </w:r>
       <w:r>
         <w:rPr>
-          <w:rFonts w:ascii="Calibri" w:hAnsi="Calibri" w:eastAsia="Calibri"/>
+          <w:rFonts w:ascii="Calibri" w:hAnsi="Calibri" w:eastAsia="Calibri" w:cs="Calibri"/>
           <w:b/>
           <w:color w:val="1A1A1A"/>
           <w:sz w:val="19"/>
@@ -1576,7 +1585,7 @@
       </w:r>
       <w:r>
         <w:rPr>
-          <w:rFonts w:ascii="Calibri" w:hAnsi="Calibri" w:eastAsia="Calibri"/>
+          <w:rFonts w:ascii="Calibri" w:hAnsi="Calibri" w:eastAsia="Calibri" w:cs="Calibri"/>
           <w:b w:val="0"/>
           <w:color w:val="1A1A1A"/>
           <w:sz w:val="19"/>
@@ -1589,12 +1598,12 @@
         <w:pStyle w:val="ListBullet"/>
         <w:keepNext w:val="0"/>
         <w:pageBreakBefore w:val="0"/>
-        <w:spacing w:before="0" w:after="10" w:line="240" w:lineRule="auto"/>
+        <w:spacing w:before="0" w:after="8" w:line="240" w:lineRule="auto"/>
         <w:ind w:left="288"/>
       </w:pPr>
       <w:r>
         <w:rPr>
-          <w:rFonts w:ascii="Calibri" w:hAnsi="Calibri" w:eastAsia="Calibri"/>
+          <w:rFonts w:ascii="Calibri" w:hAnsi="Calibri" w:eastAsia="Calibri" w:cs="Calibri"/>
           <w:b w:val="0"/>
           <w:color w:val="1A1A1A"/>
           <w:sz w:val="19"/>
@@ -1603,7 +1612,7 @@
       </w:r>
       <w:r>
         <w:rPr>
-          <w:rFonts w:ascii="Calibri" w:hAnsi="Calibri" w:eastAsia="Calibri"/>
+          <w:rFonts w:ascii="Calibri" w:hAnsi="Calibri" w:eastAsia="Calibri" w:cs="Calibri"/>
           <w:b/>
           <w:color w:val="1A1A1A"/>
           <w:sz w:val="19"/>
@@ -1612,7 +1621,7 @@
       </w:r>
       <w:r>
         <w:rPr>
-          <w:rFonts w:ascii="Calibri" w:hAnsi="Calibri" w:eastAsia="Calibri"/>
+          <w:rFonts w:ascii="Calibri" w:hAnsi="Calibri" w:eastAsia="Calibri" w:cs="Calibri"/>
           <w:b w:val="0"/>
           <w:color w:val="1A1A1A"/>
           <w:sz w:val="19"/>
@@ -1625,12 +1634,12 @@
         <w:pStyle w:val="ListBullet"/>
         <w:keepNext w:val="0"/>
         <w:pageBreakBefore w:val="0"/>
-        <w:spacing w:before="0" w:after="10" w:line="240" w:lineRule="auto"/>
+        <w:spacing w:before="0" w:after="8" w:line="240" w:lineRule="auto"/>
         <w:ind w:left="288"/>
       </w:pPr>
       <w:r>
         <w:rPr>
-          <w:rFonts w:ascii="Calibri" w:hAnsi="Calibri" w:eastAsia="Calibri"/>
+          <w:rFonts w:ascii="Calibri" w:hAnsi="Calibri" w:eastAsia="Calibri" w:cs="Calibri"/>
           <w:b w:val="0"/>
           <w:color w:val="1A1A1A"/>
           <w:sz w:val="19"/>
@@ -1639,7 +1648,7 @@
       </w:r>
       <w:r>
         <w:rPr>
-          <w:rFonts w:ascii="Calibri" w:hAnsi="Calibri" w:eastAsia="Calibri"/>
+          <w:rFonts w:ascii="Calibri" w:hAnsi="Calibri" w:eastAsia="Calibri" w:cs="Calibri"/>
           <w:b/>
           <w:color w:val="1A1A1A"/>
           <w:sz w:val="19"/>
@@ -1648,7 +1657,7 @@
       </w:r>
       <w:r>
         <w:rPr>
-          <w:rFonts w:ascii="Calibri" w:hAnsi="Calibri" w:eastAsia="Calibri"/>
+          <w:rFonts w:ascii="Calibri" w:hAnsi="Calibri" w:eastAsia="Calibri" w:cs="Calibri"/>
           <w:b w:val="0"/>
           <w:color w:val="1A1A1A"/>
           <w:sz w:val="19"/>
@@ -1657,7 +1666,7 @@
       </w:r>
       <w:r>
         <w:rPr>
-          <w:rFonts w:ascii="Calibri" w:hAnsi="Calibri" w:eastAsia="Calibri"/>
+          <w:rFonts w:ascii="Calibri" w:hAnsi="Calibri" w:eastAsia="Calibri" w:cs="Calibri"/>
           <w:b/>
           <w:color w:val="1A1A1A"/>
           <w:sz w:val="19"/>
@@ -1666,7 +1675,7 @@
       </w:r>
       <w:r>
         <w:rPr>
-          <w:rFonts w:ascii="Calibri" w:hAnsi="Calibri" w:eastAsia="Calibri"/>
+          <w:rFonts w:ascii="Calibri" w:hAnsi="Calibri" w:eastAsia="Calibri" w:cs="Calibri"/>
           <w:b w:val="0"/>
           <w:color w:val="1A1A1A"/>
           <w:sz w:val="19"/>
@@ -1675,7 +1684,7 @@
       </w:r>
       <w:r>
         <w:rPr>
-          <w:rFonts w:ascii="Calibri" w:hAnsi="Calibri" w:eastAsia="Calibri"/>
+          <w:rFonts w:ascii="Calibri" w:hAnsi="Calibri" w:eastAsia="Calibri" w:cs="Calibri"/>
           <w:b/>
           <w:color w:val="1A1A1A"/>
           <w:sz w:val="19"/>
@@ -1684,7 +1693,7 @@
       </w:r>
       <w:r>
         <w:rPr>
-          <w:rFonts w:ascii="Calibri" w:hAnsi="Calibri" w:eastAsia="Calibri"/>
+          <w:rFonts w:ascii="Calibri" w:hAnsi="Calibri" w:eastAsia="Calibri" w:cs="Calibri"/>
           <w:b w:val="0"/>
           <w:color w:val="1A1A1A"/>
           <w:sz w:val="19"/>
@@ -1693,7 +1702,7 @@
       </w:r>
       <w:r>
         <w:rPr>
-          <w:rFonts w:ascii="Calibri" w:hAnsi="Calibri" w:eastAsia="Calibri"/>
+          <w:rFonts w:ascii="Calibri" w:hAnsi="Calibri" w:eastAsia="Calibri" w:cs="Calibri"/>
           <w:b/>
           <w:color w:val="1A1A1A"/>
           <w:sz w:val="19"/>
@@ -1702,7 +1711,7 @@
       </w:r>
       <w:r>
         <w:rPr>
-          <w:rFonts w:ascii="Calibri" w:hAnsi="Calibri" w:eastAsia="Calibri"/>
+          <w:rFonts w:ascii="Calibri" w:hAnsi="Calibri" w:eastAsia="Calibri" w:cs="Calibri"/>
           <w:b w:val="0"/>
           <w:color w:val="1A1A1A"/>
           <w:sz w:val="19"/>
@@ -1711,7 +1720,7 @@
       </w:r>
       <w:r>
         <w:rPr>
-          <w:rFonts w:ascii="Calibri" w:hAnsi="Calibri" w:eastAsia="Calibri"/>
+          <w:rFonts w:ascii="Calibri" w:hAnsi="Calibri" w:eastAsia="Calibri" w:cs="Calibri"/>
           <w:b/>
           <w:color w:val="1A1A1A"/>
           <w:sz w:val="19"/>
@@ -1720,7 +1729,7 @@
       </w:r>
       <w:r>
         <w:rPr>
-          <w:rFonts w:ascii="Calibri" w:hAnsi="Calibri" w:eastAsia="Calibri"/>
+          <w:rFonts w:ascii="Calibri" w:hAnsi="Calibri" w:eastAsia="Calibri" w:cs="Calibri"/>
           <w:b w:val="0"/>
           <w:color w:val="1A1A1A"/>
           <w:sz w:val="19"/>
@@ -1729,7 +1738,7 @@
       </w:r>
       <w:r>
         <w:rPr>
-          <w:rFonts w:ascii="Calibri" w:hAnsi="Calibri" w:eastAsia="Calibri"/>
+          <w:rFonts w:ascii="Calibri" w:hAnsi="Calibri" w:eastAsia="Calibri" w:cs="Calibri"/>
           <w:b/>
           <w:color w:val="1A1A1A"/>
           <w:sz w:val="19"/>
@@ -1738,7 +1747,7 @@
       </w:r>
       <w:r>
         <w:rPr>
-          <w:rFonts w:ascii="Calibri" w:hAnsi="Calibri" w:eastAsia="Calibri"/>
+          <w:rFonts w:ascii="Calibri" w:hAnsi="Calibri" w:eastAsia="Calibri" w:cs="Calibri"/>
           <w:b w:val="0"/>
           <w:color w:val="1A1A1A"/>
           <w:sz w:val="19"/>
@@ -1747,7 +1756,7 @@
       </w:r>
       <w:r>
         <w:rPr>
-          <w:rFonts w:ascii="Calibri" w:hAnsi="Calibri" w:eastAsia="Calibri"/>
+          <w:rFonts w:ascii="Calibri" w:hAnsi="Calibri" w:eastAsia="Calibri" w:cs="Calibri"/>
           <w:b/>
           <w:color w:val="1A1A1A"/>
           <w:sz w:val="19"/>
@@ -1756,7 +1765,7 @@
       </w:r>
       <w:r>
         <w:rPr>
-          <w:rFonts w:ascii="Calibri" w:hAnsi="Calibri" w:eastAsia="Calibri"/>
+          <w:rFonts w:ascii="Calibri" w:hAnsi="Calibri" w:eastAsia="Calibri" w:cs="Calibri"/>
           <w:b w:val="0"/>
           <w:color w:val="1A1A1A"/>
           <w:sz w:val="19"/>
@@ -1769,12 +1778,12 @@
         <w:pStyle w:val="ListBullet"/>
         <w:keepNext w:val="0"/>
         <w:pageBreakBefore w:val="0"/>
-        <w:spacing w:before="0" w:after="10" w:line="240" w:lineRule="auto"/>
+        <w:spacing w:before="0" w:after="8" w:line="240" w:lineRule="auto"/>
         <w:ind w:left="288"/>
       </w:pPr>
       <w:r>
         <w:rPr>
-          <w:rFonts w:ascii="Calibri" w:hAnsi="Calibri" w:eastAsia="Calibri"/>
+          <w:rFonts w:ascii="Calibri" w:hAnsi="Calibri" w:eastAsia="Calibri" w:cs="Calibri"/>
           <w:b w:val="0"/>
           <w:color w:val="1A1A1A"/>
           <w:sz w:val="19"/>
@@ -1787,12 +1796,12 @@
         <w:pStyle w:val="ListBullet"/>
         <w:keepNext w:val="0"/>
         <w:pageBreakBefore w:val="0"/>
-        <w:spacing w:before="0" w:after="10" w:line="240" w:lineRule="auto"/>
+        <w:spacing w:before="0" w:after="8" w:line="240" w:lineRule="auto"/>
         <w:ind w:left="288"/>
       </w:pPr>
       <w:r>
         <w:rPr>
-          <w:rFonts w:ascii="Calibri" w:hAnsi="Calibri" w:eastAsia="Calibri"/>
+          <w:rFonts w:ascii="Calibri" w:hAnsi="Calibri" w:eastAsia="Calibri" w:cs="Calibri"/>
           <w:b w:val="0"/>
           <w:color w:val="1A1A1A"/>
           <w:sz w:val="19"/>
@@ -1807,23 +1816,23 @@
         <w:tabs>
           <w:tab w:pos="10224" w:val="right"/>
         </w:tabs>
-        <w:spacing w:before="100" w:after="20" w:line="240" w:lineRule="auto"/>
+        <w:spacing w:before="80" w:after="12" w:line="240" w:lineRule="auto"/>
       </w:pPr>
       <w:r>
         <w:rPr>
-          <w:rFonts w:ascii="Calibri" w:hAnsi="Calibri" w:eastAsia="Calibri"/>
+          <w:rFonts w:ascii="Calibri" w:hAnsi="Calibri" w:eastAsia="Calibri" w:cs="Calibri"/>
           <w:b/>
           <w:color w:val="1A1A1A"/>
-          <w:sz w:val="21"/>
+          <w:sz w:val="22"/>
         </w:rPr>
         <w:t>React Native Skia App</w:t>
       </w:r>
       <w:r>
         <w:rPr>
-          <w:rFonts w:ascii="Calibri" w:hAnsi="Calibri" w:eastAsia="Calibri"/>
+          <w:rFonts w:ascii="Calibri" w:hAnsi="Calibri" w:eastAsia="Calibri" w:cs="Calibri"/>
           <w:b w:val="0"/>
           <w:color w:val="4A4A4A"/>
-          <w:sz w:val="19"/>
+          <w:sz w:val="20"/>
         </w:rPr>
         <w:tab/>
         <w:t>2024</w:t>
@@ -1834,12 +1843,12 @@
         <w:pStyle w:val="ListBullet"/>
         <w:keepNext w:val="0"/>
         <w:pageBreakBefore w:val="0"/>
-        <w:spacing w:before="0" w:after="10" w:line="240" w:lineRule="auto"/>
+        <w:spacing w:before="0" w:after="8" w:line="240" w:lineRule="auto"/>
         <w:ind w:left="288"/>
       </w:pPr>
       <w:r>
         <w:rPr>
-          <w:rFonts w:ascii="Calibri" w:hAnsi="Calibri" w:eastAsia="Calibri"/>
+          <w:rFonts w:ascii="Calibri" w:hAnsi="Calibri" w:eastAsia="Calibri" w:cs="Calibri"/>
           <w:b w:val="0"/>
           <w:color w:val="1A1A1A"/>
           <w:sz w:val="19"/>
@@ -1852,12 +1861,12 @@
         <w:pStyle w:val="ListBullet"/>
         <w:keepNext w:val="0"/>
         <w:pageBreakBefore w:val="0"/>
-        <w:spacing w:before="0" w:after="10" w:line="240" w:lineRule="auto"/>
+        <w:spacing w:before="0" w:after="8" w:line="240" w:lineRule="auto"/>
         <w:ind w:left="288"/>
       </w:pPr>
       <w:r>
         <w:rPr>
-          <w:rFonts w:ascii="Calibri" w:hAnsi="Calibri" w:eastAsia="Calibri"/>
+          <w:rFonts w:ascii="Calibri" w:hAnsi="Calibri" w:eastAsia="Calibri" w:cs="Calibri"/>
           <w:b w:val="0"/>
           <w:color w:val="1A1A1A"/>
           <w:sz w:val="19"/>
@@ -1870,12 +1879,12 @@
         <w:pStyle w:val="ListBullet"/>
         <w:keepNext w:val="0"/>
         <w:pageBreakBefore w:val="0"/>
-        <w:spacing w:before="0" w:after="10" w:line="240" w:lineRule="auto"/>
+        <w:spacing w:before="0" w:after="8" w:line="240" w:lineRule="auto"/>
         <w:ind w:left="288"/>
       </w:pPr>
       <w:r>
         <w:rPr>
-          <w:rFonts w:ascii="Calibri" w:hAnsi="Calibri" w:eastAsia="Calibri"/>
+          <w:rFonts w:ascii="Calibri" w:hAnsi="Calibri" w:eastAsia="Calibri" w:cs="Calibri"/>
           <w:b w:val="0"/>
           <w:color w:val="1A1A1A"/>
           <w:sz w:val="19"/>
@@ -1888,12 +1897,12 @@
         <w:pStyle w:val="ListBullet"/>
         <w:keepNext w:val="0"/>
         <w:pageBreakBefore w:val="0"/>
-        <w:spacing w:before="0" w:after="10" w:line="240" w:lineRule="auto"/>
+        <w:spacing w:before="0" w:after="8" w:line="240" w:lineRule="auto"/>
         <w:ind w:left="288"/>
       </w:pPr>
       <w:r>
         <w:rPr>
-          <w:rFonts w:ascii="Calibri" w:hAnsi="Calibri" w:eastAsia="Calibri"/>
+          <w:rFonts w:ascii="Calibri" w:hAnsi="Calibri" w:eastAsia="Calibri" w:cs="Calibri"/>
           <w:b w:val="0"/>
           <w:color w:val="1A1A1A"/>
           <w:sz w:val="19"/>
@@ -1906,12 +1915,12 @@
         <w:pStyle w:val="ListBullet"/>
         <w:keepNext w:val="0"/>
         <w:pageBreakBefore w:val="0"/>
-        <w:spacing w:before="0" w:after="10" w:line="240" w:lineRule="auto"/>
+        <w:spacing w:before="0" w:after="8" w:line="240" w:lineRule="auto"/>
         <w:ind w:left="288"/>
       </w:pPr>
       <w:r>
         <w:rPr>
-          <w:rFonts w:ascii="Calibri" w:hAnsi="Calibri" w:eastAsia="Calibri"/>
+          <w:rFonts w:ascii="Calibri" w:hAnsi="Calibri" w:eastAsia="Calibri" w:cs="Calibri"/>
           <w:b w:val="0"/>
           <w:color w:val="1A1A1A"/>
           <w:sz w:val="19"/>
@@ -1920,7 +1929,7 @@
       </w:r>
       <w:r>
         <w:rPr>
-          <w:rFonts w:ascii="Calibri" w:hAnsi="Calibri" w:eastAsia="Calibri"/>
+          <w:rFonts w:ascii="Calibri" w:hAnsi="Calibri" w:eastAsia="Calibri" w:cs="Calibri"/>
           <w:b/>
           <w:color w:val="1A1A1A"/>
           <w:sz w:val="19"/>
@@ -1929,7 +1938,7 @@
       </w:r>
       <w:r>
         <w:rPr>
-          <w:rFonts w:ascii="Calibri" w:hAnsi="Calibri" w:eastAsia="Calibri"/>
+          <w:rFonts w:ascii="Calibri" w:hAnsi="Calibri" w:eastAsia="Calibri" w:cs="Calibri"/>
           <w:b w:val="0"/>
           <w:color w:val="1A1A1A"/>
           <w:sz w:val="19"/>
@@ -1942,12 +1951,12 @@
         <w:pStyle w:val="ListBullet"/>
         <w:keepNext w:val="0"/>
         <w:pageBreakBefore w:val="0"/>
-        <w:spacing w:before="0" w:after="10" w:line="240" w:lineRule="auto"/>
+        <w:spacing w:before="0" w:after="8" w:line="240" w:lineRule="auto"/>
         <w:ind w:left="288"/>
       </w:pPr>
       <w:r>
         <w:rPr>
-          <w:rFonts w:ascii="Calibri" w:hAnsi="Calibri" w:eastAsia="Calibri"/>
+          <w:rFonts w:ascii="Calibri" w:hAnsi="Calibri" w:eastAsia="Calibri" w:cs="Calibri"/>
           <w:b w:val="0"/>
           <w:color w:val="1A1A1A"/>
           <w:sz w:val="19"/>
@@ -1956,7 +1965,7 @@
       </w:r>
       <w:r>
         <w:rPr>
-          <w:rFonts w:ascii="Calibri" w:hAnsi="Calibri" w:eastAsia="Calibri"/>
+          <w:rFonts w:ascii="Calibri" w:hAnsi="Calibri" w:eastAsia="Calibri" w:cs="Calibri"/>
           <w:b/>
           <w:color w:val="1A1A1A"/>
           <w:sz w:val="19"/>
@@ -1965,7 +1974,7 @@
       </w:r>
       <w:r>
         <w:rPr>
-          <w:rFonts w:ascii="Calibri" w:hAnsi="Calibri" w:eastAsia="Calibri"/>
+          <w:rFonts w:ascii="Calibri" w:hAnsi="Calibri" w:eastAsia="Calibri" w:cs="Calibri"/>
           <w:b w:val="0"/>
           <w:color w:val="1A1A1A"/>
           <w:sz w:val="19"/>
@@ -1980,23 +1989,23 @@
         <w:tabs>
           <w:tab w:pos="10224" w:val="right"/>
         </w:tabs>
-        <w:spacing w:before="100" w:after="20" w:line="240" w:lineRule="auto"/>
+        <w:spacing w:before="80" w:after="12" w:line="240" w:lineRule="auto"/>
       </w:pPr>
       <w:r>
         <w:rPr>
-          <w:rFonts w:ascii="Calibri" w:hAnsi="Calibri" w:eastAsia="Calibri"/>
+          <w:rFonts w:ascii="Calibri" w:hAnsi="Calibri" w:eastAsia="Calibri" w:cs="Calibri"/>
           <w:b/>
           <w:color w:val="1A1A1A"/>
-          <w:sz w:val="21"/>
+          <w:sz w:val="22"/>
         </w:rPr>
         <w:t>React Native Student App</w:t>
       </w:r>
       <w:r>
         <w:rPr>
-          <w:rFonts w:ascii="Calibri" w:hAnsi="Calibri" w:eastAsia="Calibri"/>
+          <w:rFonts w:ascii="Calibri" w:hAnsi="Calibri" w:eastAsia="Calibri" w:cs="Calibri"/>
           <w:b w:val="0"/>
           <w:color w:val="4A4A4A"/>
-          <w:sz w:val="19"/>
+          <w:sz w:val="20"/>
         </w:rPr>
         <w:tab/>
         <w:t>2023</w:t>
@@ -2007,12 +2016,12 @@
         <w:pStyle w:val="ListBullet"/>
         <w:keepNext w:val="0"/>
         <w:pageBreakBefore w:val="0"/>
-        <w:spacing w:before="0" w:after="10" w:line="240" w:lineRule="auto"/>
+        <w:spacing w:before="0" w:after="8" w:line="240" w:lineRule="auto"/>
         <w:ind w:left="288"/>
       </w:pPr>
       <w:r>
         <w:rPr>
-          <w:rFonts w:ascii="Calibri" w:hAnsi="Calibri" w:eastAsia="Calibri"/>
+          <w:rFonts w:ascii="Calibri" w:hAnsi="Calibri" w:eastAsia="Calibri" w:cs="Calibri"/>
           <w:b w:val="0"/>
           <w:color w:val="1A1A1A"/>
           <w:sz w:val="19"/>
@@ -2025,12 +2034,12 @@
         <w:pStyle w:val="ListBullet"/>
         <w:keepNext w:val="0"/>
         <w:pageBreakBefore w:val="0"/>
-        <w:spacing w:before="0" w:after="10" w:line="240" w:lineRule="auto"/>
+        <w:spacing w:before="0" w:after="8" w:line="240" w:lineRule="auto"/>
         <w:ind w:left="288"/>
       </w:pPr>
       <w:r>
         <w:rPr>
-          <w:rFonts w:ascii="Calibri" w:hAnsi="Calibri" w:eastAsia="Calibri"/>
+          <w:rFonts w:ascii="Calibri" w:hAnsi="Calibri" w:eastAsia="Calibri" w:cs="Calibri"/>
           <w:b w:val="0"/>
           <w:color w:val="1A1A1A"/>
           <w:sz w:val="19"/>
@@ -2039,7 +2048,7 @@
       </w:r>
       <w:r>
         <w:rPr>
-          <w:rFonts w:ascii="Calibri" w:hAnsi="Calibri" w:eastAsia="Calibri"/>
+          <w:rFonts w:ascii="Calibri" w:hAnsi="Calibri" w:eastAsia="Calibri" w:cs="Calibri"/>
           <w:b/>
           <w:color w:val="1A1A1A"/>
           <w:sz w:val="19"/>
@@ -2048,7 +2057,7 @@
       </w:r>
       <w:r>
         <w:rPr>
-          <w:rFonts w:ascii="Calibri" w:hAnsi="Calibri" w:eastAsia="Calibri"/>
+          <w:rFonts w:ascii="Calibri" w:hAnsi="Calibri" w:eastAsia="Calibri" w:cs="Calibri"/>
           <w:b w:val="0"/>
           <w:color w:val="1A1A1A"/>
           <w:sz w:val="19"/>
@@ -2057,7 +2066,7 @@
       </w:r>
       <w:r>
         <w:rPr>
-          <w:rFonts w:ascii="Calibri" w:hAnsi="Calibri" w:eastAsia="Calibri"/>
+          <w:rFonts w:ascii="Calibri" w:hAnsi="Calibri" w:eastAsia="Calibri" w:cs="Calibri"/>
           <w:b/>
           <w:color w:val="1A1A1A"/>
           <w:sz w:val="19"/>
@@ -2066,7 +2075,7 @@
       </w:r>
       <w:r>
         <w:rPr>
-          <w:rFonts w:ascii="Calibri" w:hAnsi="Calibri" w:eastAsia="Calibri"/>
+          <w:rFonts w:ascii="Calibri" w:hAnsi="Calibri" w:eastAsia="Calibri" w:cs="Calibri"/>
           <w:b w:val="0"/>
           <w:color w:val="1A1A1A"/>
           <w:sz w:val="19"/>
@@ -2079,12 +2088,12 @@
         <w:pStyle w:val="ListBullet"/>
         <w:keepNext w:val="0"/>
         <w:pageBreakBefore w:val="0"/>
-        <w:spacing w:before="0" w:after="10" w:line="240" w:lineRule="auto"/>
+        <w:spacing w:before="0" w:after="8" w:line="240" w:lineRule="auto"/>
         <w:ind w:left="288"/>
       </w:pPr>
       <w:r>
         <w:rPr>
-          <w:rFonts w:ascii="Calibri" w:hAnsi="Calibri" w:eastAsia="Calibri"/>
+          <w:rFonts w:ascii="Calibri" w:hAnsi="Calibri" w:eastAsia="Calibri" w:cs="Calibri"/>
           <w:b w:val="0"/>
           <w:color w:val="1A1A1A"/>
           <w:sz w:val="19"/>
@@ -2093,7 +2102,7 @@
       </w:r>
       <w:r>
         <w:rPr>
-          <w:rFonts w:ascii="Calibri" w:hAnsi="Calibri" w:eastAsia="Calibri"/>
+          <w:rFonts w:ascii="Calibri" w:hAnsi="Calibri" w:eastAsia="Calibri" w:cs="Calibri"/>
           <w:b/>
           <w:color w:val="1A1A1A"/>
           <w:sz w:val="19"/>
@@ -2102,7 +2111,7 @@
       </w:r>
       <w:r>
         <w:rPr>
-          <w:rFonts w:ascii="Calibri" w:hAnsi="Calibri" w:eastAsia="Calibri"/>
+          <w:rFonts w:ascii="Calibri" w:hAnsi="Calibri" w:eastAsia="Calibri" w:cs="Calibri"/>
           <w:b w:val="0"/>
           <w:color w:val="1A1A1A"/>
           <w:sz w:val="19"/>
@@ -2111,7 +2120,7 @@
       </w:r>
       <w:r>
         <w:rPr>
-          <w:rFonts w:ascii="Calibri" w:hAnsi="Calibri" w:eastAsia="Calibri"/>
+          <w:rFonts w:ascii="Calibri" w:hAnsi="Calibri" w:eastAsia="Calibri" w:cs="Calibri"/>
           <w:b/>
           <w:color w:val="1A1A1A"/>
           <w:sz w:val="19"/>
@@ -2120,7 +2129,7 @@
       </w:r>
       <w:r>
         <w:rPr>
-          <w:rFonts w:ascii="Calibri" w:hAnsi="Calibri" w:eastAsia="Calibri"/>
+          <w:rFonts w:ascii="Calibri" w:hAnsi="Calibri" w:eastAsia="Calibri" w:cs="Calibri"/>
           <w:b w:val="0"/>
           <w:color w:val="1A1A1A"/>
           <w:sz w:val="19"/>
@@ -2133,12 +2142,12 @@
         <w:pStyle w:val="ListBullet"/>
         <w:keepNext w:val="0"/>
         <w:pageBreakBefore w:val="0"/>
-        <w:spacing w:before="0" w:after="10" w:line="240" w:lineRule="auto"/>
+        <w:spacing w:before="0" w:after="8" w:line="240" w:lineRule="auto"/>
         <w:ind w:left="288"/>
       </w:pPr>
       <w:r>
         <w:rPr>
-          <w:rFonts w:ascii="Calibri" w:hAnsi="Calibri" w:eastAsia="Calibri"/>
+          <w:rFonts w:ascii="Calibri" w:hAnsi="Calibri" w:eastAsia="Calibri" w:cs="Calibri"/>
           <w:b w:val="0"/>
           <w:color w:val="1A1A1A"/>
           <w:sz w:val="19"/>
@@ -2147,7 +2156,7 @@
       </w:r>
       <w:r>
         <w:rPr>
-          <w:rFonts w:ascii="Calibri" w:hAnsi="Calibri" w:eastAsia="Calibri"/>
+          <w:rFonts w:ascii="Calibri" w:hAnsi="Calibri" w:eastAsia="Calibri" w:cs="Calibri"/>
           <w:b/>
           <w:color w:val="1A1A1A"/>
           <w:sz w:val="19"/>
@@ -2156,7 +2165,7 @@
       </w:r>
       <w:r>
         <w:rPr>
-          <w:rFonts w:ascii="Calibri" w:hAnsi="Calibri" w:eastAsia="Calibri"/>
+          <w:rFonts w:ascii="Calibri" w:hAnsi="Calibri" w:eastAsia="Calibri" w:cs="Calibri"/>
           <w:b w:val="0"/>
           <w:color w:val="1A1A1A"/>
           <w:sz w:val="19"/>
@@ -2165,7 +2174,7 @@
       </w:r>
       <w:r>
         <w:rPr>
-          <w:rFonts w:ascii="Calibri" w:hAnsi="Calibri" w:eastAsia="Calibri"/>
+          <w:rFonts w:ascii="Calibri" w:hAnsi="Calibri" w:eastAsia="Calibri" w:cs="Calibri"/>
           <w:b/>
           <w:color w:val="1A1A1A"/>
           <w:sz w:val="19"/>
@@ -2174,7 +2183,7 @@
       </w:r>
       <w:r>
         <w:rPr>
-          <w:rFonts w:ascii="Calibri" w:hAnsi="Calibri" w:eastAsia="Calibri"/>
+          <w:rFonts w:ascii="Calibri" w:hAnsi="Calibri" w:eastAsia="Calibri" w:cs="Calibri"/>
           <w:b w:val="0"/>
           <w:color w:val="1A1A1A"/>
           <w:sz w:val="19"/>
@@ -2187,12 +2196,12 @@
         <w:pStyle w:val="ListBullet"/>
         <w:keepNext w:val="0"/>
         <w:pageBreakBefore w:val="0"/>
-        <w:spacing w:before="0" w:after="10" w:line="240" w:lineRule="auto"/>
+        <w:spacing w:before="0" w:after="8" w:line="240" w:lineRule="auto"/>
         <w:ind w:left="288"/>
       </w:pPr>
       <w:r>
         <w:rPr>
-          <w:rFonts w:ascii="Calibri" w:hAnsi="Calibri" w:eastAsia="Calibri"/>
+          <w:rFonts w:ascii="Calibri" w:hAnsi="Calibri" w:eastAsia="Calibri" w:cs="Calibri"/>
           <w:b w:val="0"/>
           <w:color w:val="1A1A1A"/>
           <w:sz w:val="19"/>
@@ -2205,12 +2214,12 @@
         <w:pStyle w:val="ListBullet"/>
         <w:keepNext w:val="0"/>
         <w:pageBreakBefore w:val="0"/>
-        <w:spacing w:before="0" w:after="10" w:line="240" w:lineRule="auto"/>
+        <w:spacing w:before="0" w:after="8" w:line="240" w:lineRule="auto"/>
         <w:ind w:left="288"/>
       </w:pPr>
       <w:r>
         <w:rPr>
-          <w:rFonts w:ascii="Calibri" w:hAnsi="Calibri" w:eastAsia="Calibri"/>
+          <w:rFonts w:ascii="Calibri" w:hAnsi="Calibri" w:eastAsia="Calibri" w:cs="Calibri"/>
           <w:b w:val="0"/>
           <w:color w:val="1A1A1A"/>
           <w:sz w:val="19"/>
@@ -2222,14 +2231,17 @@
       <w:pPr>
         <w:keepNext/>
         <w:pageBreakBefore w:val="0"/>
-        <w:spacing w:before="140" w:after="60" w:line="240" w:lineRule="auto"/>
+        <w:spacing w:before="100" w:after="40" w:line="240" w:lineRule="auto"/>
+        <w:pBdr>
+          <w:bottom w:val="single" w:sz="12" w:space="1" w:color="2C2C2C"/>
+        </w:pBdr>
       </w:pPr>
       <w:r>
         <w:rPr>
-          <w:rFonts w:ascii="Calibri" w:hAnsi="Calibri" w:eastAsia="Calibri"/>
+          <w:rFonts w:ascii="Calibri" w:hAnsi="Calibri" w:eastAsia="Calibri" w:cs="Calibri"/>
           <w:b/>
           <w:color w:val="2C2C2C"/>
-          <w:sz w:val="21"/>
+          <w:sz w:val="22"/>
         </w:rPr>
         <w:t>OTHER WORK</w:t>
       </w:r>
@@ -2238,32 +2250,32 @@
       <w:pPr>
         <w:keepNext w:val="0"/>
         <w:pageBreakBefore w:val="0"/>
-        <w:spacing w:before="0" w:after="40" w:line="240" w:lineRule="auto"/>
+        <w:spacing w:before="0" w:after="28" w:line="240" w:lineRule="auto"/>
       </w:pPr>
       <w:r>
         <w:rPr>
-          <w:rFonts w:ascii="Calibri" w:hAnsi="Calibri" w:eastAsia="Calibri"/>
+          <w:rFonts w:ascii="Calibri" w:hAnsi="Calibri" w:eastAsia="Calibri" w:cs="Calibri"/>
           <w:b w:val="0"/>
           <w:color w:val="1A1A1A"/>
-          <w:sz w:val="19"/>
+          <w:sz w:val="20"/>
         </w:rPr>
         <w:t xml:space="preserve">Also shipped restaurant loyalty/membership apps (React Native), a homebound elderly care app (Flutter), campaign / e-commerce storefronts (Next.js, Shopify </w:t>
       </w:r>
       <w:r>
         <w:rPr>
-          <w:rFonts w:ascii="Calibri" w:hAnsi="Calibri" w:eastAsia="Calibri"/>
+          <w:rFonts w:ascii="Calibri" w:hAnsi="Calibri" w:eastAsia="Calibri" w:cs="Calibri"/>
           <w:b/>
           <w:color w:val="1A1A1A"/>
-          <w:sz w:val="19"/>
+          <w:sz w:val="20"/>
         </w:rPr>
         <w:t>GraphQL</w:t>
       </w:r>
       <w:r>
         <w:rPr>
-          <w:rFonts w:ascii="Calibri" w:hAnsi="Calibri" w:eastAsia="Calibri"/>
+          <w:rFonts w:ascii="Calibri" w:hAnsi="Calibri" w:eastAsia="Calibri" w:cs="Calibri"/>
           <w:b w:val="0"/>
           <w:color w:val="1A1A1A"/>
-          <w:sz w:val="19"/>
+          <w:sz w:val="20"/>
         </w:rPr>
         <w:t>), CMS content sites, and multiple RBAC admin systems.</w:t>
       </w:r>
@@ -2272,14 +2284,17 @@
       <w:pPr>
         <w:keepNext/>
         <w:pageBreakBefore w:val="0"/>
-        <w:spacing w:before="140" w:after="60" w:line="240" w:lineRule="auto"/>
+        <w:spacing w:before="100" w:after="40" w:line="240" w:lineRule="auto"/>
+        <w:pBdr>
+          <w:bottom w:val="single" w:sz="12" w:space="1" w:color="2C2C2C"/>
+        </w:pBdr>
       </w:pPr>
       <w:r>
         <w:rPr>
-          <w:rFonts w:ascii="Calibri" w:hAnsi="Calibri" w:eastAsia="Calibri"/>
+          <w:rFonts w:ascii="Calibri" w:hAnsi="Calibri" w:eastAsia="Calibri" w:cs="Calibri"/>
           <w:b/>
           <w:color w:val="2C2C2C"/>
-          <w:sz w:val="21"/>
+          <w:sz w:val="22"/>
         </w:rPr>
         <w:t>SKILLS</w:t>
       </w:r>
@@ -2288,11 +2303,11 @@
       <w:pPr>
         <w:keepNext w:val="0"/>
         <w:pageBreakBefore w:val="0"/>
-        <w:spacing w:before="0" w:after="10" w:line="240" w:lineRule="auto"/>
+        <w:spacing w:before="0" w:after="8" w:line="240" w:lineRule="auto"/>
       </w:pPr>
       <w:r>
         <w:rPr>
-          <w:rFonts w:ascii="Calibri" w:hAnsi="Calibri" w:eastAsia="Calibri"/>
+          <w:rFonts w:ascii="Calibri" w:hAnsi="Calibri" w:eastAsia="Calibri" w:cs="Calibri"/>
           <w:b/>
           <w:color w:val="1A1A1A"/>
           <w:sz w:val="19"/>
@@ -2301,7 +2316,7 @@
       </w:r>
       <w:r>
         <w:rPr>
-          <w:rFonts w:ascii="Calibri" w:hAnsi="Calibri" w:eastAsia="Calibri"/>
+          <w:rFonts w:ascii="Calibri" w:hAnsi="Calibri" w:eastAsia="Calibri" w:cs="Calibri"/>
           <w:b w:val="0"/>
           <w:color w:val="1A1A1A"/>
           <w:sz w:val="19"/>
@@ -2313,11 +2328,11 @@
       <w:pPr>
         <w:keepNext w:val="0"/>
         <w:pageBreakBefore w:val="0"/>
-        <w:spacing w:before="0" w:after="10" w:line="240" w:lineRule="auto"/>
+        <w:spacing w:before="0" w:after="8" w:line="240" w:lineRule="auto"/>
       </w:pPr>
       <w:r>
         <w:rPr>
-          <w:rFonts w:ascii="Calibri" w:hAnsi="Calibri" w:eastAsia="Calibri"/>
+          <w:rFonts w:ascii="Calibri" w:hAnsi="Calibri" w:eastAsia="Calibri" w:cs="Calibri"/>
           <w:b/>
           <w:color w:val="1A1A1A"/>
           <w:sz w:val="19"/>
@@ -2326,7 +2341,7 @@
       </w:r>
       <w:r>
         <w:rPr>
-          <w:rFonts w:ascii="Calibri" w:hAnsi="Calibri" w:eastAsia="Calibri"/>
+          <w:rFonts w:ascii="Calibri" w:hAnsi="Calibri" w:eastAsia="Calibri" w:cs="Calibri"/>
           <w:b w:val="0"/>
           <w:color w:val="1A1A1A"/>
           <w:sz w:val="19"/>
@@ -2338,11 +2353,11 @@
       <w:pPr>
         <w:keepNext w:val="0"/>
         <w:pageBreakBefore w:val="0"/>
-        <w:spacing w:before="0" w:after="10" w:line="240" w:lineRule="auto"/>
+        <w:spacing w:before="0" w:after="8" w:line="240" w:lineRule="auto"/>
       </w:pPr>
       <w:r>
         <w:rPr>
-          <w:rFonts w:ascii="Calibri" w:hAnsi="Calibri" w:eastAsia="Calibri"/>
+          <w:rFonts w:ascii="Calibri" w:hAnsi="Calibri" w:eastAsia="Calibri" w:cs="Calibri"/>
           <w:b/>
           <w:color w:val="1A1A1A"/>
           <w:sz w:val="19"/>
@@ -2351,7 +2366,7 @@
       </w:r>
       <w:r>
         <w:rPr>
-          <w:rFonts w:ascii="Calibri" w:hAnsi="Calibri" w:eastAsia="Calibri"/>
+          <w:rFonts w:ascii="Calibri" w:hAnsi="Calibri" w:eastAsia="Calibri" w:cs="Calibri"/>
           <w:b w:val="0"/>
           <w:color w:val="1A1A1A"/>
           <w:sz w:val="19"/>
@@ -2363,11 +2378,11 @@
       <w:pPr>
         <w:keepNext w:val="0"/>
         <w:pageBreakBefore w:val="0"/>
-        <w:spacing w:before="0" w:after="10" w:line="240" w:lineRule="auto"/>
+        <w:spacing w:before="0" w:after="8" w:line="240" w:lineRule="auto"/>
       </w:pPr>
       <w:r>
         <w:rPr>
-          <w:rFonts w:ascii="Calibri" w:hAnsi="Calibri" w:eastAsia="Calibri"/>
+          <w:rFonts w:ascii="Calibri" w:hAnsi="Calibri" w:eastAsia="Calibri" w:cs="Calibri"/>
           <w:b/>
           <w:color w:val="1A1A1A"/>
           <w:sz w:val="19"/>
@@ -2376,7 +2391,7 @@
       </w:r>
       <w:r>
         <w:rPr>
-          <w:rFonts w:ascii="Calibri" w:hAnsi="Calibri" w:eastAsia="Calibri"/>
+          <w:rFonts w:ascii="Calibri" w:hAnsi="Calibri" w:eastAsia="Calibri" w:cs="Calibri"/>
           <w:b w:val="0"/>
           <w:color w:val="1A1A1A"/>
           <w:sz w:val="19"/>
@@ -2388,11 +2403,11 @@
       <w:pPr>
         <w:keepNext w:val="0"/>
         <w:pageBreakBefore w:val="0"/>
-        <w:spacing w:before="0" w:after="10" w:line="240" w:lineRule="auto"/>
+        <w:spacing w:before="0" w:after="8" w:line="240" w:lineRule="auto"/>
       </w:pPr>
       <w:r>
         <w:rPr>
-          <w:rFonts w:ascii="Calibri" w:hAnsi="Calibri" w:eastAsia="Calibri"/>
+          <w:rFonts w:ascii="Calibri" w:hAnsi="Calibri" w:eastAsia="Calibri" w:cs="Calibri"/>
           <w:b/>
           <w:color w:val="1A1A1A"/>
           <w:sz w:val="19"/>
@@ -2401,7 +2416,7 @@
       </w:r>
       <w:r>
         <w:rPr>
-          <w:rFonts w:ascii="Calibri" w:hAnsi="Calibri" w:eastAsia="Calibri"/>
+          <w:rFonts w:ascii="Calibri" w:hAnsi="Calibri" w:eastAsia="Calibri" w:cs="Calibri"/>
           <w:b w:val="0"/>
           <w:color w:val="1A1A1A"/>
           <w:sz w:val="19"/>
@@ -2413,11 +2428,11 @@
       <w:pPr>
         <w:keepNext w:val="0"/>
         <w:pageBreakBefore w:val="0"/>
-        <w:spacing w:before="0" w:after="10" w:line="240" w:lineRule="auto"/>
+        <w:spacing w:before="0" w:after="8" w:line="240" w:lineRule="auto"/>
       </w:pPr>
       <w:r>
         <w:rPr>
-          <w:rFonts w:ascii="Calibri" w:hAnsi="Calibri" w:eastAsia="Calibri"/>
+          <w:rFonts w:ascii="Calibri" w:hAnsi="Calibri" w:eastAsia="Calibri" w:cs="Calibri"/>
           <w:b/>
           <w:color w:val="1A1A1A"/>
           <w:sz w:val="19"/>
@@ -2426,7 +2441,7 @@
       </w:r>
       <w:r>
         <w:rPr>
-          <w:rFonts w:ascii="Calibri" w:hAnsi="Calibri" w:eastAsia="Calibri"/>
+          <w:rFonts w:ascii="Calibri" w:hAnsi="Calibri" w:eastAsia="Calibri" w:cs="Calibri"/>
           <w:b w:val="0"/>
           <w:color w:val="1A1A1A"/>
           <w:sz w:val="19"/>
@@ -2438,11 +2453,11 @@
       <w:pPr>
         <w:keepNext w:val="0"/>
         <w:pageBreakBefore w:val="0"/>
-        <w:spacing w:before="0" w:after="10" w:line="240" w:lineRule="auto"/>
+        <w:spacing w:before="0" w:after="8" w:line="240" w:lineRule="auto"/>
       </w:pPr>
       <w:r>
         <w:rPr>
-          <w:rFonts w:ascii="Calibri" w:hAnsi="Calibri" w:eastAsia="Calibri"/>
+          <w:rFonts w:ascii="Calibri" w:hAnsi="Calibri" w:eastAsia="Calibri" w:cs="Calibri"/>
           <w:b/>
           <w:color w:val="1A1A1A"/>
           <w:sz w:val="19"/>
@@ -2451,7 +2466,7 @@
       </w:r>
       <w:r>
         <w:rPr>
-          <w:rFonts w:ascii="Calibri" w:hAnsi="Calibri" w:eastAsia="Calibri"/>
+          <w:rFonts w:ascii="Calibri" w:hAnsi="Calibri" w:eastAsia="Calibri" w:cs="Calibri"/>
           <w:b w:val="0"/>
           <w:color w:val="1A1A1A"/>
           <w:sz w:val="19"/>
@@ -2463,11 +2478,11 @@
       <w:pPr>
         <w:keepNext w:val="0"/>
         <w:pageBreakBefore w:val="0"/>
-        <w:spacing w:before="0" w:after="10" w:line="240" w:lineRule="auto"/>
+        <w:spacing w:before="0" w:after="8" w:line="240" w:lineRule="auto"/>
       </w:pPr>
       <w:r>
         <w:rPr>
-          <w:rFonts w:ascii="Calibri" w:hAnsi="Calibri" w:eastAsia="Calibri"/>
+          <w:rFonts w:ascii="Calibri" w:hAnsi="Calibri" w:eastAsia="Calibri" w:cs="Calibri"/>
           <w:b/>
           <w:color w:val="1A1A1A"/>
           <w:sz w:val="19"/>
@@ -2476,7 +2491,7 @@
       </w:r>
       <w:r>
         <w:rPr>
-          <w:rFonts w:ascii="Calibri" w:hAnsi="Calibri" w:eastAsia="Calibri"/>
+          <w:rFonts w:ascii="Calibri" w:hAnsi="Calibri" w:eastAsia="Calibri" w:cs="Calibri"/>
           <w:b w:val="0"/>
           <w:color w:val="1A1A1A"/>
           <w:sz w:val="19"/>
@@ -2488,11 +2503,11 @@
       <w:pPr>
         <w:keepNext w:val="0"/>
         <w:pageBreakBefore w:val="0"/>
-        <w:spacing w:before="0" w:after="10" w:line="240" w:lineRule="auto"/>
+        <w:spacing w:before="0" w:after="8" w:line="240" w:lineRule="auto"/>
       </w:pPr>
       <w:r>
         <w:rPr>
-          <w:rFonts w:ascii="Calibri" w:hAnsi="Calibri" w:eastAsia="Calibri"/>
+          <w:rFonts w:ascii="Calibri" w:hAnsi="Calibri" w:eastAsia="Calibri" w:cs="Calibri"/>
           <w:b/>
           <w:color w:val="1A1A1A"/>
           <w:sz w:val="19"/>
@@ -2501,7 +2516,7 @@
       </w:r>
       <w:r>
         <w:rPr>
-          <w:rFonts w:ascii="Calibri" w:hAnsi="Calibri" w:eastAsia="Calibri"/>
+          <w:rFonts w:ascii="Calibri" w:hAnsi="Calibri" w:eastAsia="Calibri" w:cs="Calibri"/>
           <w:b w:val="0"/>
           <w:color w:val="1A1A1A"/>
           <w:sz w:val="19"/>
@@ -2513,14 +2528,17 @@
       <w:pPr>
         <w:keepNext/>
         <w:pageBreakBefore w:val="0"/>
-        <w:spacing w:before="140" w:after="60" w:line="240" w:lineRule="auto"/>
+        <w:spacing w:before="100" w:after="40" w:line="240" w:lineRule="auto"/>
+        <w:pBdr>
+          <w:bottom w:val="single" w:sz="12" w:space="1" w:color="2C2C2C"/>
+        </w:pBdr>
       </w:pPr>
       <w:r>
         <w:rPr>
-          <w:rFonts w:ascii="Calibri" w:hAnsi="Calibri" w:eastAsia="Calibri"/>
+          <w:rFonts w:ascii="Calibri" w:hAnsi="Calibri" w:eastAsia="Calibri" w:cs="Calibri"/>
           <w:b/>
           <w:color w:val="2C2C2C"/>
-          <w:sz w:val="21"/>
+          <w:sz w:val="22"/>
         </w:rPr>
         <w:t>QUALIFICATIONS</w:t>
       </w:r>
@@ -2530,12 +2548,12 @@
         <w:pStyle w:val="ListBullet"/>
         <w:keepNext w:val="0"/>
         <w:pageBreakBefore w:val="0"/>
-        <w:spacing w:before="0" w:after="10" w:line="240" w:lineRule="auto"/>
+        <w:spacing w:before="0" w:after="8" w:line="240" w:lineRule="auto"/>
         <w:ind w:left="288"/>
       </w:pPr>
       <w:r>
         <w:rPr>
-          <w:rFonts w:ascii="Calibri" w:hAnsi="Calibri" w:eastAsia="Calibri"/>
+          <w:rFonts w:ascii="Calibri" w:hAnsi="Calibri" w:eastAsia="Calibri" w:cs="Calibri"/>
           <w:b w:val="0"/>
           <w:color w:val="1A1A1A"/>
           <w:sz w:val="19"/>
@@ -2548,12 +2566,12 @@
         <w:pStyle w:val="ListBullet"/>
         <w:keepNext w:val="0"/>
         <w:pageBreakBefore w:val="0"/>
-        <w:spacing w:before="0" w:after="10" w:line="240" w:lineRule="auto"/>
+        <w:spacing w:before="0" w:after="8" w:line="240" w:lineRule="auto"/>
         <w:ind w:left="288"/>
       </w:pPr>
       <w:r>
         <w:rPr>
-          <w:rFonts w:ascii="Calibri" w:hAnsi="Calibri" w:eastAsia="Calibri"/>
+          <w:rFonts w:ascii="Calibri" w:hAnsi="Calibri" w:eastAsia="Calibri" w:cs="Calibri"/>
           <w:b w:val="0"/>
           <w:color w:val="1A1A1A"/>
           <w:sz w:val="19"/>
@@ -2565,14 +2583,17 @@
       <w:pPr>
         <w:keepNext/>
         <w:pageBreakBefore w:val="0"/>
-        <w:spacing w:before="140" w:after="60" w:line="240" w:lineRule="auto"/>
+        <w:spacing w:before="100" w:after="40" w:line="240" w:lineRule="auto"/>
+        <w:pBdr>
+          <w:bottom w:val="single" w:sz="12" w:space="1" w:color="2C2C2C"/>
+        </w:pBdr>
       </w:pPr>
       <w:r>
         <w:rPr>
-          <w:rFonts w:ascii="Calibri" w:hAnsi="Calibri" w:eastAsia="Calibri"/>
+          <w:rFonts w:ascii="Calibri" w:hAnsi="Calibri" w:eastAsia="Calibri" w:cs="Calibri"/>
           <w:b/>
           <w:color w:val="2C2C2C"/>
-          <w:sz w:val="21"/>
+          <w:sz w:val="22"/>
         </w:rPr>
         <w:t>EDUCATION</w:t>
       </w:r>
@@ -2584,23 +2605,23 @@
         <w:tabs>
           <w:tab w:pos="10224" w:val="right"/>
         </w:tabs>
-        <w:spacing w:before="100" w:after="20" w:line="240" w:lineRule="auto"/>
+        <w:spacing w:before="80" w:after="12" w:line="240" w:lineRule="auto"/>
       </w:pPr>
       <w:r>
         <w:rPr>
-          <w:rFonts w:ascii="Calibri" w:hAnsi="Calibri" w:eastAsia="Calibri"/>
+          <w:rFonts w:ascii="Calibri" w:hAnsi="Calibri" w:eastAsia="Calibri" w:cs="Calibri"/>
           <w:b/>
           <w:color w:val="1A1A1A"/>
-          <w:sz w:val="21"/>
+          <w:sz w:val="22"/>
         </w:rPr>
         <w:t>University College London</w:t>
       </w:r>
       <w:r>
         <w:rPr>
-          <w:rFonts w:ascii="Calibri" w:hAnsi="Calibri" w:eastAsia="Calibri"/>
+          <w:rFonts w:ascii="Calibri" w:hAnsi="Calibri" w:eastAsia="Calibri" w:cs="Calibri"/>
           <w:b w:val="0"/>
           <w:color w:val="4A4A4A"/>
-          <w:sz w:val="19"/>
+          <w:sz w:val="20"/>
         </w:rPr>
         <w:tab/>
         <w:t>2016 – 2020</w:t>
@@ -2611,12 +2632,12 @@
         <w:pStyle w:val="ListBullet"/>
         <w:keepNext w:val="0"/>
         <w:pageBreakBefore w:val="0"/>
-        <w:spacing w:before="0" w:after="10" w:line="240" w:lineRule="auto"/>
+        <w:spacing w:before="0" w:after="8" w:line="240" w:lineRule="auto"/>
         <w:ind w:left="288"/>
       </w:pPr>
       <w:r>
         <w:rPr>
-          <w:rFonts w:ascii="Calibri" w:hAnsi="Calibri" w:eastAsia="Calibri"/>
+          <w:rFonts w:ascii="Calibri" w:hAnsi="Calibri" w:eastAsia="Calibri" w:cs="Calibri"/>
           <w:b w:val="0"/>
           <w:color w:val="1A1A1A"/>
           <w:sz w:val="19"/>
@@ -2629,12 +2650,12 @@
         <w:pStyle w:val="ListBullet"/>
         <w:keepNext w:val="0"/>
         <w:pageBreakBefore w:val="0"/>
-        <w:spacing w:before="0" w:after="10" w:line="240" w:lineRule="auto"/>
+        <w:spacing w:before="0" w:after="8" w:line="240" w:lineRule="auto"/>
         <w:ind w:left="288"/>
       </w:pPr>
       <w:r>
         <w:rPr>
-          <w:rFonts w:ascii="Calibri" w:hAnsi="Calibri" w:eastAsia="Calibri"/>
+          <w:rFonts w:ascii="Calibri" w:hAnsi="Calibri" w:eastAsia="Calibri" w:cs="Calibri"/>
           <w:b w:val="0"/>
           <w:color w:val="1A1A1A"/>
           <w:sz w:val="19"/>

</xml_diff>

<commit_message>
Update resume files and enhance header component with disabled state
- Updated the PDF and DOCX resume files for "full-stack" variants to the latest versions.
- Enhanced the HeaderLink component to support a disabled state, improving user experience by indicating unavailable links.
- Updated the resume links in the layout to reflect the new disabled state for the "components" link, indicating it is coming soon.
</commit_message>
<xml_diff>
--- a/apps/web/src/features/resume/wilsonchow_resume_v4_full-stack.docx
+++ b/apps/web/src/features/resume/wilsonchow_resume_v4_full-stack.docx
@@ -275,7 +275,7 @@
           <w:color w:val="4A4A4A"/>
           <w:sz w:val="19"/>
         </w:rPr>
-        <w:t>Primary engineer for concurrent client products, owning delivery from UX scoping through cloud deployment.</w:t>
+        <w:t>Key developer for concurrent client products, owning delivery from UX scoping through cloud deployment.</w:t>
       </w:r>
     </w:p>
     <w:p>
@@ -897,7 +897,151 @@
           <w:color w:val="1A1A1A"/>
           <w:sz w:val="19"/>
         </w:rPr>
-        <w:t>, memory, schedules, tools, pause/resume, retries, sandboxing, and skills.</w:t>
+        <w:t xml:space="preserve">, memory, schedules, tools, pause/resume, retries, sandboxing, and skills; </w:t>
+      </w:r>
+      <w:r>
+        <w:rPr>
+          <w:rFonts w:ascii="Calibri" w:hAnsi="Calibri" w:eastAsia="Calibri" w:cs="Calibri"/>
+          <w:b/>
+          <w:color w:val="1A1A1A"/>
+          <w:sz w:val="19"/>
+        </w:rPr>
+        <w:t>Langfuse</w:t>
+      </w:r>
+      <w:r>
+        <w:rPr>
+          <w:rFonts w:ascii="Calibri" w:hAnsi="Calibri" w:eastAsia="Calibri" w:cs="Calibri"/>
+          <w:b w:val="0"/>
+          <w:color w:val="1A1A1A"/>
+          <w:sz w:val="19"/>
+        </w:rPr>
+        <w:t xml:space="preserve"> for observability.</w:t>
+      </w:r>
+    </w:p>
+    <w:p>
+      <w:pPr>
+        <w:pStyle w:val="ListBullet"/>
+        <w:keepNext w:val="0"/>
+        <w:pageBreakBefore w:val="0"/>
+        <w:spacing w:before="0" w:after="8" w:line="240" w:lineRule="auto"/>
+        <w:ind w:left="288"/>
+      </w:pPr>
+      <w:r>
+        <w:rPr>
+          <w:rFonts w:ascii="Calibri" w:hAnsi="Calibri" w:eastAsia="Calibri" w:cs="Calibri"/>
+          <w:b w:val="0"/>
+          <w:color w:val="1A1A1A"/>
+          <w:sz w:val="19"/>
+        </w:rPr>
+        <w:t xml:space="preserve">Ran on </w:t>
+      </w:r>
+      <w:r>
+        <w:rPr>
+          <w:rFonts w:ascii="Calibri" w:hAnsi="Calibri" w:eastAsia="Calibri" w:cs="Calibri"/>
+          <w:b/>
+          <w:color w:val="1A1A1A"/>
+          <w:sz w:val="19"/>
+        </w:rPr>
+        <w:t>Hono</w:t>
+      </w:r>
+      <w:r>
+        <w:rPr>
+          <w:rFonts w:ascii="Calibri" w:hAnsi="Calibri" w:eastAsia="Calibri" w:cs="Calibri"/>
+          <w:b w:val="0"/>
+          <w:color w:val="1A1A1A"/>
+          <w:sz w:val="19"/>
+        </w:rPr>
+        <w:t xml:space="preserve">, </w:t>
+      </w:r>
+      <w:r>
+        <w:rPr>
+          <w:rFonts w:ascii="Calibri" w:hAnsi="Calibri" w:eastAsia="Calibri" w:cs="Calibri"/>
+          <w:b/>
+          <w:color w:val="1A1A1A"/>
+          <w:sz w:val="19"/>
+        </w:rPr>
+        <w:t>Better Auth</w:t>
+      </w:r>
+      <w:r>
+        <w:rPr>
+          <w:rFonts w:ascii="Calibri" w:hAnsi="Calibri" w:eastAsia="Calibri" w:cs="Calibri"/>
+          <w:b w:val="0"/>
+          <w:color w:val="1A1A1A"/>
+          <w:sz w:val="19"/>
+        </w:rPr>
+        <w:t xml:space="preserve">, </w:t>
+      </w:r>
+      <w:r>
+        <w:rPr>
+          <w:rFonts w:ascii="Calibri" w:hAnsi="Calibri" w:eastAsia="Calibri" w:cs="Calibri"/>
+          <w:b/>
+          <w:color w:val="1A1A1A"/>
+          <w:sz w:val="19"/>
+        </w:rPr>
+        <w:t>Postgres</w:t>
+      </w:r>
+      <w:r>
+        <w:rPr>
+          <w:rFonts w:ascii="Calibri" w:hAnsi="Calibri" w:eastAsia="Calibri" w:cs="Calibri"/>
+          <w:b w:val="0"/>
+          <w:color w:val="1A1A1A"/>
+          <w:sz w:val="19"/>
+        </w:rPr>
+        <w:t xml:space="preserve"> with </w:t>
+      </w:r>
+      <w:r>
+        <w:rPr>
+          <w:rFonts w:ascii="Calibri" w:hAnsi="Calibri" w:eastAsia="Calibri" w:cs="Calibri"/>
+          <w:b/>
+          <w:color w:val="1A1A1A"/>
+          <w:sz w:val="19"/>
+        </w:rPr>
+        <w:t>Drizzle</w:t>
+      </w:r>
+      <w:r>
+        <w:rPr>
+          <w:rFonts w:ascii="Calibri" w:hAnsi="Calibri" w:eastAsia="Calibri" w:cs="Calibri"/>
+          <w:b w:val="0"/>
+          <w:color w:val="1A1A1A"/>
+          <w:sz w:val="19"/>
+        </w:rPr>
+        <w:t xml:space="preserve"> ORM; </w:t>
+      </w:r>
+      <w:r>
+        <w:rPr>
+          <w:rFonts w:ascii="Calibri" w:hAnsi="Calibri" w:eastAsia="Calibri" w:cs="Calibri"/>
+          <w:b/>
+          <w:color w:val="1A1A1A"/>
+          <w:sz w:val="19"/>
+        </w:rPr>
+        <w:t>S3</w:t>
+      </w:r>
+      <w:r>
+        <w:rPr>
+          <w:rFonts w:ascii="Calibri" w:hAnsi="Calibri" w:eastAsia="Calibri" w:cs="Calibri"/>
+          <w:b w:val="0"/>
+          <w:color w:val="1A1A1A"/>
+          <w:sz w:val="19"/>
+        </w:rPr>
+        <w:t xml:space="preserve"> for file storage; deployed to AWS ECS Fargate using </w:t>
+      </w:r>
+      <w:r>
+        <w:rPr>
+          <w:rFonts w:ascii="Calibri" w:hAnsi="Calibri" w:eastAsia="Calibri" w:cs="Calibri"/>
+          <w:b/>
+          <w:color w:val="1A1A1A"/>
+          <w:sz w:val="19"/>
+        </w:rPr>
+        <w:t>SST</w:t>
+      </w:r>
+      <w:r>
+        <w:rPr>
+          <w:rFonts w:ascii="Calibri" w:hAnsi="Calibri" w:eastAsia="Calibri" w:cs="Calibri"/>
+          <w:b w:val="0"/>
+          <w:color w:val="1A1A1A"/>
+          <w:sz w:val="19"/>
+        </w:rPr>
+        <w:t xml:space="preserve"> as IaC.</w:t>
       </w:r>
     </w:p>
     <w:p>
@@ -997,60 +1141,6 @@
           <w:sz w:val="19"/>
         </w:rPr>
         <w:t xml:space="preserve"> input component for attaching workspace files to messages.</w:t>
-      </w:r>
-    </w:p>
-    <w:p>
-      <w:pPr>
-        <w:pStyle w:val="ListBullet"/>
-        <w:keepNext w:val="0"/>
-        <w:pageBreakBefore w:val="0"/>
-        <w:spacing w:before="0" w:after="8" w:line="240" w:lineRule="auto"/>
-        <w:ind w:left="288"/>
-      </w:pPr>
-      <w:r>
-        <w:rPr>
-          <w:rFonts w:ascii="Calibri" w:hAnsi="Calibri" w:eastAsia="Calibri" w:cs="Calibri"/>
-          <w:b w:val="0"/>
-          <w:color w:val="1A1A1A"/>
-          <w:sz w:val="19"/>
-        </w:rPr>
-        <w:t xml:space="preserve">Ran Hono + Better Auth on </w:t>
-      </w:r>
-      <w:r>
-        <w:rPr>
-          <w:rFonts w:ascii="Calibri" w:hAnsi="Calibri" w:eastAsia="Calibri" w:cs="Calibri"/>
-          <w:b/>
-          <w:color w:val="1A1A1A"/>
-          <w:sz w:val="19"/>
-        </w:rPr>
-        <w:t>ECS Fargate</w:t>
-      </w:r>
-      <w:r>
-        <w:rPr>
-          <w:rFonts w:ascii="Calibri" w:hAnsi="Calibri" w:eastAsia="Calibri" w:cs="Calibri"/>
-          <w:b w:val="0"/>
-          <w:color w:val="1A1A1A"/>
-          <w:sz w:val="19"/>
-        </w:rPr>
-        <w:t xml:space="preserve">, with Postgres, S3, and </w:t>
-      </w:r>
-      <w:r>
-        <w:rPr>
-          <w:rFonts w:ascii="Calibri" w:hAnsi="Calibri" w:eastAsia="Calibri" w:cs="Calibri"/>
-          <w:b/>
-          <w:color w:val="1A1A1A"/>
-          <w:sz w:val="19"/>
-        </w:rPr>
-        <w:t>Langfuse</w:t>
-      </w:r>
-      <w:r>
-        <w:rPr>
-          <w:rFonts w:ascii="Calibri" w:hAnsi="Calibri" w:eastAsia="Calibri" w:cs="Calibri"/>
-          <w:b w:val="0"/>
-          <w:color w:val="1A1A1A"/>
-          <w:sz w:val="19"/>
-        </w:rPr>
-        <w:t xml:space="preserve"> for observability.</w:t>
       </w:r>
     </w:p>
     <w:p>
@@ -1473,7 +1563,61 @@
           <w:color w:val="1A1A1A"/>
           <w:sz w:val="19"/>
         </w:rPr>
-        <w:t>Deployed on AWS with IaC for scalable, production-ready infrastructure.</w:t>
+        <w:t xml:space="preserve">Deployed to AWS </w:t>
+      </w:r>
+      <w:r>
+        <w:rPr>
+          <w:rFonts w:ascii="Calibri" w:hAnsi="Calibri" w:eastAsia="Calibri" w:cs="Calibri"/>
+          <w:b/>
+          <w:color w:val="1A1A1A"/>
+          <w:sz w:val="19"/>
+        </w:rPr>
+        <w:t>Lambda</w:t>
+      </w:r>
+      <w:r>
+        <w:rPr>
+          <w:rFonts w:ascii="Calibri" w:hAnsi="Calibri" w:eastAsia="Calibri" w:cs="Calibri"/>
+          <w:b w:val="0"/>
+          <w:color w:val="1A1A1A"/>
+          <w:sz w:val="19"/>
+        </w:rPr>
+        <w:t xml:space="preserve"> (Hono API) and </w:t>
+      </w:r>
+      <w:r>
+        <w:rPr>
+          <w:rFonts w:ascii="Calibri" w:hAnsi="Calibri" w:eastAsia="Calibri" w:cs="Calibri"/>
+          <w:b/>
+          <w:color w:val="1A1A1A"/>
+          <w:sz w:val="19"/>
+        </w:rPr>
+        <w:t>OpenNext</w:t>
+      </w:r>
+      <w:r>
+        <w:rPr>
+          <w:rFonts w:ascii="Calibri" w:hAnsi="Calibri" w:eastAsia="Calibri" w:cs="Calibri"/>
+          <w:b w:val="0"/>
+          <w:color w:val="1A1A1A"/>
+          <w:sz w:val="19"/>
+        </w:rPr>
+        <w:t xml:space="preserve"> (Nextjs) using </w:t>
+      </w:r>
+      <w:r>
+        <w:rPr>
+          <w:rFonts w:ascii="Calibri" w:hAnsi="Calibri" w:eastAsia="Calibri" w:cs="Calibri"/>
+          <w:b/>
+          <w:color w:val="1A1A1A"/>
+          <w:sz w:val="19"/>
+        </w:rPr>
+        <w:t>SST</w:t>
+      </w:r>
+      <w:r>
+        <w:rPr>
+          <w:rFonts w:ascii="Calibri" w:hAnsi="Calibri" w:eastAsia="Calibri" w:cs="Calibri"/>
+          <w:b w:val="0"/>
+          <w:color w:val="1A1A1A"/>
+          <w:sz w:val="19"/>
+        </w:rPr>
+        <w:t xml:space="preserve"> as IaC.</w:t>
       </w:r>
     </w:p>
     <w:p>
@@ -2277,7 +2421,7 @@
           <w:color w:val="1A1A1A"/>
           <w:sz w:val="20"/>
         </w:rPr>
-        <w:t>), CMS content sites, and multiple RBAC admin systems.</w:t>
+        <w:t>), CMS content sites, and multiple RBAC admin systems; Backend APIs (Node.js, Hono, Drizzle, Postgres)</w:t>
       </w:r>
     </w:p>
     <w:p>
@@ -2446,7 +2590,7 @@
           <w:color w:val="1A1A1A"/>
           <w:sz w:val="19"/>
         </w:rPr>
-        <w:t>Mastra, Vercel AI SDK, LangChain, Pinecone, Strands, AWS Bedrock</w:t>
+        <w:t>Mastra, Vercel AI SDK, LangChain, Pinecone, Strands, AWS Bedrock, Mem0, Langfuse</w:t>
       </w:r>
     </w:p>
     <w:p>
@@ -2487,7 +2631,7 @@
           <w:color w:val="1A1A1A"/>
           <w:sz w:val="19"/>
         </w:rPr>
-        <w:t xml:space="preserve">Quality: </w:t>
+        <w:t xml:space="preserve">QA: </w:t>
       </w:r>
       <w:r>
         <w:rPr>
@@ -2496,7 +2640,7 @@
           <w:color w:val="1A1A1A"/>
           <w:sz w:val="19"/>
         </w:rPr>
-        <w:t>Vitest, Playwright, Cypress, React Testing Library, Lighthouse, axe, Sentry</w:t>
+        <w:t>Vitest, Playwright, Cypress, Lighthouse, axe, Sentry</w:t>
       </w:r>
     </w:p>
     <w:p>

</xml_diff>